<commit_message>
First develpoments, MVC structure, first endpoints (fishing spots, lures, fisihing plans, fishing sessions)
</commit_message>
<xml_diff>
--- a/docs/FishLog_AI_Project_Specification.docx
+++ b/docs/FishLog_AI_Project_Specification.docx
@@ -535,6 +535,14 @@
       </w:pPr>
       <w:r>
         <w:t>20. Decisoes finais atuais</w:t>
+      </w:r>
+    </w:p>
+    <w:p>
+      <w:pPr>
+        <w:pStyle w:val="ListBullet"/>
+      </w:pPr>
+      <w:r>
+        <w:t>21. Evolucao visual: Dashboard, Fish e Lures</w:t>
       </w:r>
     </w:p>
     <w:p>
@@ -9035,6 +9043,367 @@
           <w:sz w:val="18"/>
         </w:rPr>
         <w:t>Versao 3.0 - 29/05/2026 - Documento vivo para planeamento e desenvolvimento</w:t>
+      </w:r>
+    </w:p>
+    <w:p>
+      <w:pPr>
+        <w:pStyle w:val="Heading1"/>
+      </w:pPr>
+      <w:r>
+        <w:t>21. Evolucao visual: Dashboard, Fish e Lures</w:t>
+      </w:r>
+    </w:p>
+    <w:p>
+      <w:r>
+        <w:t>Esta secao regista novas ideias de produto que passam a fazer parte da direcao oficial do projeto. O objetivo e tornar a app mais visual, util no dia a dia e mais forte como Fishing Copilot, sem transformar o MVP numa enciclopedia pesada logo de inicio.</w:t>
+      </w:r>
+    </w:p>
+    <w:p>
+      <w:pPr>
+        <w:pStyle w:val="Heading2"/>
+      </w:pPr>
+      <w:r>
+        <w:t>21.1 Dashboard principal</w:t>
+      </w:r>
+    </w:p>
+    <w:p>
+      <w:r>
+        <w:t>O dashboard deve ser uma das primeiras experiencias depois da base tecnica estar estavel. Deve mostrar as informacoes principais de forma rapida e acionavel, funcionando como home operacional da app.</w:t>
+      </w:r>
+    </w:p>
+    <w:p>
+      <w:pPr>
+        <w:pStyle w:val="ListBullet"/>
+      </w:pPr>
+      <w:r>
+        <w:t>Resumo de sessoes: total de sessoes, sessoes recentes e taxa de sucesso.</w:t>
+      </w:r>
+    </w:p>
+    <w:p>
+      <w:pPr>
+        <w:pStyle w:val="ListBullet"/>
+      </w:pPr>
+      <w:r>
+        <w:t>Resumo de capturas: capturas totais, capturas recentes e especie mais comum.</w:t>
+      </w:r>
+    </w:p>
+    <w:p>
+      <w:pPr>
+        <w:pStyle w:val="ListBullet"/>
+      </w:pPr>
+      <w:r>
+        <w:t>Spots principais: locais favoritos, locais mais usados e locais com melhor resultado.</w:t>
+      </w:r>
+    </w:p>
+    <w:p>
+      <w:pPr>
+        <w:pStyle w:val="ListBullet"/>
+      </w:pPr>
+      <w:r>
+        <w:t>Lure box: total de amostras, tipos mais usados e amostras com melhor resultado quando houver historico.</w:t>
+      </w:r>
+    </w:p>
+    <w:p>
+      <w:pPr>
+        <w:pStyle w:val="ListBullet"/>
+      </w:pPr>
+      <w:r>
+        <w:t>Planos: proximas sessoes planeadas e ultimos planos criados.</w:t>
+      </w:r>
+    </w:p>
+    <w:p>
+      <w:pPr>
+        <w:pStyle w:val="ListBullet"/>
+      </w:pPr>
+      <w:r>
+        <w:t>Atividade recente: ultimas sessoes, eventos, capturas e recomendacoes geradas.</w:t>
+      </w:r>
+    </w:p>
+    <w:p>
+      <w:pPr>
+        <w:pStyle w:val="ListBullet"/>
+      </w:pPr>
+      <w:r>
+        <w:t>Mais tarde: filtros por especie, tipo de agua, mes, hora do dia, lure e spot.</w:t>
+      </w:r>
+    </w:p>
+    <w:p>
+      <w:pPr>
+        <w:pStyle w:val="Heading2"/>
+      </w:pPr>
+      <w:r>
+        <w:t>21.2 Tab Fish</w:t>
+      </w:r>
+    </w:p>
+    <w:p>
+      <w:r>
+        <w:t>A app deve ter uma tab Fish com uma lista visual de especies. Esta area ajuda o utilizador a perceber melhor o comportamento de cada peixe antes de planear uma sessao.</w:t>
+      </w:r>
+    </w:p>
+    <w:p>
+      <w:pPr>
+        <w:pStyle w:val="ListBullet"/>
+      </w:pPr>
+      <w:r>
+        <w:t>Cada especie deve ter imagem, nome comum, descricao curta e notas praticas.</w:t>
+      </w:r>
+    </w:p>
+    <w:p>
+      <w:pPr>
+        <w:pStyle w:val="ListBullet"/>
+      </w:pPr>
+      <w:r>
+        <w:t>Guardar dicas sobre habitat: rio, barragem, lago, mar, estuario, margens, estruturas, vegetacao, pedra, sombra ou zonas profundas.</w:t>
+      </w:r>
+    </w:p>
+    <w:p>
+      <w:pPr>
+        <w:pStyle w:val="ListBullet"/>
+      </w:pPr>
+      <w:r>
+        <w:t>Guardar horarios e periodos de atividade: madrugada, manha, meio do dia, fim de tarde, noite e sazonalidade quando fizer sentido.</w:t>
+      </w:r>
+    </w:p>
+    <w:p>
+      <w:pPr>
+        <w:pStyle w:val="ListBullet"/>
+      </w:pPr>
+      <w:r>
+        <w:t>Indicar se a especie tende a atacar no fundo, meia agua ou superficie, e em que condicoes isso muda.</w:t>
+      </w:r>
+    </w:p>
+    <w:p>
+      <w:pPr>
+        <w:pStyle w:val="ListBullet"/>
+      </w:pPr>
+      <w:r>
+        <w:t>Indicar zonas onde costuma rondar: estruturas, drop-offs, entradas de agua, margens com cobertura, correntes, praias, canais ou zonas de alimento.</w:t>
+      </w:r>
+    </w:p>
+    <w:p>
+      <w:pPr>
+        <w:pStyle w:val="ListBullet"/>
+      </w:pPr>
+      <w:r>
+        <w:t>Associar lista de lures favoritos por especie, com explicacao curta do motivo.</w:t>
+      </w:r>
+    </w:p>
+    <w:p>
+      <w:pPr>
+        <w:pStyle w:val="ListBullet"/>
+      </w:pPr>
+      <w:r>
+        <w:t>No MVP esta informacao pode comecar como dados seed/static controlados pela app. Mais tarde pode ter CRUD de especies e edicao no frontend.</w:t>
+      </w:r>
+    </w:p>
+    <w:p>
+      <w:pPr>
+        <w:pStyle w:val="Heading2"/>
+      </w:pPr>
+      <w:r>
+        <w:t>21.3 Tab Lures</w:t>
+      </w:r>
+    </w:p>
+    <w:p>
+      <w:r>
+        <w:t>A tab Lures deve evoluir de uma lista simples da lure box para um catalogo visual e pratico de amostras/iscos, com foco em quando e como usar cada uma.</w:t>
+      </w:r>
+    </w:p>
+    <w:p>
+      <w:pPr>
+        <w:pStyle w:val="ListBullet"/>
+      </w:pPr>
+      <w:r>
+        <w:t>Cada lure deve poder ter imagem, nome, tipo, cor, tamanho, peso, marca e notas.</w:t>
+      </w:r>
+    </w:p>
+    <w:p>
+      <w:pPr>
+        <w:pStyle w:val="ListBullet"/>
+      </w:pPr>
+      <w:r>
+        <w:t>Adicionar dificuldade: facil, media ou dificil, para ajudar iniciantes a escolher amostras adequadas.</w:t>
+      </w:r>
+    </w:p>
+    <w:p>
+      <w:pPr>
+        <w:pStyle w:val="ListBullet"/>
+      </w:pPr>
+      <w:r>
+        <w:t>Adicionar eficacia percebida: baixa, media ou alta, inicialmente como classificacao geral/manual e depois baseada no historico.</w:t>
+      </w:r>
+    </w:p>
+    <w:p>
+      <w:pPr>
+        <w:pStyle w:val="ListBullet"/>
+      </w:pPr>
+      <w:r>
+        <w:t>Adicionar descricao de uso: onde usar, quando usar, especies alvo, tipo de agua, claridade, profundidade e condicoes ideais.</w:t>
+      </w:r>
+    </w:p>
+    <w:p>
+      <w:pPr>
+        <w:pStyle w:val="ListBullet"/>
+      </w:pPr>
+      <w:r>
+        <w:t>Adicionar tipo de acao/recolha: lenta, rapida, stop-and-go, twitch, jerk, fundo, linear, superficie, vertical, etc.</w:t>
+      </w:r>
+    </w:p>
+    <w:p>
+      <w:pPr>
+        <w:pStyle w:val="ListBullet"/>
+      </w:pPr>
+      <w:r>
+        <w:t>Permitir que a IA use esta informacao como contexto quando gerar ranking de lures e plano A/B/C.</w:t>
+      </w:r>
+    </w:p>
+    <w:p>
+      <w:pPr>
+        <w:pStyle w:val="ListBullet"/>
+      </w:pPr>
+      <w:r>
+        <w:t>Manter separado o conceito de lure do utilizador e conhecimento geral sobre tipos de lure quando isso fizer sentido no futuro.</w:t>
+      </w:r>
+    </w:p>
+    <w:p>
+      <w:pPr>
+        <w:pStyle w:val="Heading2"/>
+      </w:pPr>
+      <w:r>
+        <w:t>21.4 Impacto no modelo de dados</w:t>
+      </w:r>
+    </w:p>
+    <w:p>
+      <w:r>
+        <w:t>Estas ideias adicionam uma camada de conhecimento visual ao dominio. A implementacao deve continuar incremental.</w:t>
+      </w:r>
+    </w:p>
+    <w:p>
+      <w:pPr>
+        <w:pStyle w:val="ListBullet"/>
+      </w:pPr>
+      <w:r>
+        <w:t>Nova entidade planeada: FishSpecies, com id, name, description, imageUrl, habitatNotes, activeTimes, strikeZone, commonZones, favoriteLures e createdAt.</w:t>
+      </w:r>
+    </w:p>
+    <w:p>
+      <w:pPr>
+        <w:pStyle w:val="ListBullet"/>
+      </w:pPr>
+      <w:r>
+        <w:t>Evolucao de Lure: adicionar imageUrl, difficulty, effectiveness, usageNotes, actionType e idealConditions.</w:t>
+      </w:r>
+    </w:p>
+    <w:p>
+      <w:pPr>
+        <w:pStyle w:val="ListBullet"/>
+      </w:pPr>
+      <w:r>
+        <w:t>A relacao FishSpecies-Lure pode comecar simples como texto/lista no MVP e evoluir para relacao many-to-many mais tarde.</w:t>
+      </w:r>
+    </w:p>
+    <w:p>
+      <w:pPr>
+        <w:pStyle w:val="ListBullet"/>
+      </w:pPr>
+      <w:r>
+        <w:t>As imagens podem comecar como URL ou assets locais. Upload/gestao de ficheiros fica para uma fase posterior.</w:t>
+      </w:r>
+    </w:p>
+    <w:p>
+      <w:pPr>
+        <w:pStyle w:val="ListBullet"/>
+      </w:pPr>
+      <w:r>
+        <w:t>Evitar depender do LLM para preencher dados factuais sensiveis. Conteudo seed deve ser revisto e assumido como conhecimento geral, nao como fonte legal ou em tempo real.</w:t>
+      </w:r>
+    </w:p>
+    <w:p>
+      <w:pPr>
+        <w:pStyle w:val="Heading2"/>
+      </w:pPr>
+      <w:r>
+        <w:t>21.5 Impacto na API e frontend</w:t>
+      </w:r>
+    </w:p>
+    <w:p>
+      <w:pPr>
+        <w:pStyle w:val="ListBullet"/>
+      </w:pPr>
+      <w:r>
+        <w:t>Adicionar endpoint previsto: GET /api/dashboard para resumo principal.</w:t>
+      </w:r>
+    </w:p>
+    <w:p>
+      <w:pPr>
+        <w:pStyle w:val="ListBullet"/>
+      </w:pPr>
+      <w:r>
+        <w:t>Adicionar endpoints previstos: GET /api/fish e GET /api/fish/{id}. CRUD completo de FishSpecies pode ficar para depois.</w:t>
+      </w:r>
+    </w:p>
+    <w:p>
+      <w:pPr>
+        <w:pStyle w:val="ListBullet"/>
+      </w:pPr>
+      <w:r>
+        <w:t>Expandir endpoints de lures para devolver imagem, dificuldade, eficacia, notas de uso e tipo de acao.</w:t>
+      </w:r>
+    </w:p>
+    <w:p>
+      <w:pPr>
+        <w:pStyle w:val="ListBullet"/>
+      </w:pPr>
+      <w:r>
+        <w:t>Frontend deve ter tabs principais: Dashboard, Spots, Lures, Fish, Plans, Sessions e depois AI Planner.</w:t>
+      </w:r>
+    </w:p>
+    <w:p>
+      <w:pPr>
+        <w:pStyle w:val="ListBullet"/>
+      </w:pPr>
+      <w:r>
+        <w:t>As tabs Fish e Lures devem ser visuais, com cards/listas com imagem e detalhe pratico, nao apenas tabelas administrativas.</w:t>
+      </w:r>
+    </w:p>
+    <w:p>
+      <w:pPr>
+        <w:pStyle w:val="Heading2"/>
+      </w:pPr>
+      <w:r>
+        <w:t>21.6 Ajuste ao roadmap</w:t>
+      </w:r>
+    </w:p>
+    <w:p>
+      <w:pPr>
+        <w:pStyle w:val="ListBullet"/>
+      </w:pPr>
+      <w:r>
+        <w:t>Dashboard principal deve entrar cedo, depois de existirem sessoes, eventos e capturas suficientes para mostrar dados uteis.</w:t>
+      </w:r>
+    </w:p>
+    <w:p>
+      <w:pPr>
+        <w:pStyle w:val="ListBullet"/>
+      </w:pPr>
+      <w:r>
+        <w:t>Tab Fish pode ser iniciada com dados seed/static antes da fase IA completa, porque melhora a demo visual e ajuda o planner.</w:t>
+      </w:r>
+    </w:p>
+    <w:p>
+      <w:pPr>
+        <w:pStyle w:val="ListBullet"/>
+      </w:pPr>
+      <w:r>
+        <w:t>Tab Lures deve evoluir juntamente com a lure box, adicionando imagem, dificuldade, eficacia e instrucoes de uso.</w:t>
+      </w:r>
+    </w:p>
+    <w:p>
+      <w:pPr>
+        <w:pStyle w:val="ListBullet"/>
+      </w:pPr>
+      <w:r>
+        <w:t>A IA deve usar Fish e Lures como contexto estruturado, mas nao deve inventar dados nem fingir informacao em tempo real.</w:t>
       </w:r>
     </w:p>
     <w:sectPr>

</xml_diff>

<commit_message>
Add dashboard, fish library, and session tracking features
</commit_message>
<xml_diff>
--- a/docs/FishLog_AI_Project_Specification.docx
+++ b/docs/FishLog_AI_Project_Specification.docx
@@ -9383,7 +9383,7 @@
         <w:pStyle w:val="ListBullet"/>
       </w:pPr>
       <w:r>
-        <w:t>Frontend deve ter tabs principais: Dashboard, Spots, Lures, Fish, Plans, Sessions e depois AI Planner.</w:t>
+        <w:t>Frontend deve ter menu/tabs principais: Dashboard, Perfil, Lure Box, Biblioteca de Peixes, Biblioteca de Lures, Spots, Plans, Sessions e depois AI Planner.</w:t>
       </w:r>
     </w:p>
     <w:p>
@@ -9432,6 +9432,68 @@
       </w:pPr>
       <w:r>
         <w:t>A IA deve usar Fish e Lures como contexto estruturado, mas nao deve inventar dados nem fingir informacao em tempo real.</w:t>
+      </w:r>
+    </w:p>
+    <w:p>
+      <w:pPr>
+        <w:pStyle w:val="Heading2"/>
+      </w:pPr>
+      <w:r>
+        <w:t>21.7 Navegacao principal e perfil</w:t>
+      </w:r>
+    </w:p>
+    <w:p>
+      <w:pPr/>
+      <w:r>
+        <w:t>A app deve ter um menu principal para o utilizador escolher rapidamente as funcionalidades principais. Esta decisao deve guiar o futuro frontend React Native Web e, mais tarde, a app iOS/Android.</w:t>
+      </w:r>
+    </w:p>
+    <w:p>
+      <w:pPr>
+        <w:pStyle w:val="ListBullet"/>
+      </w:pPr>
+      <w:r>
+        <w:t>Menu principal previsto: Dashboard, Perfil, Lure Box, Biblioteca de Peixes, Biblioteca de Lures, Spots, Planos, Sessoes e AI Planner.</w:t>
+      </w:r>
+    </w:p>
+    <w:p>
+      <w:pPr>
+        <w:pStyle w:val="ListBullet"/>
+      </w:pPr>
+      <w:r>
+        <w:t>Perfil deve existir como area de produto para preferencias do pescador, especie favorita, locais frequentes e configuracoes. Nao implica autenticacao no MVP inicial.</w:t>
+      </w:r>
+    </w:p>
+    <w:p>
+      <w:pPr>
+        <w:pStyle w:val="ListBullet"/>
+      </w:pPr>
+      <w:r>
+        <w:t>Lure Box representa as amostras que o utilizador possui.</w:t>
+      </w:r>
+    </w:p>
+    <w:p>
+      <w:pPr>
+        <w:pStyle w:val="ListBullet"/>
+      </w:pPr>
+      <w:r>
+        <w:t>Biblioteca de Lures representa conhecimento geral sobre tipos de amostra, dificuldade, eficacia, imagem e como usar.</w:t>
+      </w:r>
+    </w:p>
+    <w:p>
+      <w:pPr>
+        <w:pStyle w:val="ListBullet"/>
+      </w:pPr>
+      <w:r>
+        <w:t>Biblioteca de Peixes representa conhecimento geral por especie, com imagem, descricao, habitat, horarios, zonas, profundidade/superficie e lures favoritos.</w:t>
+      </w:r>
+    </w:p>
+    <w:p>
+      <w:pPr>
+        <w:pStyle w:val="ListBullet"/>
+      </w:pPr>
+      <w:r>
+        <w:t>Sempre que surgirem ideias relevantes, devem ser propostas ao utilizador antes de entrar no roadmap ativo.</w:t>
       </w:r>
     </w:p>
     <w:sectPr>

</xml_diff>

<commit_message>
Add lure library, demo seed data and planner context foundation - Separate Lure Box from Lure Library with dedicated backend endpoints - Allow user lures to reference library items - Add fishing plan lure association endpoints - Add synthetic demo seed data for fish, lures, spots, plans, sessions and catches - Add planner context endpoint to prepare structured data for future AI recommendations - Update dashboard counters and Postman collection
</commit_message>
<xml_diff>
--- a/docs/FishLog_AI_Project_Specification.docx
+++ b/docs/FishLog_AI_Project_Specification.docx
@@ -535,6 +535,14 @@
       </w:pPr>
       <w:r>
         <w:t>21. Evolucao visual: Dashboard, Fish e Lures</w:t>
+      </w:r>
+    </w:p>
+    <w:p>
+      <w:pPr>
+        <w:pStyle w:val="ListBullet"/>
+      </w:pPr>
+      <w:r>
+        <w:t>22. Backlog de features futuras</w:t>
       </w:r>
     </w:p>
     <w:p>
@@ -9494,6 +9502,203 @@
       </w:pPr>
       <w:r>
         <w:t>Sempre que surgirem ideias relevantes, devem ser propostas ao utilizador antes de entrar no roadmap ativo.</w:t>
+      </w:r>
+    </w:p>
+    <w:p>
+      <w:pPr>
+        <w:pStyle w:val="Heading1"/>
+      </w:pPr>
+      <w:r>
+        <w:t>22. Backlog de features futuras</w:t>
+      </w:r>
+    </w:p>
+    <w:p>
+      <w:r>
+        <w:t>Esta secao guarda ideias futuras alinhadas com a direcao do produto. Nem todas entram no MVP; devem ser priorizadas e confirmadas antes de desenvolvimento. A regra continua: trabalhar incrementalmente e evitar aumentar demasiado o escopo antes da app estar demonstravel.</w:t>
+      </w:r>
+    </w:p>
+    <w:p>
+      <w:pPr>
+        <w:pStyle w:val="Heading2"/>
+      </w:pPr>
+      <w:r>
+        <w:t>22.1 Features prioritarias ja alinhadas</w:t>
+      </w:r>
+    </w:p>
+    <w:p>
+      <w:pPr>
+        <w:pStyle w:val="ListBullet"/>
+      </w:pPr>
+      <w:r>
+        <w:t>Separar Lure Box de Biblioteca de Lures: Lure Box representa as amostras que o utilizador possui; Biblioteca de Lures representa conhecimento geral sobre tipos de amostra, dificuldade, eficacia, imagem, quando usar e como trabalhar cada uma.</w:t>
+      </w:r>
+    </w:p>
+    <w:p>
+      <w:pPr>
+        <w:pStyle w:val="ListBullet"/>
+      </w:pPr>
+      <w:r>
+        <w:t>Fish Detail Page: pagina visual por especie com imagem, descricao, habitat, horarios ativos, zonas comuns, se costuma atacar no fundo/meia agua/superficie e lures recomendados.</w:t>
+      </w:r>
+    </w:p>
+    <w:p>
+      <w:pPr>
+        <w:pStyle w:val="ListBullet"/>
+      </w:pPr>
+      <w:r>
+        <w:t>Planner Context Builder: endpoint que monta contexto estruturado para uma futura recomendacao, juntando spot, especie, condicoes, lures disponiveis, historico e notas, ainda sem chamar IA.</w:t>
+      </w:r>
+    </w:p>
+    <w:p>
+      <w:pPr>
+        <w:pStyle w:val="ListBullet"/>
+      </w:pPr>
+      <w:r>
+        <w:t>AI Plan A/B/C: endpoint POST /api/recommendations/plan para gerar plano A/B/C, ranking de lures, tecnicas recomendadas, o que evitar, confidence e warnings.</w:t>
+      </w:r>
+    </w:p>
+    <w:p>
+      <w:pPr>
+        <w:pStyle w:val="ListBullet"/>
+      </w:pPr>
+      <w:r>
+        <w:t>Adapt During Session: endpoint POST /api/recommendations/adapt para adaptar estrategia com base em eventos da sessao, lures usadas, capturas ou ausencia de atividade.</w:t>
+      </w:r>
+    </w:p>
+    <w:p>
+      <w:pPr>
+        <w:pStyle w:val="ListBullet"/>
+      </w:pPr>
+      <w:r>
+        <w:t>Dashboard Analytics: evoluir o dashboard para mostrar melhor spot, melhor lure, melhor especie, melhor hora, taxa de sucesso por tipo de agua, condicoes e periodo.</w:t>
+      </w:r>
+    </w:p>
+    <w:p>
+      <w:pPr>
+        <w:pStyle w:val="ListBullet"/>
+      </w:pPr>
+      <w:r>
+        <w:t>Synthetic Demo Seed: criar dados sinteticos realistas para especies, biblioteca de lures, lure box, spots, sessoes, eventos e capturas, deixando claro no README que sao dados de demo.</w:t>
+      </w:r>
+    </w:p>
+    <w:p>
+      <w:pPr>
+        <w:pStyle w:val="ListBullet"/>
+      </w:pPr>
+      <w:r>
+        <w:t>User Profile sem autenticacao: guardar preferencias locais do pescador, especies favoritas, zonas frequentes, unidades de medida e configuracoes de planeamento.</w:t>
+      </w:r>
+    </w:p>
+    <w:p>
+      <w:pPr>
+        <w:pStyle w:val="ListBullet"/>
+      </w:pPr>
+      <w:r>
+        <w:t>What Should I Try Next?: sugestao rapida durante uma sessao apos eventos como NO_BITES, MISSED_BITES, WIND_INCREASED ou SURFACE_ACTIVITY.</w:t>
+      </w:r>
+    </w:p>
+    <w:p>
+      <w:pPr>
+        <w:pStyle w:val="ListBullet"/>
+      </w:pPr>
+      <w:r>
+        <w:t>Confidence + Warnings: todas as recomendacoes da IA devem indicar nivel de confianca e avisos quando houver pouco contexto ou historico.</w:t>
+      </w:r>
+    </w:p>
+    <w:p>
+      <w:pPr>
+        <w:pStyle w:val="ListBullet"/>
+      </w:pPr>
+      <w:r>
+        <w:t>Trip Timeline: vista cronologica de uma sessao com plano inicial, lures usadas, eventos, capturas, mudancas e recomendacoes.</w:t>
+      </w:r>
+    </w:p>
+    <w:p>
+      <w:pPr>
+        <w:pStyle w:val="ListBullet"/>
+      </w:pPr>
+      <w:r>
+        <w:t>Lure Effectiveness Score: score inicial manual e depois calculado com base em uso, capturas, especies e condicoes.</w:t>
+      </w:r>
+    </w:p>
+    <w:p>
+      <w:pPr>
+        <w:pStyle w:val="ListBullet"/>
+      </w:pPr>
+      <w:r>
+        <w:t>Fish-Lure Match: associar especies a lures recomendadas com razao pratica e condicoes ideais.</w:t>
+      </w:r>
+    </w:p>
+    <w:p>
+      <w:pPr>
+        <w:pStyle w:val="ListBullet"/>
+      </w:pPr>
+      <w:r>
+        <w:t>Conditions Tags: tags como clear_water, windy, low_light, vegetation, rocks, surface_activity, current, deep_water para melhorar filtros, dashboards e IA.</w:t>
+      </w:r>
+    </w:p>
+    <w:p>
+      <w:pPr>
+        <w:pStyle w:val="ListBullet"/>
+      </w:pPr>
+      <w:r>
+        <w:t>Post-Session Summary: resumo apos a sessao com o que funcionou, o que evitar e o que testar na proxima vez.</w:t>
+      </w:r>
+    </w:p>
+    <w:p>
+      <w:pPr>
+        <w:pStyle w:val="Heading2"/>
+      </w:pPr>
+      <w:r>
+        <w:t>22.3 Ordem sugerida de desenvolvimento futuro</w:t>
+      </w:r>
+    </w:p>
+    <w:p>
+      <w:pPr>
+        <w:pStyle w:val="ListBullet"/>
+      </w:pPr>
+      <w:r>
+        <w:t>Primeiro: separar Lure Box de Biblioteca de Lures e consolidar Fish-Lure Match.</w:t>
+      </w:r>
+    </w:p>
+    <w:p>
+      <w:pPr>
+        <w:pStyle w:val="ListBullet"/>
+      </w:pPr>
+      <w:r>
+        <w:t>Segundo: criar seed/demo data para dashboard, fish library e lure library ficarem vivos no frontend.</w:t>
+      </w:r>
+    </w:p>
+    <w:p>
+      <w:pPr>
+        <w:pStyle w:val="ListBullet"/>
+      </w:pPr>
+      <w:r>
+        <w:t>Terceiro: melhorar dashboard analytics com rankings simples e estatisticas de sucesso.</w:t>
+      </w:r>
+    </w:p>
+    <w:p>
+      <w:pPr>
+        <w:pStyle w:val="ListBullet"/>
+      </w:pPr>
+      <w:r>
+        <w:t>Quarto: criar Planner Context Builder e guardar AiRecommendation.</w:t>
+      </w:r>
+    </w:p>
+    <w:p>
+      <w:pPr>
+        <w:pStyle w:val="ListBullet"/>
+      </w:pPr>
+      <w:r>
+        <w:t>Quinto: integrar LM Studio para AI Plan A/B/C e Adapt During Session.</w:t>
+      </w:r>
+    </w:p>
+    <w:p>
+      <w:pPr>
+        <w:pStyle w:val="ListBullet"/>
+      </w:pPr>
+      <w:r>
+        <w:t>Sexto: adicionar Post-Session Summary e Trip Timeline para fechar o ciclo planear-adaptar-aprender.</w:t>
       </w:r>
     </w:p>
     <w:sectPr>

</xml_diff>

<commit_message>
Implement user-friendly WeatherSnapshot integration with IPMA
</commit_message>
<xml_diff>
--- a/docs/FishLog_AI_Project_Specification.docx
+++ b/docs/FishLog_AI_Project_Specification.docx
@@ -6036,7 +6036,7 @@
         <w:pStyle w:val="ListBullet"/>
       </w:pPr>
       <w:r>
-        <w:t>Guardar WeatherSnapshot para que as recomendacoes e dashboards usem dados consistentes.</w:t>
+        <w:t>Guardar WeatherSnapshot para que as recomendacoes, dashboards e ajustes durante a sessao usem dados consistentes. O backend deve suportar captura automatica por plano/sessao, por coordenadas e por local IPMA selecionado pelo utilizador.</w:t>
       </w:r>
     </w:p>
     <w:p>
@@ -9562,7 +9562,7 @@
         <w:pStyle w:val="ListBullet"/>
       </w:pPr>
       <w:r>
-        <w:t>Adapt During Session: endpoint POST /api/recommendations/adapt para adaptar estrategia com base em eventos da sessao, lures usadas, capturas ou ausencia de atividade.</w:t>
+        <w:t>Adapt During Session: endpoint POST /api/recommendations/session-adjustment para adaptar estrategia com base em eventos da sessao, lures usadas, capturas ou ausencia de atividade.</w:t>
       </w:r>
     </w:p>
     <w:p>
@@ -9699,6 +9699,262 @@
       </w:pPr>
       <w:r>
         <w:t>Sexto: adicionar Post-Session Summary e Trip Timeline para fechar o ciclo planear-adaptar-aprender.</w:t>
+      </w:r>
+    </w:p>
+    <w:p>
+      <w:pPr>
+        <w:pStyle w:val="Heading1"/>
+      </w:pPr>
+      <w:r>
+        <w:t>23. Estado atual do backend implementado</w:t>
+      </w:r>
+    </w:p>
+    <w:p>
+      <w:pPr>
+        <w:pStyle w:val="Heading2"/>
+      </w:pPr>
+      <w:r>
+        <w:t>23.1 AI Planner A/B/C</w:t>
+      </w:r>
+    </w:p>
+    <w:p>
+      <w:pPr>
+        <w:pStyle w:val="ListBullet"/>
+      </w:pPr>
+      <w:r>
+        <w:t>Endpoint implementado: POST /api/recommendations/plan.</w:t>
+      </w:r>
+    </w:p>
+    <w:p>
+      <w:pPr>
+        <w:pStyle w:val="ListBullet"/>
+      </w:pPr>
+      <w:r>
+        <w:t>O backend constroi contexto estruturado atraves de GET /api/plans/{id}/context e chama o LM Studio usando API OpenAI-compatible.</w:t>
+      </w:r>
+    </w:p>
+    <w:p>
+      <w:pPr>
+        <w:pStyle w:val="ListBullet"/>
+      </w:pPr>
+      <w:r>
+        <w:t>A resposta e guardada como AiRecommendation, com summary, lureRanking, planA, planB, planC, avoid, confidence, warnings e rawResponse apenas para debug.</w:t>
+      </w:r>
+    </w:p>
+    <w:p>
+      <w:pPr>
+        <w:pStyle w:val="ListBullet"/>
+      </w:pPr>
+      <w:r>
+        <w:t>O backend valida o lureRanking antes de guardar: lures fora de selectedLures sao removidas, confidence baixa para low e e adicionado warning.</w:t>
+      </w:r>
+    </w:p>
+    <w:p>
+      <w:pPr>
+        <w:pStyle w:val="ListBullet"/>
+      </w:pPr>
+      <w:r>
+        <w:t>As recomendacoes passam a ter version para manter historico de iteracoes por plano.</w:t>
+      </w:r>
+    </w:p>
+    <w:p>
+      <w:pPr>
+        <w:pStyle w:val="Heading2"/>
+      </w:pPr>
+      <w:r>
+        <w:t>23.2 Adapt During Session</w:t>
+      </w:r>
+    </w:p>
+    <w:p>
+      <w:pPr>
+        <w:pStyle w:val="ListBullet"/>
+      </w:pPr>
+      <w:r>
+        <w:t>Endpoint implementado: POST /api/recommendations/session-adjustment.</w:t>
+      </w:r>
+    </w:p>
+    <w:p>
+      <w:pPr>
+        <w:pStyle w:val="ListBullet"/>
+      </w:pPr>
+      <w:r>
+        <w:t>Serve para ajustar estrategia durante uma sessao quando o utilizador indica situacoes como sem toques, agua mais turva, vento mais forte ou atividade a superficie.</w:t>
+      </w:r>
+    </w:p>
+    <w:p>
+      <w:pPr>
+        <w:pStyle w:val="ListBullet"/>
+      </w:pPr>
+      <w:r>
+        <w:t>O backend monta contexto da sessao, spot, plano associado, lures usadas ou planeadas, eventos registados e ultimo WeatherSnapshot disponivel.</w:t>
+      </w:r>
+    </w:p>
+    <w:p>
+      <w:pPr>
+        <w:pStyle w:val="ListBullet"/>
+      </w:pPr>
+      <w:r>
+        <w:t>A resposta devolve immediateAction, nextTechnique, fallbackAction, lureRanking, confidence, warnings e version.</w:t>
+      </w:r>
+    </w:p>
+    <w:p>
+      <w:pPr>
+        <w:pStyle w:val="ListBullet"/>
+      </w:pPr>
+      <w:r>
+        <w:t>Tal como no AI Planner, o backend valida que a IA usa apenas lures permitidas no contexto.</w:t>
+      </w:r>
+    </w:p>
+    <w:p>
+      <w:pPr>
+        <w:pStyle w:val="Heading2"/>
+      </w:pPr>
+      <w:r>
+        <w:t>23.3 WeatherSnapshot e IPMA</w:t>
+      </w:r>
+    </w:p>
+    <w:p>
+      <w:pPr>
+        <w:pStyle w:val="ListBullet"/>
+      </w:pPr>
+      <w:r>
+        <w:t>Entidade implementada: WeatherSnapshot.</w:t>
+      </w:r>
+    </w:p>
+    <w:p>
+      <w:pPr>
+        <w:pStyle w:val="ListBullet"/>
+      </w:pPr>
+      <w:r>
+        <w:t>Cliente implementado: IpmaClient, usando a API oficial api.ipma.pt.</w:t>
+      </w:r>
+    </w:p>
+    <w:p>
+      <w:pPr>
+        <w:pStyle w:val="ListBullet"/>
+      </w:pPr>
+      <w:r>
+        <w:t>Fluxo user-friendly: o utilizador nao precisa de saber globalIdLocal. Pode usar plano, sessao, coordenadas ou escolher uma zona IPMA exposta pelo backend.</w:t>
+      </w:r>
+    </w:p>
+    <w:p>
+      <w:pPr>
+        <w:pStyle w:val="ListBullet"/>
+      </w:pPr>
+      <w:r>
+        <w:t>O backend encontra automaticamente o local IPMA mais proximo quando recebe coordenadas ou quando usa as coordenadas do spot.</w:t>
+      </w:r>
+    </w:p>
+    <w:p>
+      <w:pPr>
+        <w:pStyle w:val="ListBullet"/>
+      </w:pPr>
+      <w:r>
+        <w:t>O WeatherSnapshot e incluido no Planner Context Builder e no Adapt During Session quando existir.</w:t>
+      </w:r>
+    </w:p>
+    <w:p>
+      <w:pPr>
+        <w:pStyle w:val="Heading2"/>
+      </w:pPr>
+      <w:r>
+        <w:t>23.4 Endpoints Weather implementados</w:t>
+      </w:r>
+    </w:p>
+    <w:p>
+      <w:pPr>
+        <w:pStyle w:val="ListBullet"/>
+      </w:pPr>
+      <w:r>
+        <w:t>GET /api/weather-locations/ipma - lista locais IPMA para combobox no frontend.</w:t>
+      </w:r>
+    </w:p>
+    <w:p>
+      <w:pPr>
+        <w:pStyle w:val="ListBullet"/>
+      </w:pPr>
+      <w:r>
+        <w:t>GET /api/weather-locations/ipma/search?query=Lisboa - pesquisa locais IPMA.</w:t>
+      </w:r>
+    </w:p>
+    <w:p>
+      <w:pPr>
+        <w:pStyle w:val="ListBullet"/>
+      </w:pPr>
+      <w:r>
+        <w:t>POST /api/weather-snapshots/plans/{planId}/ipma - cria snapshot IPMA automaticamente a partir do spot do plano.</w:t>
+      </w:r>
+    </w:p>
+    <w:p>
+      <w:pPr>
+        <w:pStyle w:val="ListBullet"/>
+      </w:pPr>
+      <w:r>
+        <w:t>POST /api/weather-snapshots/sessions/{sessionId}/ipma - cria snapshot IPMA automaticamente a partir do spot da sessao.</w:t>
+      </w:r>
+    </w:p>
+    <w:p>
+      <w:pPr>
+        <w:pStyle w:val="ListBullet"/>
+      </w:pPr>
+      <w:r>
+        <w:t>POST /api/weather-snapshots/ipma/coordinates - cria snapshot por latitude/longitude introduzidas pelo utilizador.</w:t>
+      </w:r>
+    </w:p>
+    <w:p>
+      <w:pPr>
+        <w:pStyle w:val="ListBullet"/>
+      </w:pPr>
+      <w:r>
+        <w:t>POST /api/weather-snapshots/ipma/location - cria snapshot por globalIdLocal escolhido numa combobox.</w:t>
+      </w:r>
+    </w:p>
+    <w:p>
+      <w:pPr>
+        <w:pStyle w:val="ListBullet"/>
+      </w:pPr>
+      <w:r>
+        <w:t>GET /api/weather-snapshots/plans/{planId} e GET /api/weather-snapshots/sessions/{sessionId} - listam snapshots guardados.</w:t>
+      </w:r>
+    </w:p>
+    <w:p>
+      <w:pPr>
+        <w:pStyle w:val="ListBullet"/>
+      </w:pPr>
+      <w:r>
+        <w:t>GET /api/weather-snapshots/plans/{planId}/latest e GET /api/weather-snapshots/sessions/{sessionId}/latest - devolvem o snapshot mais recente.</w:t>
+      </w:r>
+    </w:p>
+    <w:p>
+      <w:pPr>
+        <w:pStyle w:val="Heading2"/>
+      </w:pPr>
+      <w:r>
+        <w:t>23.5 Decisao frontend associada</w:t>
+      </w:r>
+    </w:p>
+    <w:p>
+      <w:pPr>
+        <w:pStyle w:val="ListBullet"/>
+      </w:pPr>
+      <w:r>
+        <w:t>No frontend, a experiencia meteorologica deve oferecer duas opcoes simples: usar coordenadas/mapa ou selecionar zona IPMA numa combobox.</w:t>
+      </w:r>
+    </w:p>
+    <w:p>
+      <w:pPr>
+        <w:pStyle w:val="ListBullet"/>
+      </w:pPr>
+      <w:r>
+        <w:t>A combobox deve consumir GET /api/weather-locations/ipma ou GET /api/weather-locations/ipma/search.</w:t>
+      </w:r>
+    </w:p>
+    <w:p>
+      <w:pPr>
+        <w:pStyle w:val="ListBullet"/>
+      </w:pPr>
+      <w:r>
+        <w:t>Quando o utilizador estiver dentro de um plano ou sessao, a acao principal deve ser um botao simples como Atualizar meteorologia IPMA.</w:t>
       </w:r>
     </w:p>
     <w:sectPr>

</xml_diff>

<commit_message>
Implement automatic integration of IPMA weather data into AI Planner and complete the lifecycle of Fishing Sessions.
</commit_message>
<xml_diff>
--- a/docs/FishLog_AI_Project_Specification.docx
+++ b/docs/FishLog_AI_Project_Specification.docx
@@ -9955,6 +9955,246 @@
       </w:pPr>
       <w:r>
         <w:t>Quando o utilizador estiver dentro de um plano ou sessao, a acao principal deve ser um botao simples como Atualizar meteorologia IPMA.</w:t>
+      </w:r>
+    </w:p>
+    <w:p>
+      <w:pPr>
+        <w:pStyle w:val="Heading2"/>
+      </w:pPr>
+      <w:r>
+        <w:t>23.6 AI Planner com Weather automatico</w:t>
+      </w:r>
+    </w:p>
+    <w:p>
+      <w:pPr>
+        <w:pStyle w:val="ListBullet"/>
+      </w:pPr>
+      <w:r>
+        <w:t>Quando o endpoint POST /api/recommendations/plan e chamado, o backend deve tentar usar automaticamente o WeatherSnapshot mais recente do plano.</w:t>
+      </w:r>
+    </w:p>
+    <w:p>
+      <w:pPr>
+        <w:pStyle w:val="ListBullet"/>
+      </w:pPr>
+      <w:r>
+        <w:t>Se o plano ainda nao tiver WeatherSnapshot, o backend tenta criar um snapshot IPMA a partir das coordenadas do spot antes de montar o contexto da IA.</w:t>
+      </w:r>
+    </w:p>
+    <w:p>
+      <w:pPr>
+        <w:pStyle w:val="ListBullet"/>
+      </w:pPr>
+      <w:r>
+        <w:t>Se a API externa do IPMA falhar, o AI Planner nao deve bloquear; a recomendacao continua sem meteorologia e o contexto indica menor qualidade de dados.</w:t>
+      </w:r>
+    </w:p>
+    <w:p>
+      <w:pPr>
+        <w:pStyle w:val="ListBullet"/>
+      </w:pPr>
+      <w:r>
+        <w:t>O WeatherSnapshot continua a ser tratado como dado estruturado do backend, nao como informacao inventada pelo modelo.</w:t>
+      </w:r>
+    </w:p>
+    <w:p>
+      <w:pPr>
+        <w:pStyle w:val="Heading2"/>
+      </w:pPr>
+      <w:r>
+        <w:t>23.7 FishingSession lifecycle</w:t>
+      </w:r>
+    </w:p>
+    <w:p>
+      <w:pPr>
+        <w:pStyle w:val="ListBullet"/>
+      </w:pPr>
+      <w:r>
+        <w:t>FishingSession passa a ter estado: planned, active e finished.</w:t>
+      </w:r>
+    </w:p>
+    <w:p>
+      <w:pPr>
+        <w:pStyle w:val="ListBullet"/>
+      </w:pPr>
+      <w:r>
+        <w:t>Endpoints implementados: POST /api/sessions/{id}/start e POST /api/sessions/{id}/finish.</w:t>
+      </w:r>
+    </w:p>
+    <w:p>
+      <w:pPr>
+        <w:pStyle w:val="ListBullet"/>
+      </w:pPr>
+      <w:r>
+        <w:t>Ao iniciar uma sessao, o backend define startTime quando enviado ou usa a hora atual, e muda o estado para active.</w:t>
+      </w:r>
+    </w:p>
+    <w:p>
+      <w:pPr>
+        <w:pStyle w:val="ListBullet"/>
+      </w:pPr>
+      <w:r>
+        <w:t>Ao terminar uma sessao, o backend define endTime, muda o estado para finished, calcula durationMinutes e guarda success, resultSummary, finalNotes e rating.</w:t>
+      </w:r>
+    </w:p>
+    <w:p>
+      <w:pPr>
+        <w:pStyle w:val="ListBullet"/>
+      </w:pPr>
+      <w:r>
+        <w:t>As respostas de sessao devolvem status, durationMinutes, resultSummary, finalNotes e rating para facilitar dashboard e futuro frontend React Native Web.</w:t>
+      </w:r>
+    </w:p>
+    <w:p>
+      <w:pPr>
+        <w:pStyle w:val="Heading1"/>
+      </w:pPr>
+      <w:r>
+        <w:t>24. Roadmap backend restante</w:t>
+      </w:r>
+    </w:p>
+    <w:p>
+      <w:pPr>
+        <w:pStyle w:val="Heading2"/>
+      </w:pPr>
+      <w:r>
+        <w:t>24.1 Prioridade alta</w:t>
+      </w:r>
+    </w:p>
+    <w:p>
+      <w:pPr>
+        <w:pStyle w:val="ListBullet"/>
+      </w:pPr>
+      <w:r>
+        <w:t>Criar tratamento global de erros para respostas consistentes, sem stack traces extensas no Postman ou no futuro frontend.</w:t>
+      </w:r>
+    </w:p>
+    <w:p>
+      <w:pPr>
+        <w:pStyle w:val="ListBullet"/>
+      </w:pPr>
+      <w:r>
+        <w:t>Adicionar testes focados para services e controllers principais, especialmente AI Planner, WeatherSnapshot, FishingSession lifecycle e validacoes de DTOs.</w:t>
+      </w:r>
+    </w:p>
+    <w:p>
+      <w:pPr>
+        <w:pStyle w:val="ListBullet"/>
+      </w:pPr>
+      <w:r>
+        <w:t>Completar Session Review: endpoint pos-sessao que resume o que funcionou, o que falhou, melhor lure, padrao observado e sugestao para a proxima saida.</w:t>
+      </w:r>
+    </w:p>
+    <w:p>
+      <w:pPr>
+        <w:pStyle w:val="ListBullet"/>
+      </w:pPr>
+      <w:r>
+        <w:t>Melhorar Dashboard com proximos planos, sessoes ativas, ultimas capturas, weather recente e indicadores de performance simples.</w:t>
+      </w:r>
+    </w:p>
+    <w:p>
+      <w:pPr>
+        <w:pStyle w:val="ListBullet"/>
+      </w:pPr>
+      <w:r>
+        <w:t>Adicionar endpoints de update/delete onde fizer sentido para entidades ja existentes, mantendo DTOs e services como camada de negocio.</w:t>
+      </w:r>
+    </w:p>
+    <w:p>
+      <w:pPr>
+        <w:pStyle w:val="Heading2"/>
+      </w:pPr>
+      <w:r>
+        <w:t>24.2 Prioridade media</w:t>
+      </w:r>
+    </w:p>
+    <w:p>
+      <w:pPr>
+        <w:pStyle w:val="ListBullet"/>
+      </w:pPr>
+      <w:r>
+        <w:t>Evoluir Lure Box com active/inactive, quantidade disponivel, condicao da lure e notas pessoais por especie ou spot.</w:t>
+      </w:r>
+    </w:p>
+    <w:p>
+      <w:pPr>
+        <w:pStyle w:val="ListBullet"/>
+      </w:pPr>
+      <w:r>
+        <w:t>Guardar e consultar ajustes feitos durante a sessao como historico analisavel, ligado a eventos e ao plano original.</w:t>
+      </w:r>
+    </w:p>
+    <w:p>
+      <w:pPr>
+        <w:pStyle w:val="ListBullet"/>
+      </w:pPr>
+      <w:r>
+        <w:t>Melhorar Confidence System usando qualidade do contexto, weather, historico, sucesso por lure e dados em falta.</w:t>
+      </w:r>
+    </w:p>
+    <w:p>
+      <w:pPr>
+        <w:pStyle w:val="ListBullet"/>
+      </w:pPr>
+      <w:r>
+        <w:t>Adicionar filtros e pesquisa nos endpoints de listas principais: spots, fish, lure library, lure box, plans e sessions.</w:t>
+      </w:r>
+    </w:p>
+    <w:p>
+      <w:pPr>
+        <w:pStyle w:val="ListBullet"/>
+      </w:pPr>
+      <w:r>
+        <w:t>Preparar DTOs especificamente pensados para React Native Web, evitando payloads demasiado grandes para ecras moveis.</w:t>
+      </w:r>
+    </w:p>
+    <w:p>
+      <w:pPr>
+        <w:pStyle w:val="Heading2"/>
+      </w:pPr>
+      <w:r>
+        <w:t>24.3 Mais tarde</w:t>
+      </w:r>
+    </w:p>
+    <w:p>
+      <w:pPr>
+        <w:pStyle w:val="ListBullet"/>
+      </w:pPr>
+      <w:r>
+        <w:t>Adicionar autenticacao e perfis quando o MVP local estiver estavel.</w:t>
+      </w:r>
+    </w:p>
+    <w:p>
+      <w:pPr>
+        <w:pStyle w:val="ListBullet"/>
+      </w:pPr>
+      <w:r>
+        <w:t>Criar analiticas historicas mais avancadas: padroes por weather, spot, especie, lure e hora do dia.</w:t>
+      </w:r>
+    </w:p>
+    <w:p>
+      <w:pPr>
+        <w:pStyle w:val="ListBullet"/>
+      </w:pPr>
+      <w:r>
+        <w:t>Adicionar export/import de dados para backup local.</w:t>
+      </w:r>
+    </w:p>
+    <w:p>
+      <w:pPr>
+        <w:pStyle w:val="ListBullet"/>
+      </w:pPr>
+      <w:r>
+        <w:t>Avaliar Python/ML apenas quando existir historico real suficiente para treinar ou inferir padroes uteis.</w:t>
+      </w:r>
+    </w:p>
+    <w:p>
+      <w:pPr>
+        <w:pStyle w:val="ListBullet"/>
+      </w:pPr>
+      <w:r>
+        <w:t>Avaliar RAG ou web-assisted planning depois de existirem regras de seguranca, cache e fontes controladas.</w:t>
       </w:r>
     </w:p>
     <w:sectPr>

</xml_diff>

<commit_message>
Improve backend filtering, AI validation, and test coverage
- Add optional filters to main list endpoints
- Strengthen AI Planner validation for planA/planB/planC lure mentions
- Add MockMvc controller tests for filters and DTO validation
- Update Postman collection and project specification
</commit_message>
<xml_diff>
--- a/docs/FishLog_AI_Project_Specification.docx
+++ b/docs/FishLog_AI_Project_Specification.docx
@@ -10274,7 +10274,63 @@
         <w:pStyle w:val="ListBullet"/>
       </w:pPr>
       <w:r>
-        <w:t>Suite atual confirmada com ./mvnw test: 6 testes a passar.</w:t>
+        <w:t>Suite atual confirmada com ./mvnw test: 14 testes a passar.</w:t>
+      </w:r>
+    </w:p>
+    <w:p>
+      <w:pPr>
+        <w:pStyle w:val="Heading2"/>
+      </w:pPr>
+      <w:r>
+        <w:t>23.13 Filtros, MockMvc e validacao AI Planner</w:t>
+      </w:r>
+    </w:p>
+    <w:p>
+      <w:pPr>
+        <w:pStyle w:val="ListBullet"/>
+      </w:pPr>
+      <w:r>
+        <w:t>Endpoints principais de listagem passam a aceitar filtros opcionais sem alterar os URLs existentes: spots, fish, lure-library, lures, plans e sessions.</w:t>
+      </w:r>
+    </w:p>
+    <w:p>
+      <w:pPr>
+        <w:pStyle w:val="ListBullet"/>
+      </w:pPr>
+      <w:r>
+        <w:t>Filtros implementados na camada service para manter controllers simples e evitar acesso direto a repositories.</w:t>
+      </w:r>
+    </w:p>
+    <w:p>
+      <w:pPr>
+        <w:pStyle w:val="ListBullet"/>
+      </w:pPr>
+      <w:r>
+        <w:t>Filtros disponiveis incluem q, waterType, favoriteSpecies, strikeZone, type, difficulty, effectiveness, targetSpecies, brand, libraryItemId, spotId, planId, status, success, dateFrom e dateTo conforme o recurso.</w:t>
+      </w:r>
+    </w:p>
+    <w:p>
+      <w:pPr>
+        <w:pStyle w:val="ListBullet"/>
+      </w:pPr>
+      <w:r>
+        <w:t>AI Planner passou a substituir planA, planB ou planC por fallback seguro quando o texto menciona lures removidas por nao estarem em selectedLures.</w:t>
+      </w:r>
+    </w:p>
+    <w:p>
+      <w:pPr>
+        <w:pStyle w:val="ListBullet"/>
+      </w:pPr>
+      <w:r>
+        <w:t>Adicionados testes MockMvc standalone para validar query params dos endpoints principais e erros de validacao DTO em requests invalidos.</w:t>
+      </w:r>
+    </w:p>
+    <w:p>
+      <w:pPr>
+        <w:pStyle w:val="ListBullet"/>
+      </w:pPr>
+      <w:r>
+        <w:t>Colecao Postman atualizada com requests Search para os principais recursos filtraveis.</w:t>
       </w:r>
     </w:p>
     <w:p>
@@ -10298,7 +10354,7 @@
         <w:pStyle w:val="ListBullet"/>
       </w:pPr>
       <w:r>
-        <w:t>Expandir cobertura com testes de controllers e validacoes de DTOs principais, usando MockMvc onde fizer sentido.</w:t>
+        <w:t>Adicionar paginacao e ordenacao aos endpoints filtraveis quando as listas comecarem a crescer.</w:t>
       </w:r>
     </w:p>
     <w:p>
@@ -10331,14 +10387,6 @@
       </w:pPr>
       <w:r>
         <w:t>Melhorar Confidence System usando qualidade do contexto, weather, historico, sucesso por lure e dados em falta.</w:t>
-      </w:r>
-    </w:p>
-    <w:p>
-      <w:pPr>
-        <w:pStyle w:val="ListBullet"/>
-      </w:pPr>
-      <w:r>
-        <w:t>Adicionar filtros e pesquisa nos endpoints de listas principais: spots, fish, lure library, lure box, plans e sessions.</w:t>
       </w:r>
     </w:p>
     <w:p>

</xml_diff>

<commit_message>
Improve paginated API lists and Lure Box structure
- Add pagination and sorting to filterable backend endpoints
- Return lightweight summary DTOs for list responses
- Keep full DTOs for detail endpoints
- Add PagedResponse wrapper for React Native Web-friendly payloads
- Separate personal Lure Box inventory from the general lure library
- Add inventory fields such as active, quantity, condition and personal notes
- Update Postman collection and project documentation
- Expand MockMvc coverage for paginated and filtered endpoints
</commit_message>
<xml_diff>
--- a/docs/FishLog_AI_Project_Specification.docx
+++ b/docs/FishLog_AI_Project_Specification.docx
@@ -10290,7 +10290,7 @@
         <w:pStyle w:val="ListBullet"/>
       </w:pPr>
       <w:r>
-        <w:t>Endpoints principais de listagem passam a aceitar filtros opcionais sem alterar os URLs existentes: spots, fish, lure-library, lures, plans e sessions.</w:t>
+        <w:t>Endpoints principais de listagem passam a aceitar filtros opcionais sem alterar os URLs existentes: spots, fish, lure-library, lure-box/lures, plans e sessions.</w:t>
       </w:r>
     </w:p>
     <w:p>
@@ -10306,7 +10306,7 @@
         <w:pStyle w:val="ListBullet"/>
       </w:pPr>
       <w:r>
-        <w:t>Filtros disponiveis incluem q, waterType, favoriteSpecies, strikeZone, type, difficulty, effectiveness, targetSpecies, brand, libraryItemId, spotId, planId, status, success, dateFrom e dateTo conforme o recurso.</w:t>
+        <w:t>Filtros disponiveis incluem q, waterType, favoriteSpecies, strikeZone, type, difficulty, effectiveness, targetSpecies, brand, libraryItemId, active, condition, minQuantity, spotId, planId, status, success, dateFrom e dateTo conforme o recurso.</w:t>
       </w:r>
     </w:p>
     <w:p>
@@ -10335,6 +10335,70 @@
     </w:p>
     <w:p>
       <w:pPr>
+        <w:pStyle w:val="Heading2"/>
+      </w:pPr>
+      <w:r>
+        <w:t>23.14 Listagens paginadas e Lure Box pessoal</w:t>
+      </w:r>
+    </w:p>
+    <w:p>
+      <w:pPr>
+        <w:pStyle w:val="ListBullet"/>
+      </w:pPr>
+      <w:r>
+        <w:t>Endpoints filtraveis passam a devolver PagedResponse com items, totalItems, page, size, totalPages, hasNext e hasPrevious.</w:t>
+      </w:r>
+    </w:p>
+    <w:p>
+      <w:pPr>
+        <w:pStyle w:val="ListBullet"/>
+      </w:pPr>
+      <w:r>
+        <w:t>Listagens principais usam DTOs compactos pensados para React Native Web: summaries para spots, fish, lure-library, lure-box, plans e sessions.</w:t>
+      </w:r>
+    </w:p>
+    <w:p>
+      <w:pPr>
+        <w:pStyle w:val="ListBullet"/>
+      </w:pPr>
+      <w:r>
+        <w:t>Endpoints de detalhe por id continuam a devolver DTOs completos para ecras de detalhe.</w:t>
+      </w:r>
+    </w:p>
+    <w:p>
+      <w:pPr>
+        <w:pStyle w:val="ListBullet"/>
+      </w:pPr>
+      <w:r>
+        <w:t>Listagens aceitam page, size, sortBy e sortDirection; size e limitado no backend para evitar payloads demasiado grandes.</w:t>
+      </w:r>
+    </w:p>
+    <w:p>
+      <w:pPr>
+        <w:pStyle w:val="ListBullet"/>
+      </w:pPr>
+      <w:r>
+        <w:t>Lure Box passa a representar inventario pessoal e fica tambem disponivel em /api/lure-box, mantendo /api/lures como alias compativel.</w:t>
+      </w:r>
+    </w:p>
+    <w:p>
+      <w:pPr>
+        <w:pStyle w:val="ListBullet"/>
+      </w:pPr>
+      <w:r>
+        <w:t>Lure Box inclui campos pessoais: active, quantity, condition, personalNotes, favoriteForSpecies e favoriteForSpot.</w:t>
+      </w:r>
+    </w:p>
+    <w:p>
+      <w:pPr>
+        <w:pStyle w:val="ListBullet"/>
+      </w:pPr>
+      <w:r>
+        <w:t>Biblioteca geral de lures continua separada em /api/lure-library e descreve tipos/modelos de amostras, nao inventario pessoal.</w:t>
+      </w:r>
+    </w:p>
+    <w:p>
+      <w:pPr>
         <w:pStyle w:val="Heading1"/>
       </w:pPr>
       <w:r>
@@ -10354,7 +10418,7 @@
         <w:pStyle w:val="ListBullet"/>
       </w:pPr>
       <w:r>
-        <w:t>Adicionar paginacao e ordenacao aos endpoints filtraveis quando as listas comecarem a crescer.</w:t>
+        <w:t>Adicionar ordenacao/paginacao a repositories quando houver volume real, evitando filtragem em memoria.</w:t>
       </w:r>
     </w:p>
     <w:p>
@@ -10370,7 +10434,7 @@
         <w:pStyle w:val="ListBullet"/>
       </w:pPr>
       <w:r>
-        <w:t>Evoluir Lure Box com active/inactive, quantidade disponivel, condicao da lure e notas pessoais por especie ou spot.</w:t>
+        <w:t>Guardar e consultar ajustes feitos durante a sessao como historico analisavel, ligado a eventos e ao plano original.</w:t>
       </w:r>
     </w:p>
     <w:p>
@@ -10378,23 +10442,7 @@
         <w:pStyle w:val="ListBullet"/>
       </w:pPr>
       <w:r>
-        <w:t>Guardar e consultar ajustes feitos durante a sessao como historico analisavel, ligado a eventos e ao plano original.</w:t>
-      </w:r>
-    </w:p>
-    <w:p>
-      <w:pPr>
-        <w:pStyle w:val="ListBullet"/>
-      </w:pPr>
-      <w:r>
         <w:t>Melhorar Confidence System usando qualidade do contexto, weather, historico, sucesso por lure e dados em falta.</w:t>
-      </w:r>
-    </w:p>
-    <w:p>
-      <w:pPr>
-        <w:pStyle w:val="ListBullet"/>
-      </w:pPr>
-      <w:r>
-        <w:t>Preparar DTOs especificamente pensados para React Native Web, evitando payloads demasiado grandes para ecras moveis.</w:t>
       </w:r>
     </w:p>
     <w:p>

</xml_diff>

<commit_message>
Improve scalable filtering and AI recommendation confidence
- Move filterable list endpoints to repository-backed pagination and sorting
- Add reusable specifications for database-level search filters
- Keep PagedResponse contract for React Native Web lists
- Add AI recommendation version metadata with latest/superseded tracking
- Add latest endpoints for plan recommendations, session adjustments and reviews
- Add backend-calculated confidenceScore and confidenceReason
- Improve confidence based on weather, selected lures, history, events, catches and missing data
- Update Postman collection and project specification
</commit_message>
<xml_diff>
--- a/docs/FishLog_AI_Project_Specification.docx
+++ b/docs/FishLog_AI_Project_Specification.docx
@@ -10399,6 +10399,70 @@
     </w:p>
     <w:p>
       <w:pPr>
+        <w:pStyle w:val="Heading2"/>
+      </w:pPr>
+      <w:r>
+        <w:t>23.15 Repository pagination, recommendation versioning e Confidence System</w:t>
+      </w:r>
+    </w:p>
+    <w:p>
+      <w:pPr>
+        <w:pStyle w:val="ListBullet"/>
+      </w:pPr>
+      <w:r>
+        <w:t>Filtros, paginacao e ordenacao dos endpoints principais passaram para a base de dados usando JpaSpecificationExecutor, Specifications e Pageable.</w:t>
+      </w:r>
+    </w:p>
+    <w:p>
+      <w:pPr>
+        <w:pStyle w:val="ListBullet"/>
+      </w:pPr>
+      <w:r>
+        <w:t>Services continuam a construir a logica de pesquisa; controllers mantem-se apenas como camada HTTP e repositories continuam isolados da API.</w:t>
+      </w:r>
+    </w:p>
+    <w:p>
+      <w:pPr>
+        <w:pStyle w:val="ListBullet"/>
+      </w:pPr>
+      <w:r>
+        <w:t>AI recommendations ficam versionadas por tipo: PLAN, SESSION_ADJUSTMENT e SESSION_REVIEW.</w:t>
+      </w:r>
+    </w:p>
+    <w:p>
+      <w:pPr>
+        <w:pStyle w:val="ListBullet"/>
+      </w:pPr>
+      <w:r>
+        <w:t>Cada nova recomendacao marca versoes anteriores do mesmo tipo/contexto como latest=false e guarda supersededAt, mantendo historico consultavel.</w:t>
+      </w:r>
+    </w:p>
+    <w:p>
+      <w:pPr>
+        <w:pStyle w:val="ListBullet"/>
+      </w:pPr>
+      <w:r>
+        <w:t>Foram adicionados endpoints latest para plano, ajustes de sessao e reviews: /api/recommendations/plans/{planId}/latest, /api/recommendations/sessions/{sessionId}/adjustments/latest e /api/recommendations/sessions/{sessionId}/reviews/latest.</w:t>
+      </w:r>
+    </w:p>
+    <w:p>
+      <w:pPr>
+        <w:pStyle w:val="ListBullet"/>
+      </w:pPr>
+      <w:r>
+        <w:t>Respostas normais incluem version, latest, confidence, confidenceScore e confidenceReason; contextJson/rawResponse continuam apenas no endpoint de debug.</w:t>
+      </w:r>
+    </w:p>
+    <w:p>
+      <w:pPr>
+        <w:pStyle w:val="ListBullet"/>
+      </w:pPr>
+      <w:r>
+        <w:t>Confidence System passou a ser calculado no backend com base em weather, lures selecionadas, match com especie/tipo de agua, historico recente, eventos, capturas, rating e dados em falta.</w:t>
+      </w:r>
+    </w:p>
+    <w:p>
+      <w:pPr>
         <w:pStyle w:val="Heading1"/>
       </w:pPr>
       <w:r>
@@ -10418,7 +10482,7 @@
         <w:pStyle w:val="ListBullet"/>
       </w:pPr>
       <w:r>
-        <w:t>Adicionar ordenacao/paginacao a repositories quando houver volume real, evitando filtragem em memoria.</w:t>
+        <w:t>Adicionar projections especificas e indices de base de dados quando houver volume real, reduzindo joins e payloads em ecras de lista.</w:t>
       </w:r>
     </w:p>
     <w:p>
@@ -10434,7 +10498,7 @@
         <w:pStyle w:val="ListBullet"/>
       </w:pPr>
       <w:r>
-        <w:t>Guardar e consultar ajustes feitos durante a sessao como historico analisavel, ligado a eventos e ao plano original.</w:t>
+        <w:t>Adicionar tracking de execucao: saber se o utilizador seguiu planA/planB/planC ou um session adjustment e qual foi o resultado.</w:t>
       </w:r>
     </w:p>
     <w:p>
@@ -10442,7 +10506,7 @@
         <w:pStyle w:val="ListBullet"/>
       </w:pPr>
       <w:r>
-        <w:t>Melhorar Confidence System usando qualidade do contexto, weather, historico, sucesso por lure e dados em falta.</w:t>
+        <w:t>Calibrar o Confidence System com dados reais ao longo do tempo, incluindo sucesso por lure, especie, spot e condicoes meteorologicas.</w:t>
       </w:r>
     </w:p>
     <w:p>

</xml_diff>

<commit_message>
Add analytics and recommendation execution tracking
- Add DTO projection queries for optimized list responses
- Add database indexes for searchable and analytical fields
- Add recommendation execution tracking entity, DTOs, service and endpoints
- Track whether users followed PLAN_A, PLAN_B, PLAN_C or session adjustments
- Store execution result, success, rating, time window and notes
- Add analytics summary endpoint for sessions, catches, lures and recommendation performance
- Update Postman collection and project specification
- Expand MockMvc coverage for tracking and analytics endpoints
</commit_message>
<xml_diff>
--- a/docs/FishLog_AI_Project_Specification.docx
+++ b/docs/FishLog_AI_Project_Specification.docx
@@ -10463,6 +10463,62 @@
     </w:p>
     <w:p>
       <w:pPr>
+        <w:pStyle w:val="Heading2"/>
+      </w:pPr>
+      <w:r>
+        <w:t>23.16 Projection queries, execution tracking e analytics basicos</w:t>
+      </w:r>
+    </w:p>
+    <w:p>
+      <w:pPr>
+        <w:pStyle w:val="ListBullet"/>
+      </w:pPr>
+      <w:r>
+        <w:t>Listagens principais passam a usar query projection para devolver DTOs de resumo diretamente, evitando carregar entidades completas em ecras de lista.</w:t>
+      </w:r>
+    </w:p>
+    <w:p>
+      <w:pPr>
+        <w:pStyle w:val="ListBullet"/>
+      </w:pPr>
+      <w:r>
+        <w:t>Foram adicionados indices JPA nas colunas mais usadas em filtros, ordenacao, joins, historico AI, sessoes, capturas, weather e tracking.</w:t>
+      </w:r>
+    </w:p>
+    <w:p>
+      <w:pPr>
+        <w:pStyle w:val="ListBullet"/>
+      </w:pPr>
+      <w:r>
+        <w:t>Foi criada a entidade RecommendationExecution para registar se o utilizador seguiu PLAN_A, PLAN_B, PLAN_C ou um ajuste de sessao, incluindo resultado, sucesso, rating, janela temporal e notas.</w:t>
+      </w:r>
+    </w:p>
+    <w:p>
+      <w:pPr>
+        <w:pStyle w:val="ListBullet"/>
+      </w:pPr>
+      <w:r>
+        <w:t>Endpoints de tracking implementados: POST/GET /api/recommendations/{recommendationId}/executions, GET /api/plans/{planId}/recommendation-executions e GET /api/sessions/{sessionId}/recommendation-executions.</w:t>
+      </w:r>
+    </w:p>
+    <w:p>
+      <w:pPr>
+        <w:pStyle w:val="ListBullet"/>
+      </w:pPr>
+      <w:r>
+        <w:t>Foi adicionado GET /api/analytics/summary com contadores e metricas basicas: sucesso de sessoes, capturas, media de rating, performance por especie/spot, uso de lures e performance das recomendacoes executadas.</w:t>
+      </w:r>
+    </w:p>
+    <w:p>
+      <w:pPr>
+        <w:pStyle w:val="ListBullet"/>
+      </w:pPr>
+      <w:r>
+        <w:t>Postman foi atualizado com grupos Recommendation Execution Tracking e Analytics.</w:t>
+      </w:r>
+    </w:p>
+    <w:p>
+      <w:pPr>
         <w:pStyle w:val="Heading1"/>
       </w:pPr>
       <w:r>
@@ -10482,7 +10538,7 @@
         <w:pStyle w:val="ListBullet"/>
       </w:pPr>
       <w:r>
-        <w:t>Adicionar projections especificas e indices de base de dados quando houver volume real, reduzindo joins e payloads em ecras de lista.</w:t>
+        <w:t>Adicionar migrations explicitas com Flyway ou Liquibase para controlar alteracoes de schema e indices fora do modo ddl-auto.</w:t>
       </w:r>
     </w:p>
     <w:p>
@@ -10498,7 +10554,7 @@
         <w:pStyle w:val="ListBullet"/>
       </w:pPr>
       <w:r>
-        <w:t>Adicionar tracking de execucao: saber se o utilizador seguiu planA/planB/planC ou um session adjustment e qual foi o resultado.</w:t>
+        <w:t>Ligar o tracking de execucao ao Confidence System, para que recomendacoes futuras aprendam com o que foi realmente seguido e resultou.</w:t>
       </w:r>
     </w:p>
     <w:p>
@@ -10530,7 +10586,7 @@
         <w:pStyle w:val="ListBullet"/>
       </w:pPr>
       <w:r>
-        <w:t>Criar analiticas historicas mais avancadas: padroes por weather, spot, especie, lure e hora do dia.</w:t>
+        <w:t>Criar analiticas historicas mais avancadas: padroes por weather, spot, especie, lure, hora do dia e execucao de recomendacoes.</w:t>
       </w:r>
     </w:p>
     <w:p>

</xml_diff>

<commit_message>
Improve dashboard and add schema/confidence foundations
- Add Flyway migrations and switch JPA schema handling to validation
- Add initial database schema migration with current MVP tables and indexes
- Feed recommendation execution history into AI confidence scoring
- Expand dashboard response with next planned session, active sessions, recent results, best recent lure, success rate, relevant weather and pending recommendation evaluations
- Update Postman collection and project specification
- Add service tests for dashboard and confidence history
</commit_message>
<xml_diff>
--- a/docs/FishLog_AI_Project_Specification.docx
+++ b/docs/FishLog_AI_Project_Specification.docx
@@ -10518,97 +10518,151 @@
       </w:r>
     </w:p>
     <w:p>
-      <w:pPr>
-        <w:pStyle w:val="Heading1"/>
-      </w:pPr>
+      <w:r>
+        <w:t>23.17 Flyway migrations e confidence por execucao</w:t>
+      </w:r>
+    </w:p>
+    <w:p>
+      <w:r>
+        <w:t>Backend passou a usar Flyway para controlar a evolucao do schema da base de dados.</w:t>
+      </w:r>
+    </w:p>
+    <w:p>
+      <w:r>
+        <w:t>Foi adicionada a primeira migration em db/migration/V1__initial_schema.sql com tabelas, relacoes e indices principais do MVP atual.</w:t>
+      </w:r>
+    </w:p>
+    <w:p>
+      <w:r>
+        <w:t>A configuracao JPA mudou de ddl-auto update para validate, deixando de alterar a base automaticamente em runtime.</w:t>
+      </w:r>
+    </w:p>
+    <w:p>
+      <w:r>
+        <w:t>Flyway usa baseline-on-migrate para permitir continuar a trabalhar com bases locais que ja tinham sido criadas antes desta mudanca.</w:t>
+      </w:r>
+    </w:p>
+    <w:p>
+      <w:r>
+        <w:t>RecommendationExecution passou a alimentar o Confidence System: novas recomendacoes consideram execucoes anteriores do mesmo plano, spot/especie ou sessao quando calculam confidenceScore e confidenceReason.</w:t>
+      </w:r>
+    </w:p>
+    <w:p>
+      <w:r>
+        <w:t>As respostas de recomendacao tambem refletem feedback de execucao da propria recomendacao quando existem registos associados, permitindo perceber se o utilizador seguiu o plano e se resultou.</w:t>
+      </w:r>
+    </w:p>
+    <w:p>
+      <w:r>
+        <w:t>O objetivo e tornar a IA progressivamente mais util sem adicionar complexidade visual ao produto.</w:t>
+      </w:r>
+    </w:p>
+    <w:p>
+      <w:r>
+        <w:t>23.18 Dashboard acionavel para primeira vista</w:t>
+      </w:r>
+    </w:p>
+    <w:p>
+      <w:r>
+        <w:t>GET /api/dashboard passa a devolver blocos mais prontos para o futuro frontend React Native Web.</w:t>
+      </w:r>
+    </w:p>
+    <w:p>
+      <w:r>
+        <w:t>O dashboard inclui proxima sessao planeada, sessoes ativas, ultimos resultados, melhor lure recente, taxa de sucesso, weather snapshot relevante e recomendacoes pendentes para avaliar.</w:t>
+      </w:r>
+    </w:p>
+    <w:p>
+      <w:r>
+        <w:t>nextPlannedSession escolhe a proxima FishingSession planned quando existir; caso contrario usa o proximo FishingPlan como fallback util.</w:t>
+      </w:r>
+    </w:p>
+    <w:p>
+      <w:r>
+        <w:t>bestRecentLure e calculada a partir de lures usadas recentemente em sessoes, priorizando sucesso e frequencia de uso.</w:t>
+      </w:r>
+    </w:p>
+    <w:p>
+      <w:r>
+        <w:t>relevantWeatherSnapshot tenta usar weather ligado a proxima sessao/plano e so depois cai no snapshot mais recente disponivel.</w:t>
+      </w:r>
+    </w:p>
+    <w:p>
+      <w:r>
+        <w:t>pendingRecommendations lista recomendacoes latest que ainda nao tem RecommendationExecution, para incentivar o utilizador a fechar o ciclo Planear -&gt; Pescar -&gt; Aprender.</w:t>
+      </w:r>
+    </w:p>
+    <w:p>
+      <w:r>
+        <w:t>Os campos antigos do dashboard foram mantidos para compatibilidade; os novos campos sao aditivos e pensados para uma UI simples.</w:t>
+      </w:r>
+    </w:p>
+    <w:p>
       <w:r>
         <w:t>24. Roadmap backend restante</w:t>
       </w:r>
     </w:p>
     <w:p>
-      <w:pPr>
-        <w:pStyle w:val="Heading2"/>
-      </w:pPr>
       <w:r>
         <w:t>24.1 Prioridade alta</w:t>
       </w:r>
     </w:p>
     <w:p>
-      <w:pPr>
-        <w:pStyle w:val="ListBullet"/>
-      </w:pPr>
-      <w:r>
-        <w:t>Adicionar migrations explicitas com Flyway ou Liquibase para controlar alteracoes de schema e indices fora do modo ddl-auto.</w:t>
-      </w:r>
-    </w:p>
-    <w:p>
-      <w:pPr>
-        <w:pStyle w:val="Heading2"/>
-      </w:pPr>
+      <w:r>
+        <w:t>Criar endpoints de insights simples e praticos: top lures por especie, melhores spots, performance das recomendacoes e padroes basicos por condicoes.</w:t>
+      </w:r>
+    </w:p>
+    <w:p>
+      <w:r>
+        <w:t>Continuar a calibrar o Confidence System com dados reais: sucesso por lure, especie, spot, weather, execucao seguida e resultado final da sessao.</w:t>
+      </w:r>
+    </w:p>
+    <w:p>
+      <w:r>
+        <w:t>Rever o output dos endpoints principais para garantir que o frontend consegue montar o fluxo Planear -&gt; Pescar -&gt; Aprender sem chamadas redundantes.</w:t>
+      </w:r>
+    </w:p>
+    <w:p>
       <w:r>
         <w:t>24.2 Prioridade media</w:t>
       </w:r>
     </w:p>
     <w:p>
-      <w:pPr>
-        <w:pStyle w:val="ListBullet"/>
-      </w:pPr>
-      <w:r>
-        <w:t>Ligar o tracking de execucao ao Confidence System, para que recomendacoes futuras aprendam com o que foi realmente seguido e resultou.</w:t>
-      </w:r>
-    </w:p>
-    <w:p>
-      <w:pPr>
-        <w:pStyle w:val="ListBullet"/>
-      </w:pPr>
-      <w:r>
-        <w:t>Calibrar o Confidence System com dados reais ao longo do tempo, incluindo sucesso por lure, especie, spot e condicoes meteorologicas.</w:t>
-      </w:r>
-    </w:p>
-    <w:p>
-      <w:pPr>
-        <w:pStyle w:val="Heading2"/>
-      </w:pPr>
+      <w:r>
+        <w:t>Preparar o frontend em React Native Web, com foco no fluxo principal: dashboard, menu, spots, lure box, planos, sessoes e AI Planner.</w:t>
+      </w:r>
+    </w:p>
+    <w:p>
+      <w:r>
+        <w:t>Desenhar o menu principal com poucas entradas: Dashboard, Spots, Planos, Sessao ativa, Lure Box, Biblioteca e Perfil.</w:t>
+      </w:r>
+    </w:p>
+    <w:p>
+      <w:r>
+        <w:t>Melhorar analytics com filtros simples por data, especie, spot e lure quando houver volume de dados suficiente.</w:t>
+      </w:r>
+    </w:p>
+    <w:p>
       <w:r>
         <w:t>24.3 Mais tarde</w:t>
       </w:r>
     </w:p>
     <w:p>
-      <w:pPr>
-        <w:pStyle w:val="ListBullet"/>
-      </w:pPr>
       <w:r>
         <w:t>Adicionar autenticacao e perfis quando o MVP local estiver estavel.</w:t>
       </w:r>
     </w:p>
     <w:p>
-      <w:pPr>
-        <w:pStyle w:val="ListBullet"/>
-      </w:pPr>
-      <w:r>
-        <w:t>Criar analiticas historicas mais avancadas: padroes por weather, spot, especie, lure, hora do dia e execucao de recomendacoes.</w:t>
-      </w:r>
-    </w:p>
-    <w:p>
-      <w:pPr>
-        <w:pStyle w:val="ListBullet"/>
-      </w:pPr>
       <w:r>
         <w:t>Adicionar export/import de dados para backup local.</w:t>
       </w:r>
     </w:p>
     <w:p>
-      <w:pPr>
-        <w:pStyle w:val="ListBullet"/>
-      </w:pPr>
       <w:r>
         <w:t>Avaliar Python/ML apenas quando existir historico real suficiente para treinar ou inferir padroes uteis.</w:t>
       </w:r>
     </w:p>
     <w:p>
-      <w:pPr>
-        <w:pStyle w:val="ListBullet"/>
-      </w:pPr>
       <w:r>
         <w:t>Avaliar RAG ou web-assisted planning depois de existirem regras de seguranca, cache e fontes controladas.</w:t>
       </w:r>

</xml_diff>

<commit_message>
Add practical insights endpoints for analytics
- Add Insights controller, service and response DTOs
- Add endpoints for top lures, best spots, best conditions and recommendation performance
- Support filters by date, species, spot, lure and recommendation type
- Move insight aggregations to repositories
- Add MockMvc and service tests for insights
- Update Postman collection and project specification
</commit_message>
<xml_diff>
--- a/docs/FishLog_AI_Project_Specification.docx
+++ b/docs/FishLog_AI_Project_Specification.docx
@@ -10599,6 +10599,46 @@
     </w:p>
     <w:p>
       <w:r>
+        <w:t>23.19 Insights praticos e analytics filtraveis</w:t>
+      </w:r>
+    </w:p>
+    <w:p>
+      <w:r>
+        <w:t>Foram adicionados endpoints simples em /api/insights para transformar o historico em decisoes praticas, sem criar dashboards grandes ou confusos.</w:t>
+      </w:r>
+    </w:p>
+    <w:p>
+      <w:r>
+        <w:t>Endpoints implementados: GET /api/insights/top-lures, GET /api/insights/best-spots, GET /api/insights/best-conditions e GET /api/insights/recommendation-performance.</w:t>
+      </w:r>
+    </w:p>
+    <w:p>
+      <w:r>
+        <w:t>Os filtros suportados sao dateFrom, dateTo, species, spotId, lureId e limit. Recommendation performance tambem aceita recommendationType.</w:t>
+      </w:r>
+    </w:p>
+    <w:p>
+      <w:r>
+        <w:t>Top lures prioriza lures usadas em sessoes com sucesso, total de capturas, frequencia e data mais recente.</w:t>
+      </w:r>
+    </w:p>
+    <w:p>
+      <w:r>
+        <w:t>Best spots e best conditions usam sessoes, capturas, sucesso, rating e weather snapshots ligados a sessoes para mostrar apenas padroes acionaveis.</w:t>
+      </w:r>
+    </w:p>
+    <w:p>
+      <w:r>
+        <w:t>Recommendation performance usa RecommendationExecution para perceber que tipos/passos de recomendacao foram seguidos e quais resultaram melhor.</w:t>
+      </w:r>
+    </w:p>
+    <w:p>
+      <w:r>
+        <w:t>Postman foi atualizado com grupo Insights para testar estes endpoints rapidamente.</w:t>
+      </w:r>
+    </w:p>
+    <w:p>
+      <w:r>
         <w:t>24. Roadmap backend restante</w:t>
       </w:r>
     </w:p>
@@ -10609,7 +10649,7 @@
     </w:p>
     <w:p>
       <w:r>
-        <w:t>Criar endpoints de insights simples e praticos: top lures por especie, melhores spots, performance das recomendacoes e padroes basicos por condicoes.</w:t>
+        <w:t>Ligar os endpoints de insights ja implementados ao futuro frontend de forma seletiva, mantendo apenas metricas uteis para decisao rapida.</w:t>
       </w:r>
     </w:p>
     <w:p>
@@ -10639,7 +10679,7 @@
     </w:p>
     <w:p>
       <w:r>
-        <w:t>Melhorar analytics com filtros simples por data, especie, spot e lure quando houver volume de dados suficiente.</w:t>
+        <w:t>Evoluir analytics apenas quando houver volume real de dados, mantendo filtros simples por data, especie, spot, lure e tipo de recomendacao.</w:t>
       </w:r>
     </w:p>
     <w:p>

</xml_diff>

<commit_message>
Prepare backend API for frontend consumption
- Add frontend options endpoints for dropdown and combobox values
- Add compact option DTOs with value/label pairs
- Improve API error responses with stable error codes
- Add MockMvc coverage for options and error payloads
- Update Postman collection and project specification
</commit_message>
<xml_diff>
--- a/docs/FishLog_AI_Project_Specification.docx
+++ b/docs/FishLog_AI_Project_Specification.docx
@@ -10639,6 +10639,46 @@
     </w:p>
     <w:p>
       <w:r>
+        <w:t>23.20 Frontend readiness: options e erros de API</w:t>
+      </w:r>
+    </w:p>
+    <w:p>
+      <w:r>
+        <w:t>Foi adicionada uma camada simples para preparar o backend para React Native Web, sem alterar os endpoints principais nem o health endpoint.</w:t>
+      </w:r>
+    </w:p>
+    <w:p>
+      <w:r>
+        <w:t>Novo grupo de endpoints: GET /api/options para devolver todas as opcoes de combobox/dropdown numa unica chamada.</w:t>
+      </w:r>
+    </w:p>
+    <w:p>
+      <w:r>
+        <w:t>Tambem existem endpoints individuais em /api/options/water-types, /water-clarities, /water-levels, /lure-types, /lure-difficulties, /lure-effectiveness-levels, /lure-conditions, /fish-strike-zones, /session-statuses, /session-event-types, /recommendation-types, /recommendation-steps, /recommendation-results e /sort-directions.</w:t>
+      </w:r>
+    </w:p>
+    <w:p>
+      <w:r>
+        <w:t>As opcoes devolvem objetos simples { value, label }, com value pensado para enviar de volta ao backend e label pensado para mostrar na UI.</w:t>
+      </w:r>
+    </w:p>
+    <w:p>
+      <w:r>
+        <w:t>Dashboard, Insights, Plans e Sessions continuam a devolver DTOs pensados para ecras mobile/web: summaries paginados nas listagens e detalhe apenas quando necessario.</w:t>
+      </w:r>
+    </w:p>
+    <w:p>
+      <w:r>
+        <w:t>O payload de erro passou a incluir code estavel alem de message, status, path e fieldErrors, para o frontend conseguir mostrar feedback claro e tratar casos como VALIDATION_FAILED, INVALID_QUERY_PARAMETER, NOT_FOUND e CONFLICT.</w:t>
+      </w:r>
+    </w:p>
+    <w:p>
+      <w:r>
+        <w:t>Postman foi atualizado com grupo Frontend Options.</w:t>
+      </w:r>
+    </w:p>
+    <w:p>
+      <w:r>
         <w:t>24. Roadmap backend restante</w:t>
       </w:r>
     </w:p>
@@ -10659,7 +10699,7 @@
     </w:p>
     <w:p>
       <w:r>
-        <w:t>Rever o output dos endpoints principais para garantir que o frontend consegue montar o fluxo Planear -&gt; Pescar -&gt; Aprender sem chamadas redundantes.</w:t>
+        <w:t>Validar o fluxo completo Planear -&gt; Pescar -&gt; Aprender no frontend real e ajustar apenas payloads que causarem chamadas redundantes.</w:t>
       </w:r>
     </w:p>
     <w:p>
@@ -10669,7 +10709,7 @@
     </w:p>
     <w:p>
       <w:r>
-        <w:t>Preparar o frontend em React Native Web, com foco no fluxo principal: dashboard, menu, spots, lure box, planos, sessoes e AI Planner.</w:t>
+        <w:t>Iniciar o frontend em React Native Web usando os endpoints atuais: dashboard, menu, spots, lure box, planos, sessoes, insights, options e AI Planner.</w:t>
       </w:r>
     </w:p>
     <w:p>

</xml_diff>

<commit_message>
Update project documentation for frontend handoff
- Expand README with backend status, architecture and local commands
- Document main API areas and Postman usage
- Clarify React Native Web as the frontend direction
- Add frontend handoff notes to the project specification
</commit_message>
<xml_diff>
--- a/docs/FishLog_AI_Project_Specification.docx
+++ b/docs/FishLog_AI_Project_Specification.docx
@@ -10675,6 +10675,26 @@
     <w:p>
       <w:r>
         <w:t>Postman foi atualizado com grupo Frontend Options.</w:t>
+      </w:r>
+    </w:p>
+    <w:p>
+      <w:r>
+        <w:t>23.21 Documentacao de handoff para frontend</w:t>
+      </w:r>
+    </w:p>
+    <w:p>
+      <w:r>
+        <w:t>README.md foi atualizado para refletir o estado real do backend MVP, stack atual, comandos locais, arquitetura, principais grupos de endpoints, Postman, demo data e direcao de frontend React Native Web.</w:t>
+      </w:r>
+    </w:p>
+    <w:p>
+      <w:r>
+        <w:t>A colecao Postman continua atualizada com grupos para Health, Dashboard, Frontend Options, Spots, Fish Library, Lure Library, Lure Box, Plans, Sessions, AI Recommendations, Recommendation Execution Tracking, Analytics, Insights, Weather Snapshots e Weather Locations.</w:t>
+      </w:r>
+    </w:p>
+    <w:p>
+      <w:r>
+        <w:t>O backend esta documentado o suficiente para iniciar o frontend sem depender de conhecimento oral: o docx continua a ser a especificacao principal, o README serve como entrada tecnica rapida e o Postman serve para testar a API.</w:t>
       </w:r>
     </w:p>
     <w:p>

</xml_diff>

<commit_message>
Document media handling for catch photos
- Clarify static frontend assets versus user-generated uploads
- Add future support note for fish photos linked to catches and sessions
- Update project specification with catch photo roadmap item
</commit_message>
<xml_diff>
--- a/docs/FishLog_AI_Project_Specification.docx
+++ b/docs/FishLog_AI_Project_Specification.docx
@@ -10714,6 +10714,16 @@
     </w:p>
     <w:p>
       <w:r>
+        <w:t>Adicionar suporte a fotos de capturas: no frontend, permitir tirar ou escolher foto ao registar um peixe; no backend, guardar a foto como upload/user generated media e persistir photoUrl/metadados ligados a Catch e FishingSession.</w:t>
+      </w:r>
+    </w:p>
+    <w:p>
+      <w:r>
+        <w:t>Separar imagens estaticas de catalogo e fotos do utilizador: imagens de lures/especies/spots podem ficar em frontend/assets; fotos de capturas reais nao devem ficar nos assets do frontend, devem ser geridas como uploads.</w:t>
+      </w:r>
+    </w:p>
+    <w:p>
+      <w:r>
         <w:t>Continuar a calibrar o Confidence System com dados reais: sucesso por lure, especie, spot, weather, execucao seguida e resultado final da sessao.</w:t>
       </w:r>
     </w:p>
@@ -10729,7 +10739,7 @@
     </w:p>
     <w:p>
       <w:r>
-        <w:t>Iniciar o frontend em React Native Web usando os endpoints atuais: dashboard, menu, spots, lure box, planos, sessoes, insights, options e AI Planner.</w:t>
+        <w:t>Iniciar o frontend em React Native Web usando os endpoints atuais: dashboard, menu, spots, lure box, planos, sessoes, capturas com foto, insights, options e AI Planner.</w:t>
       </w:r>
     </w:p>
     <w:p>

</xml_diff>

<commit_message>
Add catch photo gallery backend support
- Add optional photo metadata to catches
- Add paged catch gallery endpoint for frontend navigation
- Include catchId and sessionId in gallery items
- Expose catch photos in dashboard recent catches
- Add Flyway migration for catch photo fields
- Update Postman, README and project specification
- Add MockMvc coverage for gallery filters
</commit_message>
<xml_diff>
--- a/docs/FishLog_AI_Project_Specification.docx
+++ b/docs/FishLog_AI_Project_Specification.docx
@@ -10689,7 +10689,7 @@
     </w:p>
     <w:p>
       <w:r>
-        <w:t>A colecao Postman continua atualizada com grupos para Health, Dashboard, Frontend Options, Spots, Fish Library, Lure Library, Lure Box, Plans, Sessions, AI Recommendations, Recommendation Execution Tracking, Analytics, Insights, Weather Snapshots e Weather Locations.</w:t>
+        <w:t>A colecao Postman continua atualizada com grupos para Health, Dashboard, Catch Gallery, Frontend Options, Spots, Fish Library, Lure Library, Lure Box, Plans, Sessions, AI Recommendations, Recommendation Execution Tracking, Analytics, Insights, Weather Snapshots e Weather Locations.</w:t>
       </w:r>
     </w:p>
     <w:p>
@@ -10699,6 +10699,31 @@
     </w:p>
     <w:p>
       <w:r>
+        <w:t>Postman foi atualizado com grupo Catch Gallery e os exemplos de Create/Update Catch passaram a incluir campos opcionais de foto.</w:t>
+      </w:r>
+    </w:p>
+    <w:p>
+      <w:r>
+        <w:t>Contrato frontend: o menu principal deve ter um icon/entrada para Galeria; ao tocar numa foto/cartao, o frontend deve navegar para a sessao indicada por sessionId e destacar/abrir a captura indicada por catchId.</w:t>
+      </w:r>
+    </w:p>
+    <w:p>
+      <w:r>
+        <w:t>Endpoint implementado: GET /api/gallery/catches devolve PagedResponse com itens compactos da galeria, incluindo catchId, sessionId, data da sessao, spot, especie, quantidade, medidas, released, foto, sucesso e rating da sessao.</w:t>
+      </w:r>
+    </w:p>
+    <w:p>
+      <w:r>
+        <w:t>Backend implementado: Catch passou a aceitar photoUrl, photoThumbnailUrl e photoCaption como metadados opcionais da captura, sem expor entidades diretamente.</w:t>
+      </w:r>
+    </w:p>
+    <w:p>
+      <w:r>
+        <w:t>23.22 Catch Gallery e fotos de capturas</w:t>
+      </w:r>
+    </w:p>
+    <w:p>
+      <w:r>
         <w:t>24. Roadmap backend restante</w:t>
       </w:r>
     </w:p>
@@ -10714,7 +10739,17 @@
     </w:p>
     <w:p>
       <w:r>
-        <w:t>Adicionar suporte a fotos de capturas: no frontend, permitir tirar ou escolher foto ao registar um peixe; no backend, guardar a foto como upload/user generated media e persistir photoUrl/metadados ligados a Catch e FishingSession.</w:t>
+        <w:t>Completar suporte real a uploads de fotos de capturas: o backend ja guarda photoUrl, photoThumbnailUrl e photoCaption em Catch, mas ainda falta implementar storage/upload de ficheiros quando o frontend existir.</w:t>
+      </w:r>
+    </w:p>
+    <w:p>
+      <w:r>
+        <w:t>Criar a pagina de galeria historica de capturas no frontend: grid/lista visual com todas as fotos de peixes apanhados, mostrando especie, data, spot e resumo curto; ao clicar numa foto/cartao, abrir o detalhe da sessao correspondente e a captura dentro dessa sessao.</w:t>
+      </w:r>
+    </w:p>
+    <w:p>
+      <w:r>
+        <w:t>A galeria deve usar inicialmente GET /api/gallery/catches, com filtros simples ja suportados no backend por texto, especie, spot, sessao, datas, released, sucesso da sessao e withPhotoOnly.</w:t>
       </w:r>
     </w:p>
     <w:p>
@@ -10744,7 +10779,7 @@
     </w:p>
     <w:p>
       <w:r>
-        <w:t>Desenhar o menu principal com poucas entradas: Dashboard, Spots, Planos, Sessao ativa, Lure Box, Biblioteca e Perfil.</w:t>
+        <w:t>Desenhar o menu principal com poucas entradas e icones claros: Dashboard, Galeria, Spots, Planos, Sessao ativa, Lure Box, Biblioteca e Perfil.</w:t>
       </w:r>
     </w:p>
     <w:p>

</xml_diff>

<commit_message>
Expand library and catch gallery features Add fish/lure library CRUD, water environment filters, action imagery, catch photos and lure associations, database migrations, updated documentation/Postman/README, and expanded tests.
</commit_message>
<xml_diff>
--- a/docs/FishLog_AI_Project_Specification.docx
+++ b/docs/FishLog_AI_Project_Specification.docx
@@ -10722,22 +10722,17 @@
     </w:p>
     <w:p>
       <w:r>
-        <w:t>Postman foi atualizado com grupo Catch Gallery e os exemplos de Create/Update Catch passaram a incluir campos opcionais de foto.</w:t>
-      </w:r>
-    </w:p>
-    <w:p>
-      <w:r>
-        <w:t>Contrato frontend: o menu principal deve ter um icon/entrada para Galeria; ao tocar numa foto/cartao, o frontend deve navegar para a sessao indicada por sessionId e destacar/abrir a captura indicada por catchId.</w:t>
-      </w:r>
-    </w:p>
-    <w:p>
-      <w:r>
-        <w:t>Endpoint implementado: GET /api/gallery/catches devolve PagedResponse com itens compactos da galeria, incluindo catchId, sessionId, data da sessao, spot, especie, quantidade, medidas, released, foto, sucesso e rating da sessao.</w:t>
-      </w:r>
-    </w:p>
-    <w:p>
-      <w:r>
-        <w:t>Backend implementado: Catch passou a aceitar photoUrl, photoThumbnailUrl e photoCaption como metadados opcionais da captura, sem expor entidades diretamente.</w:t>
+        <w:t>Contrato frontend: o menu principal deve ter um icon/entrada para Galeria; ao tocar numa foto/cartao, o frontend deve navegar para a sessao indicada por sessionId e destacar/abrir a captura indicada por catchId. A galeria tambem mostra a lure da biblioteca usada quando essa associacao existir.</w:t>
+      </w:r>
+    </w:p>
+    <w:p>
+      <w:r>
+        <w:t>Endpoint implementado: GET /api/gallery/catches devolve PagedResponse com itens compactos da galeria, incluindo catchId, sessionId, data da sessao, spot, especie, quantidade, medidas, released, foto, sucesso/rating da sessao e, opcionalmente, lureLibraryItemId, lureName e lureImageUrl.</w:t>
+      </w:r>
+    </w:p>
+    <w:p>
+      <w:r>
+        <w:t>Backend implementado: Catch aceita photoUrl, photoThumbnailUrl, photoCaption e uma associacao opcional a LureLibraryItem. CreateCatchRequest e CatchResponse usam DTOs e validam a existencia da lure selecionada.</w:t>
       </w:r>
     </w:p>
     <w:p>
@@ -10749,6 +10744,16 @@
       </w:r>
     </w:p>
     <w:p>
+      <w:r>
+        <w:t>A galeria visual foi implementada no frontend React Native Web com grid de capturas, pesquisa, detalhe com imagem em destaque, tamanho, peso opcional, sessao e spot. A quantidade e outros campos internos nao aparecem no detalhe normal.</w:t>
+      </w:r>
+    </w:p>
+    <w:p>
+      <w:r>
+        <w:t>O utilizador pode criar, editar e apagar capturas. Ao criar/editar, escolhe a especie da biblioteca de peixes, a lure da biblioteca de lures e a sessao associada em comboboxes; a lure selecionada aparece em miniatura na captura. A foto continua a ser tratada como URL/metadado ate existir upload binario gerido pelo backend.</w:t>
+      </w:r>
+    </w:p>
+    <w:p>
       <w:pPr>
         <w:pStyle w:val="Heading2"/>
       </w:pPr>
@@ -10821,31 +10826,31 @@
       </w:r>
     </w:p>
     <w:p>
+      <w:r>
+        <w:t>24.1 Prioridade alta</w:t>
+      </w:r>
+    </w:p>
+    <w:p>
+      <w:r>
+        <w:t>Ligar os endpoints de insights ja implementados ao futuro frontend de forma seletiva, mantendo apenas metricas uteis para decisao rapida.</w:t>
+      </w:r>
+    </w:p>
+    <w:p>
       <w:pPr>
         <w:pStyle w:val="Heading2"/>
       </w:pPr>
       <w:r>
-        <w:t>24.1 Prioridade alta</w:t>
-      </w:r>
-    </w:p>
-    <w:p>
-      <w:r>
-        <w:t>Ligar os endpoints de insights ja implementados ao futuro frontend de forma seletiva, mantendo apenas metricas uteis para decisao rapida.</w:t>
+        <w:t>A galeria visual de capturas ja foi implementada no frontend. O trabalho restante nesta area e substituir data URLs/metadados por upload e storage de ficheiros geridos pelo backend quando a app passar a usar fotos reais em maior escala.</w:t>
+      </w:r>
+    </w:p>
+    <w:p>
+      <w:r>
+        <w:t>A galeria usa GET /api/gallery/catches, com filtros simples ja suportados no backend por texto, especie, spot, sessao, datas, released, sucesso da sessao e withPhotoOnly. Os itens incluem a lure da biblioteca quando registada.</w:t>
       </w:r>
     </w:p>
     <w:p>
       <w:r>
         <w:t>Completar suporte real a uploads de fotos de capturas: o backend ja guarda photoUrl, photoThumbnailUrl e photoCaption em Catch, mas ainda falta implementar storage/upload de ficheiros quando o frontend existir.</w:t>
-      </w:r>
-    </w:p>
-    <w:p>
-      <w:r>
-        <w:t>Criar a pagina de galeria historica de capturas no frontend: grid/lista visual com todas as fotos de peixes apanhados, mostrando especie, data, spot e resumo curto; ao clicar numa foto/cartao, abrir o detalhe da sessao correspondente e a captura dentro dessa sessao.</w:t>
-      </w:r>
-    </w:p>
-    <w:p>
-      <w:r>
-        <w:t>A galeria deve usar inicialmente GET /api/gallery/catches, com filtros simples ja suportados no backend por texto, especie, spot, sessao, datas, released, sucesso da sessao e withPhotoOnly.</w:t>
       </w:r>
     </w:p>
     <w:p>

</xml_diff>

<commit_message>
Continue LurePilot AI development by expanding the backend catalog, weather and fishing workflows, adding Flyway migrations, seed data, projections and analytics support. Improve the React Native Web experience with redesigned library, gallery, lure box, dashboard and fishing spot screens, transparent fishing assets, multi-species spot selection, interactive map positioning and IPMA weather integration. Synchronize the README, Postman collection and project specification with the current architecture and user flows.
</commit_message>
<xml_diff>
--- a/docs/FishLog_AI_Project_Specification.docx
+++ b/docs/FishLog_AI_Project_Specification.docx
@@ -10965,6 +10965,60 @@
     <w:p>
       <w:r>
         <w:t>Avaliar RAG ou web-assisted planning depois de existirem regras de seguranca, cache e fontes controladas.</w:t>
+      </w:r>
+    </w:p>
+    <w:p>
+      <w:pPr>
+        <w:pStyle w:val="Heading2"/>
+      </w:pPr>
+      <w:r>
+        <w:t>24.4 Spots visuais, mapa e meteorologia IPMA</w:t>
+      </w:r>
+    </w:p>
+    <w:p>
+      <w:r>
+        <w:t>A primeira iteracao real do frontend React Native Web para Spots usa um mapa OpenStreetMap com zoom, arrasto e selecao por clique. Um gesto de arrasto move o mapa sem alterar as coordenadas; um clique simples escolhe o ponto. A selecao no mapa preenche latitude e longitude automaticamente, mantendo os campos editaveis. O controlo de zoom permite aproximar de Z4 ate Z18.</w:t>
+      </w:r>
+    </w:p>
+    <w:p>
+      <w:r>
+        <w:t>O formulario de novo spot exige tipo de agua Freshwater ou Saltwater, apresenta seis tipos de local com imagens (albufeira/barragem, rio/ribeira, lago/lagoa, foz/estuario, costa/mar aberto e porto/marina) e permite escolher uma ou mais especies a partir da biblioteca de peixes. O frontend envia esta selecao de forma compativel no campo favoriteSpecies e apresenta cada especie como um chip individual com imagem. O tipo visual do local passa a ser persistido no campo spotType com os valores RESERVOIR, RIVER, LAKE, ESTUARY, COAST e HARBOR.</w:t>
+      </w:r>
+    </w:p>
+    <w:p>
+      <w:r>
+        <w:t>A tab Spots mostra um cartao de meteorologia IPMA para o spot selecionado. O frontend usa POST /api/weather-snapshots/ipma/coordinates com as coordenadas do spot ao abrir a tab, ao selecionar outro spot e quando o utilizador pede uma atualizacao manual. O cartao identifica a localidade de previsao IPMA selecionada e mostra temperatura minima e maxima diaria, probabilidade de chuva, direcao e classe do vento, data da previsao, atualizacao IPMA, momento da consulta e coordenadas. A condicao meteorologica nao e usada como dado visual; o icone usa chuva quando a precipitacao ultrapassa 20% e ceu limpo nos restantes casos.</w:t>
+      </w:r>
+    </w:p>
+    <w:p>
+      <w:pPr/>
+      <w:r>
+        <w:t>No Dashboard, o bloco Weather relevante permite escolher qualquer localidade devolvida por GET /api/weather-locations/ipma. Ao mudar de localidade IPMA, o frontend chama POST /api/weather-snapshots/ipma/location e atualiza o cartao com o snapshot desse local.</w:t>
+      </w:r>
+    </w:p>
+    <w:p>
+      <w:r>
+        <w:t>A migration Flyway V8 adiciona fishing_spots.spot_type, classifica os spots existentes por nome e cria o indice correspondente.</w:t>
+      </w:r>
+    </w:p>
+    <w:p>
+      <w:r>
+        <w:t>24.5 Refinamento visual e comportamento dos Spots</w:t>
+      </w:r>
+    </w:p>
+    <w:p>
+      <w:r>
+        <w:t>A interface de Spots foi aproximada da linguagem visual da Galeria e da Lure Box, com um cabecalho mais limpo, maior separacao entre secoes, contadores e uma acao principal para criar spots. A pesquisa textual foi removida desta tab para manter o fluxo focado no mapa e nos cartoes de locais.</w:t>
+      </w:r>
+    </w:p>
+    <w:p>
+      <w:r>
+        <w:t>No formulario de criacao e na vista de detalhe, descricao e createdAt deixam de ser apresentados na interface normal. O utilizador escolhe varias especies atraves de um multi-select ligado a biblioteca de peixes; as especies aparecem como chips individuais com imagem nos cartoes e no detalhe. O campo de persistencia continua a usar favoriteSpecies separado por virgulas para manter compatibilidade com o backend existente.</w:t>
+      </w:r>
+    </w:p>
+    <w:p>
+      <w:r>
+        <w:t>As coordenadas do mapa continuam a ser convertidas pelo IPMA para a localidade de previsao suportada mais proxima. Esta localidade nao deve ser apresentada como distrito administrativo exato; uma futura melhoria de reverse geocoding e limites administrativos fica fora desta iteracao.</w:t>
       </w:r>
     </w:p>
     <w:sectPr>

</xml_diff>

<commit_message>
Improve React Native Web fishing workflows and AI Planner UX Expanded the frontend with gallery, library, lure box, spots, plans, weather/IPMA and AI planning flows, including validated and saveable A/B/C recommendations.
</commit_message>
<xml_diff>
--- a/docs/FishLog_AI_Project_Specification.docx
+++ b/docs/FishLog_AI_Project_Specification.docx
@@ -10853,6 +10853,60 @@
       <w:pPr/>
       <w:r>
         <w:t>A barra de pesquisa foi removida da Biblioteca e a apresentacao visual privilegia filtros de ambiente, troca entre catalogos, imagens e paginacao simples. O backend continua a suportar filtros e ordenacao para futuros ecras mais avancados.</w:t>
+      </w:r>
+    </w:p>
+    <w:p>
+      <w:pPr>
+        <w:pStyle w:val="Heading2"/>
+      </w:pPr>
+      <w:r>
+        <w:t>23.25 Plans e AI Planner no frontend</w:t>
+      </w:r>
+    </w:p>
+    <w:p>
+      <w:pPr/>
+      <w:r>
+        <w:t>A pagina de Planos foi implementada no frontend React Native Web como um ecrã operacional para criar, consultar e abrir planos de pesca.</w:t>
+      </w:r>
+    </w:p>
+    <w:p>
+      <w:pPr>
+        <w:pStyle w:val="ListBullet"/>
+      </w:pPr>
+      <w:r>
+        <w:t>A pesquisa textual foi removida da pagina de Planos para manter o foco no planeamento e reduzir ruido visual.</w:t>
+      </w:r>
+    </w:p>
+    <w:p>
+      <w:pPr>
+        <w:pStyle w:val="ListBullet"/>
+      </w:pPr>
+      <w:r>
+        <w:t>O header mostra o total de planos num contador quadrado consistente com os headers de Spots e Lure Box.</w:t>
+      </w:r>
+    </w:p>
+    <w:p>
+      <w:pPr>
+        <w:pStyle w:val="ListBullet"/>
+      </w:pPr>
+      <w:r>
+        <w:t>O header apresenta um destaque visual Powered by AI para comunicar que o planeamento A/B/C usa o AI Planner local.</w:t>
+      </w:r>
+    </w:p>
+    <w:p>
+      <w:pPr>
+        <w:pStyle w:val="ListBullet"/>
+      </w:pPr>
+      <w:r>
+        <w:t>O formulario permite escolher data e hora, uma ou varias especies da biblioteca, todas as especies, lures selecionadas ou a Lure Box completa.</w:t>
+      </w:r>
+    </w:p>
+    <w:p>
+      <w:pPr>
+        <w:pStyle w:val="ListBullet"/>
+      </w:pPr>
+      <w:r>
+        <w:t>O detalhe do plano mostra a recomendacao validada, confidence e o estado de guardado; o utilizador pode guardar a recomendacao gerada.</w:t>
       </w:r>
     </w:p>
     <w:p>

</xml_diff>

<commit_message>
Replace IPMA with Open-Meteo and add solunar-aware AI planning Expanded React Native Web weather, spots and plan workflows; enriched the AI Planner with weather and solunar context, confidence and cleaner plan details; added migrations/tests and synchronized README, specification and Postman documentation.
</commit_message>
<xml_diff>
--- a/docs/FishLog_AI_Project_Specification.docx
+++ b/docs/FishLog_AI_Project_Specification.docx
@@ -6036,7 +6036,7 @@
         <w:pStyle w:val="ListBullet"/>
       </w:pPr>
       <w:r>
-        <w:t>Guardar WeatherSnapshot para que as recomendacoes, dashboards e ajustes durante a sessao usem dados consistentes. O backend deve suportar captura automatica por plano/sessao, por coordenadas e por local IPMA selecionado pelo utilizador.</w:t>
+        <w:t>Guardar WeatherSnapshot para que as recomendacoes, dashboards e ajustes durante a sessao usem dados consistentes. O backend deve suportar captura automatica por plano/sessao, por coordenadas e por localidade pesquisada pelo utilizador.</w:t>
       </w:r>
     </w:p>
     <w:p>
@@ -9818,7 +9818,7 @@
         <w:pStyle w:val="Heading2"/>
       </w:pPr>
       <w:r>
-        <w:t>23.3 WeatherSnapshot e IPMA</w:t>
+        <w:t>23.3 WeatherSnapshot e Open-Meteo</w:t>
       </w:r>
     </w:p>
     <w:p>
@@ -9834,7 +9834,7 @@
         <w:pStyle w:val="ListBullet"/>
       </w:pPr>
       <w:r>
-        <w:t>Cliente implementado: IpmaClient, usando a API oficial api.ipma.pt.</w:t>
+        <w:t>Cliente implementado: OpenMeteoClient, usando a API oficial open-meteo.com.</w:t>
       </w:r>
     </w:p>
     <w:p>
@@ -9842,7 +9842,7 @@
         <w:pStyle w:val="ListBullet"/>
       </w:pPr>
       <w:r>
-        <w:t>Fluxo user-friendly: o utilizador nao precisa de saber globalIdLocal. Pode usar plano, sessao, coordenadas ou escolher uma zona IPMA exposta pelo backend.</w:t>
+        <w:t>Fluxo user-friendly: o utilizador nao precisa de saber IDs externos. Pode usar um plano, uma sessao, coordenadas ou pesquisar uma cidade, vila ou codigo postal.</w:t>
       </w:r>
     </w:p>
     <w:p>
@@ -9850,7 +9850,7 @@
         <w:pStyle w:val="ListBullet"/>
       </w:pPr>
       <w:r>
-        <w:t>O backend encontra automaticamente o local IPMA mais proximo quando recebe coordenadas ou quando usa as coordenadas do spot.</w:t>
+        <w:t>O backend consulta a previsao diretamente pelas coordenadas do spot ou da localidade escolhida, sem depender de uma lista fixa de distritos.</w:t>
       </w:r>
     </w:p>
     <w:p>
@@ -9874,7 +9874,7 @@
         <w:pStyle w:val="ListBullet"/>
       </w:pPr>
       <w:r>
-        <w:t>GET /api/weather-locations/ipma - lista locais IPMA para combobox no frontend.</w:t>
+        <w:t>GET /api/weather-locations/search?query=Lisboa&amp;countryCode=PT - pesquisa cidades, vilas e codigos postais na API Open-Meteo Geocoding.</w:t>
       </w:r>
     </w:p>
     <w:p>
@@ -9882,7 +9882,7 @@
         <w:pStyle w:val="ListBullet"/>
       </w:pPr>
       <w:r>
-        <w:t>GET /api/weather-locations/ipma/search?query=Lisboa - pesquisa locais IPMA.</w:t>
+        <w:t>POST /api/weather-snapshots/plans/{planId} - cria snapshot Open-Meteo automaticamente a partir do spot do plano.</w:t>
       </w:r>
     </w:p>
     <w:p>
@@ -9890,7 +9890,7 @@
         <w:pStyle w:val="ListBullet"/>
       </w:pPr>
       <w:r>
-        <w:t>POST /api/weather-snapshots/plans/{planId}/ipma - cria snapshot IPMA automaticamente a partir do spot do plano.</w:t>
+        <w:t>POST /api/weather-snapshots/sessions/{sessionId} - cria snapshot Open-Meteo automaticamente a partir do spot da sessao.</w:t>
       </w:r>
     </w:p>
     <w:p>
@@ -9898,7 +9898,7 @@
         <w:pStyle w:val="ListBullet"/>
       </w:pPr>
       <w:r>
-        <w:t>POST /api/weather-snapshots/sessions/{sessionId}/ipma - cria snapshot IPMA automaticamente a partir do spot da sessao.</w:t>
+        <w:t>POST /api/weather-snapshots/coordinates - cria snapshot por latitude/longitude introduzidas pelo utilizador.</w:t>
       </w:r>
     </w:p>
     <w:p>
@@ -9906,7 +9906,7 @@
         <w:pStyle w:val="ListBullet"/>
       </w:pPr>
       <w:r>
-        <w:t>POST /api/weather-snapshots/ipma/coordinates - cria snapshot por latitude/longitude introduzidas pelo utilizador.</w:t>
+        <w:t>POST /api/weather-snapshots/location - cria snapshot por locationId escolhido numa combobox.</w:t>
       </w:r>
     </w:p>
     <w:p>
@@ -9914,7 +9914,7 @@
         <w:pStyle w:val="ListBullet"/>
       </w:pPr>
       <w:r>
-        <w:t>POST /api/weather-snapshots/ipma/location - cria snapshot por globalIdLocal escolhido numa combobox.</w:t>
+        <w:t>GET /api/weather-snapshots/plans/{planId} e GET /api/weather-snapshots/sessions/{sessionId} - listam snapshots guardados.</w:t>
       </w:r>
     </w:p>
     <w:p>
@@ -9922,7 +9922,15 @@
         <w:pStyle w:val="ListBullet"/>
       </w:pPr>
       <w:r>
-        <w:t>GET /api/weather-snapshots/plans/{planId} e GET /api/weather-snapshots/sessions/{sessionId} - listam snapshots guardados.</w:t>
+        <w:t>GET /api/weather-snapshots/plans/{planId}/latest e GET /api/weather-snapshots/sessions/{sessionId}/latest - devolvem o snapshot mais recente.</w:t>
+      </w:r>
+    </w:p>
+    <w:p>
+      <w:pPr>
+        <w:pStyle w:val="Heading2"/>
+      </w:pPr>
+      <w:r>
+        <w:t>23.5 Decisao frontend associada</w:t>
       </w:r>
     </w:p>
     <w:p>
@@ -9930,7 +9938,23 @@
         <w:pStyle w:val="ListBullet"/>
       </w:pPr>
       <w:r>
-        <w:t>GET /api/weather-snapshots/plans/{planId}/latest e GET /api/weather-snapshots/sessions/{sessionId}/latest - devolvem o snapshot mais recente.</w:t>
+        <w:t>No frontend, a experiencia meteorologica deve oferecer duas opcoes simples: usar coordenadas/mapa ou pesquisar uma localidade portuguesa.</w:t>
+      </w:r>
+    </w:p>
+    <w:p>
+      <w:pPr>
+        <w:pStyle w:val="ListBullet"/>
+      </w:pPr>
+      <w:r>
+        <w:t>A pesquisa de localidades deve consumir GET /api/weather-locations/search?query=Lisboa&amp;countryCode=PT e apresentar nome, concelho/distrito quando disponivel e coordenadas.</w:t>
+      </w:r>
+    </w:p>
+    <w:p>
+      <w:pPr>
+        <w:pStyle w:val="ListBullet"/>
+      </w:pPr>
+      <w:r>
+        <w:t>Quando o utilizador estiver dentro de um plano ou sessao, a acao principal deve ser um botao simples como Atualizar meteorologia.</w:t>
       </w:r>
     </w:p>
     <w:p>
@@ -9938,7 +9962,7 @@
         <w:pStyle w:val="Heading2"/>
       </w:pPr>
       <w:r>
-        <w:t>23.5 Decisao frontend associada</w:t>
+        <w:t>23.6 AI Planner com Weather e Solunar automaticos</w:t>
       </w:r>
     </w:p>
     <w:p>
@@ -9946,7 +9970,7 @@
         <w:pStyle w:val="ListBullet"/>
       </w:pPr>
       <w:r>
-        <w:t>No frontend, a experiencia meteorologica deve oferecer duas opcoes simples: usar coordenadas/mapa ou selecionar zona IPMA numa combobox.</w:t>
+        <w:t>Quando o endpoint POST /api/recommendations/plan e chamado, o backend deve tentar usar automaticamente o WeatherSnapshot mais recente do plano. O Planner Context Builder tambem calcula o Solunar Forecast para a data e as coordenadas do spot, incluindo fase lunar, iluminacao, nascer/por da Lua e janelas major/minor.</w:t>
       </w:r>
     </w:p>
     <w:p>
@@ -9954,7 +9978,7 @@
         <w:pStyle w:val="ListBullet"/>
       </w:pPr>
       <w:r>
-        <w:t>A combobox deve consumir GET /api/weather-locations/ipma ou GET /api/weather-locations/ipma/search.</w:t>
+        <w:t>Se o plano ainda nao tiver WeatherSnapshot, o backend tenta cria-lo automaticamente a partir das coordenadas do spot antes de montar o contexto da IA.</w:t>
       </w:r>
     </w:p>
     <w:p>
@@ -9962,7 +9986,15 @@
         <w:pStyle w:val="ListBullet"/>
       </w:pPr>
       <w:r>
-        <w:t>Quando o utilizador estiver dentro de um plano ou sessao, a acao principal deve ser um botao simples como Atualizar meteorologia IPMA.</w:t>
+        <w:t>Se a API externa do Open-Meteo falhar, o AI Planner nao deve bloquear; a recomendacao continua sem meteorologia e o contexto indica menor qualidade de dados.</w:t>
+      </w:r>
+    </w:p>
+    <w:p>
+      <w:pPr>
+        <w:pStyle w:val="ListBullet"/>
+      </w:pPr>
+      <w:r>
+        <w:t>O WeatherSnapshot continua a ser tratado como dado estruturado do backend, nao como informacao inventada pelo modelo. O Solunar Forecast e igualmente um calculo estruturado do backend e deve ser usado como indicador tradicional, nao como garantia de captura.</w:t>
       </w:r>
     </w:p>
     <w:p>
@@ -9970,7 +10002,7 @@
         <w:pStyle w:val="Heading2"/>
       </w:pPr>
       <w:r>
-        <w:t>23.6 AI Planner com Weather automatico</w:t>
+        <w:t>23.7 FishingSession lifecycle</w:t>
       </w:r>
     </w:p>
     <w:p>
@@ -9978,7 +10010,7 @@
         <w:pStyle w:val="ListBullet"/>
       </w:pPr>
       <w:r>
-        <w:t>Quando o endpoint POST /api/recommendations/plan e chamado, o backend deve tentar usar automaticamente o WeatherSnapshot mais recente do plano.</w:t>
+        <w:t>FishingSession passa a ter estado: planned, active e finished.</w:t>
       </w:r>
     </w:p>
     <w:p>
@@ -9986,7 +10018,7 @@
         <w:pStyle w:val="ListBullet"/>
       </w:pPr>
       <w:r>
-        <w:t>Se o plano ainda nao tiver WeatherSnapshot, o backend tenta criar um snapshot IPMA a partir das coordenadas do spot antes de montar o contexto da IA.</w:t>
+        <w:t>Endpoints implementados: POST /api/sessions/{id}/start e POST /api/sessions/{id}/finish.</w:t>
       </w:r>
     </w:p>
     <w:p>
@@ -9994,7 +10026,7 @@
         <w:pStyle w:val="ListBullet"/>
       </w:pPr>
       <w:r>
-        <w:t>Se a API externa do IPMA falhar, o AI Planner nao deve bloquear; a recomendacao continua sem meteorologia e o contexto indica menor qualidade de dados.</w:t>
+        <w:t>Ao iniciar uma sessao, o backend define startTime quando enviado ou usa a hora atual, e muda o estado para active.</w:t>
       </w:r>
     </w:p>
     <w:p>
@@ -10002,7 +10034,15 @@
         <w:pStyle w:val="ListBullet"/>
       </w:pPr>
       <w:r>
-        <w:t>O WeatherSnapshot continua a ser tratado como dado estruturado do backend, nao como informacao inventada pelo modelo.</w:t>
+        <w:t>Ao terminar uma sessao, o backend define endTime, muda o estado para finished, calcula durationMinutes e guarda success, resultSummary, finalNotes e rating.</w:t>
+      </w:r>
+    </w:p>
+    <w:p>
+      <w:pPr>
+        <w:pStyle w:val="ListBullet"/>
+      </w:pPr>
+      <w:r>
+        <w:t>As respostas de sessao devolvem status, durationMinutes, resultSummary, finalNotes e rating para facilitar dashboard e futuro frontend React Native Web.</w:t>
       </w:r>
     </w:p>
     <w:p>
@@ -10010,7 +10050,7 @@
         <w:pStyle w:val="Heading2"/>
       </w:pPr>
       <w:r>
-        <w:t>23.7 FishingSession lifecycle</w:t>
+        <w:t>23.8 Error handling global</w:t>
       </w:r>
     </w:p>
     <w:p>
@@ -10018,7 +10058,7 @@
         <w:pStyle w:val="ListBullet"/>
       </w:pPr>
       <w:r>
-        <w:t>FishingSession passa a ter estado: planned, active e finished.</w:t>
+        <w:t>Implementado GlobalExceptionHandler com @RestControllerAdvice para normalizar erros da API.</w:t>
       </w:r>
     </w:p>
     <w:p>
@@ -10026,7 +10066,7 @@
         <w:pStyle w:val="ListBullet"/>
       </w:pPr>
       <w:r>
-        <w:t>Endpoints implementados: POST /api/sessions/{id}/start e POST /api/sessions/{id}/finish.</w:t>
+        <w:t>Erros de validacao devolvem resposta consistente com timestamp, status, error, message, path e fieldErrors.</w:t>
       </w:r>
     </w:p>
     <w:p>
@@ -10034,7 +10074,7 @@
         <w:pStyle w:val="ListBullet"/>
       </w:pPr>
       <w:r>
-        <w:t>Ao iniciar uma sessao, o backend define startTime quando enviado ou usa a hora atual, e muda o estado para active.</w:t>
+        <w:t>ResponseStatusException dos services passa a devolver mensagens simples sem stack trace.</w:t>
       </w:r>
     </w:p>
     <w:p>
@@ -10042,7 +10082,7 @@
         <w:pStyle w:val="ListBullet"/>
       </w:pPr>
       <w:r>
-        <w:t>Ao terminar uma sessao, o backend define endTime, muda o estado para finished, calcula durationMinutes e guarda success, resultSummary, finalNotes e rating.</w:t>
+        <w:t>JSON mal formado, parametros invalidos, conflitos de base de dados e erros inesperados passam a ter respostas controladas.</w:t>
       </w:r>
     </w:p>
     <w:p>
@@ -10050,7 +10090,7 @@
         <w:pStyle w:val="ListBullet"/>
       </w:pPr>
       <w:r>
-        <w:t>As respostas de sessao devolvem status, durationMinutes, resultSummary, finalNotes e rating para facilitar dashboard e futuro frontend React Native Web.</w:t>
+        <w:t>Configuracao server.error ajustada para nao expor stack traces nas respostas HTTP.</w:t>
       </w:r>
     </w:p>
     <w:p>
@@ -10058,7 +10098,7 @@
         <w:pStyle w:val="Heading2"/>
       </w:pPr>
       <w:r>
-        <w:t>23.8 Error handling global</w:t>
+        <w:t>23.9 Session Review pos-sessao</w:t>
       </w:r>
     </w:p>
     <w:p>
@@ -10066,7 +10106,7 @@
         <w:pStyle w:val="ListBullet"/>
       </w:pPr>
       <w:r>
-        <w:t>Implementado GlobalExceptionHandler com @RestControllerAdvice para normalizar erros da API.</w:t>
+        <w:t>Endpoint implementado: POST /api/recommendations/session-review.</w:t>
       </w:r>
     </w:p>
     <w:p>
@@ -10074,7 +10114,7 @@
         <w:pStyle w:val="ListBullet"/>
       </w:pPr>
       <w:r>
-        <w:t>Erros de validacao devolvem resposta consistente com timestamp, status, error, message, path e fieldErrors.</w:t>
+        <w:t>Endpoint de historico implementado: GET /api/recommendations/sessions/{sessionId}/reviews.</w:t>
       </w:r>
     </w:p>
     <w:p>
@@ -10082,7 +10122,7 @@
         <w:pStyle w:val="ListBullet"/>
       </w:pPr>
       <w:r>
-        <w:t>ResponseStatusException dos services passa a devolver mensagens simples sem stack trace.</w:t>
+        <w:t>O backend monta contexto da sessao com spot, plano associado, WeatherSnapshot, lures usadas, eventos e capturas.</w:t>
       </w:r>
     </w:p>
     <w:p>
@@ -10090,7 +10130,7 @@
         <w:pStyle w:val="ListBullet"/>
       </w:pPr>
       <w:r>
-        <w:t>JSON mal formado, parametros invalidos, conflitos de base de dados e erros inesperados passam a ter respostas controladas.</w:t>
+        <w:t>A resposta devolve summary, whatWorked, whatFailed, bestLure, bestLureReason, observedPattern, nextSessionSuggestion, keyLessons, confidence, warnings e version.</w:t>
       </w:r>
     </w:p>
     <w:p>
@@ -10098,7 +10138,15 @@
         <w:pStyle w:val="ListBullet"/>
       </w:pPr>
       <w:r>
-        <w:t>Configuracao server.error ajustada para nao expor stack traces nas respostas HTTP.</w:t>
+        <w:t>O backend valida que bestLure pertence a usedLures; se a IA inventar uma lure, remove o valor e adiciona warning.</w:t>
+      </w:r>
+    </w:p>
+    <w:p>
+      <w:pPr>
+        <w:pStyle w:val="ListBullet"/>
+      </w:pPr>
+      <w:r>
+        <w:t>O review fica guardado como AiRecommendation com recommendationType SESSION_REVIEW e extraJson para preservar a estrutura completa.</w:t>
       </w:r>
     </w:p>
     <w:p>
@@ -10106,7 +10154,7 @@
         <w:pStyle w:val="Heading2"/>
       </w:pPr>
       <w:r>
-        <w:t>23.9 Session Review pos-sessao</w:t>
+        <w:t>23.10 Dashboard melhorado</w:t>
       </w:r>
     </w:p>
     <w:p>
@@ -10114,7 +10162,7 @@
         <w:pStyle w:val="ListBullet"/>
       </w:pPr>
       <w:r>
-        <w:t>Endpoint implementado: POST /api/recommendations/session-review.</w:t>
+        <w:t>Endpoint existente mantido: GET /api/dashboard.</w:t>
       </w:r>
     </w:p>
     <w:p>
@@ -10122,7 +10170,7 @@
         <w:pStyle w:val="ListBullet"/>
       </w:pPr>
       <w:r>
-        <w:t>Endpoint de historico implementado: GET /api/recommendations/sessions/{sessionId}/reviews.</w:t>
+        <w:t>Dashboard passa a devolver contadores gerais e blocos prontos para o frontend: upcomingPlans, activeSessions, recentSessions, recentCatches e recentWeatherSnapshots.</w:t>
       </w:r>
     </w:p>
     <w:p>
@@ -10130,7 +10178,7 @@
         <w:pStyle w:val="ListBullet"/>
       </w:pPr>
       <w:r>
-        <w:t>O backend monta contexto da sessao com spot, plano associado, WeatherSnapshot, lures usadas, eventos e capturas.</w:t>
+        <w:t>O objetivo e alimentar a primeira vista da app com proximas saidas, sessoes em curso, capturas recentes e meteorologia recente sem obrigar o frontend a fazer varias chamadas.</w:t>
       </w:r>
     </w:p>
     <w:p>
@@ -10138,7 +10186,15 @@
         <w:pStyle w:val="ListBullet"/>
       </w:pPr>
       <w:r>
-        <w:t>A resposta devolve summary, whatWorked, whatFailed, bestLure, bestLureReason, observedPattern, nextSessionSuggestion, keyLessons, confidence, warnings e version.</w:t>
+        <w:t>A implementacao continua simples e usa DTOs especificos para nao expor entidades diretamente.</w:t>
+      </w:r>
+    </w:p>
+    <w:p>
+      <w:pPr>
+        <w:pStyle w:val="Heading2"/>
+      </w:pPr>
+      <w:r>
+        <w:t>23.11 Update/delete endpoints</w:t>
       </w:r>
     </w:p>
     <w:p>
@@ -10146,7 +10202,7 @@
         <w:pStyle w:val="ListBullet"/>
       </w:pPr>
       <w:r>
-        <w:t>O backend valida que bestLure pertence a usedLures; se a IA inventar uma lure, remove o valor e adiciona warning.</w:t>
+        <w:t>Backend passou a suportar update e delete nas entidades principais ja existentes: Fish Species, Lure Library Items, Fishing Plans e Fishing Sessions.</w:t>
       </w:r>
     </w:p>
     <w:p>
@@ -10154,7 +10210,23 @@
         <w:pStyle w:val="ListBullet"/>
       </w:pPr>
       <w:r>
-        <w:t>O review fica guardado como AiRecommendation com recommendationType SESSION_REVIEW e extraJson para preservar a estrutura completa.</w:t>
+        <w:t>Foram adicionadas operacoes de manutencao em recursos filhos: remover lures de um plano, atualizar/remover eventos de sessao, atualizar/remover capturas e atualizar/remover lures usadas numa sessao.</w:t>
+      </w:r>
+    </w:p>
+    <w:p>
+      <w:pPr>
+        <w:pStyle w:val="ListBullet"/>
+      </w:pPr>
+      <w:r>
+        <w:t>As regras da arquitetura mantem-se: controllers chamam services, services validam ownership e existencia, repositories ficam isolados da camada HTTP, e a API continua a responder com DTOs.</w:t>
+      </w:r>
+    </w:p>
+    <w:p>
+      <w:pPr>
+        <w:pStyle w:val="ListBullet"/>
+      </w:pPr>
+      <w:r>
+        <w:t>Deletes devolvem 204 quando bem sucedidos; IDs filhos que nao pertencem ao plano/sessao indicado devolvem 404 para evitar alteracoes cruzadas.</w:t>
       </w:r>
     </w:p>
     <w:p>
@@ -10162,7 +10234,7 @@
         <w:pStyle w:val="Heading2"/>
       </w:pPr>
       <w:r>
-        <w:t>23.10 Dashboard melhorado</w:t>
+        <w:t>23.12 Test coverage inicial</w:t>
       </w:r>
     </w:p>
     <w:p>
@@ -10170,7 +10242,7 @@
         <w:pStyle w:val="ListBullet"/>
       </w:pPr>
       <w:r>
-        <w:t>Endpoint existente mantido: GET /api/dashboard.</w:t>
+        <w:t>Adicionada cobertura unitaria inicial para services criticos sem depender de PostgreSQL, Open-Meteo real ou LM Studio real.</w:t>
       </w:r>
     </w:p>
     <w:p>
@@ -10178,7 +10250,7 @@
         <w:pStyle w:val="ListBullet"/>
       </w:pPr>
       <w:r>
-        <w:t>Dashboard passa a devolver contadores gerais e blocos prontos para o frontend: upcomingPlans, activeSessions, recentSessions, recentCatches e recentWeatherSnapshots.</w:t>
+        <w:t>FishingSessionService passa a ter testes para calculo de duracao atravessando meia-noite, rejeicao de start em sessao finished e finish com resultado/rating.</w:t>
       </w:r>
     </w:p>
     <w:p>
@@ -10186,7 +10258,7 @@
         <w:pStyle w:val="ListBullet"/>
       </w:pPr>
       <w:r>
-        <w:t>O objetivo e alimentar a primeira vista da app com proximas saidas, sessoes em curso, capturas recentes e meteorologia recente sem obrigar o frontend a fazer varias chamadas.</w:t>
+        <w:t>WeatherSnapshotService passa a ter teste para consulta por coordenadas e gravacao dos dados principais do forecast.</w:t>
       </w:r>
     </w:p>
     <w:p>
@@ -10194,7 +10266,15 @@
         <w:pStyle w:val="ListBullet"/>
       </w:pPr>
       <w:r>
-        <w:t>A implementacao continua simples e usa DTOs especificos para nao expor entidades diretamente.</w:t>
+        <w:t>AiRecommendationService passa a ter teste para validar que lures inventadas pelo LLM sao removidas do ranking e geram warning antes da resposta ser devolvida.</w:t>
+      </w:r>
+    </w:p>
+    <w:p>
+      <w:pPr>
+        <w:pStyle w:val="ListBullet"/>
+      </w:pPr>
+      <w:r>
+        <w:t>Suite atual confirmada com ./mvnw test: 14 testes a passar.</w:t>
       </w:r>
     </w:p>
     <w:p>
@@ -10202,7 +10282,7 @@
         <w:pStyle w:val="Heading2"/>
       </w:pPr>
       <w:r>
-        <w:t>23.11 Update/delete endpoints</w:t>
+        <w:t>23.13 Filtros, MockMvc e validacao AI Planner</w:t>
       </w:r>
     </w:p>
     <w:p>
@@ -10210,7 +10290,7 @@
         <w:pStyle w:val="ListBullet"/>
       </w:pPr>
       <w:r>
-        <w:t>Backend passou a suportar update e delete nas entidades principais ja existentes: Fish Species, Lure Library Items, Fishing Plans e Fishing Sessions.</w:t>
+        <w:t>Endpoints principais de listagem passam a aceitar filtros opcionais sem alterar os URLs existentes: spots, fish, lure-library, lure-box/lures, plans e sessions.</w:t>
       </w:r>
     </w:p>
     <w:p>
@@ -10218,7 +10298,7 @@
         <w:pStyle w:val="ListBullet"/>
       </w:pPr>
       <w:r>
-        <w:t>Foram adicionadas operacoes de manutencao em recursos filhos: remover lures de um plano, atualizar/remover eventos de sessao, atualizar/remover capturas e atualizar/remover lures usadas numa sessao.</w:t>
+        <w:t>Filtros implementados na camada service para manter controllers simples e evitar acesso direto a repositories.</w:t>
       </w:r>
     </w:p>
     <w:p>
@@ -10226,7 +10306,7 @@
         <w:pStyle w:val="ListBullet"/>
       </w:pPr>
       <w:r>
-        <w:t>As regras da arquitetura mantem-se: controllers chamam services, services validam ownership e existencia, repositories ficam isolados da camada HTTP, e a API continua a responder com DTOs.</w:t>
+        <w:t>Filtros disponiveis incluem q, waterType, favoriteSpecies, strikeZone, type, difficulty, effectiveness, targetSpecies, brand, libraryItemId, active, condition, minQuantity, spotId, planId, status, success, dateFrom e dateTo conforme o recurso.</w:t>
       </w:r>
     </w:p>
     <w:p>
@@ -10234,7 +10314,23 @@
         <w:pStyle w:val="ListBullet"/>
       </w:pPr>
       <w:r>
-        <w:t>Deletes devolvem 204 quando bem sucedidos; IDs filhos que nao pertencem ao plano/sessao indicado devolvem 404 para evitar alteracoes cruzadas.</w:t>
+        <w:t>AI Planner passou a substituir planA, planB ou planC por fallback seguro quando o texto menciona lures removidas por nao estarem em selectedLures.</w:t>
+      </w:r>
+    </w:p>
+    <w:p>
+      <w:pPr>
+        <w:pStyle w:val="ListBullet"/>
+      </w:pPr>
+      <w:r>
+        <w:t>Adicionados testes MockMvc standalone para validar query params dos endpoints principais e erros de validacao DTO em requests invalidos.</w:t>
+      </w:r>
+    </w:p>
+    <w:p>
+      <w:pPr>
+        <w:pStyle w:val="ListBullet"/>
+      </w:pPr>
+      <w:r>
+        <w:t>Colecao Postman atualizada com requests Search para os principais recursos filtraveis.</w:t>
       </w:r>
     </w:p>
     <w:p>
@@ -10242,7 +10338,7 @@
         <w:pStyle w:val="Heading2"/>
       </w:pPr>
       <w:r>
-        <w:t>23.12 Test coverage inicial</w:t>
+        <w:t>23.14 Listagens paginadas e Lure Box pessoal</w:t>
       </w:r>
     </w:p>
     <w:p>
@@ -10250,7 +10346,7 @@
         <w:pStyle w:val="ListBullet"/>
       </w:pPr>
       <w:r>
-        <w:t>Adicionada cobertura unitaria inicial para services criticos sem depender de PostgreSQL, IPMA real ou LM Studio real.</w:t>
+        <w:t>Endpoints filtraveis passam a devolver PagedResponse com items, totalItems, page, size, totalPages, hasNext e hasPrevious.</w:t>
       </w:r>
     </w:p>
     <w:p>
@@ -10258,7 +10354,7 @@
         <w:pStyle w:val="ListBullet"/>
       </w:pPr>
       <w:r>
-        <w:t>FishingSessionService passa a ter testes para calculo de duracao atravessando meia-noite, rejeicao de start em sessao finished e finish com resultado/rating.</w:t>
+        <w:t>Listagens principais usam DTOs compactos pensados para React Native Web: summaries para spots, fish, lure-library, lure-box, plans e sessions.</w:t>
       </w:r>
     </w:p>
     <w:p>
@@ -10266,7 +10362,7 @@
         <w:pStyle w:val="ListBullet"/>
       </w:pPr>
       <w:r>
-        <w:t>WeatherSnapshotService passa a ter teste para selecao da localidade IPMA mais proxima a partir de latitude/longitude e gravacao dos dados principais do forecast.</w:t>
+        <w:t>Endpoints de detalhe por id continuam a devolver DTOs completos para ecras de detalhe.</w:t>
       </w:r>
     </w:p>
     <w:p>
@@ -10274,7 +10370,7 @@
         <w:pStyle w:val="ListBullet"/>
       </w:pPr>
       <w:r>
-        <w:t>AiRecommendationService passa a ter teste para validar que lures inventadas pelo LLM sao removidas do ranking e geram warning antes da resposta ser devolvida.</w:t>
+        <w:t>Listagens aceitam page, size, sortBy e sortDirection; size e limitado no backend para evitar payloads demasiado grandes.</w:t>
       </w:r>
     </w:p>
     <w:p>
@@ -10282,7 +10378,23 @@
         <w:pStyle w:val="ListBullet"/>
       </w:pPr>
       <w:r>
-        <w:t>Suite atual confirmada com ./mvnw test: 14 testes a passar.</w:t>
+        <w:t>Lure Box passa a representar inventario pessoal e fica tambem disponivel em /api/lure-box, mantendo /api/lures como alias compativel.</w:t>
+      </w:r>
+    </w:p>
+    <w:p>
+      <w:pPr>
+        <w:pStyle w:val="ListBullet"/>
+      </w:pPr>
+      <w:r>
+        <w:t>Lure Box inclui campos pessoais: active, quantity, condition, personalNotes, favoriteForSpecies e favoriteForSpot.</w:t>
+      </w:r>
+    </w:p>
+    <w:p>
+      <w:pPr>
+        <w:pStyle w:val="ListBullet"/>
+      </w:pPr>
+      <w:r>
+        <w:t>Biblioteca geral de lures continua separada em /api/lure-library e descreve tipos/modelos de amostras, nao inventario pessoal.</w:t>
       </w:r>
     </w:p>
     <w:p>
@@ -10290,7 +10402,7 @@
         <w:pStyle w:val="Heading2"/>
       </w:pPr>
       <w:r>
-        <w:t>23.13 Filtros, MockMvc e validacao AI Planner</w:t>
+        <w:t>23.15 Repository pagination, recommendation versioning e Confidence System</w:t>
       </w:r>
     </w:p>
     <w:p>
@@ -10298,7 +10410,7 @@
         <w:pStyle w:val="ListBullet"/>
       </w:pPr>
       <w:r>
-        <w:t>Endpoints principais de listagem passam a aceitar filtros opcionais sem alterar os URLs existentes: spots, fish, lure-library, lure-box/lures, plans e sessions.</w:t>
+        <w:t>Filtros, paginacao e ordenacao dos endpoints principais passaram para a base de dados usando JpaSpecificationExecutor, Specifications e Pageable.</w:t>
       </w:r>
     </w:p>
     <w:p>
@@ -10306,7 +10418,7 @@
         <w:pStyle w:val="ListBullet"/>
       </w:pPr>
       <w:r>
-        <w:t>Filtros implementados na camada service para manter controllers simples e evitar acesso direto a repositories.</w:t>
+        <w:t>Services continuam a construir a logica de pesquisa; controllers mantem-se apenas como camada HTTP e repositories continuam isolados da API.</w:t>
       </w:r>
     </w:p>
     <w:p>
@@ -10314,7 +10426,7 @@
         <w:pStyle w:val="ListBullet"/>
       </w:pPr>
       <w:r>
-        <w:t>Filtros disponiveis incluem q, waterType, favoriteSpecies, strikeZone, type, difficulty, effectiveness, targetSpecies, brand, libraryItemId, active, condition, minQuantity, spotId, planId, status, success, dateFrom e dateTo conforme o recurso.</w:t>
+        <w:t>AI recommendations ficam versionadas por tipo: PLAN, SESSION_ADJUSTMENT e SESSION_REVIEW.</w:t>
       </w:r>
     </w:p>
     <w:p>
@@ -10322,7 +10434,7 @@
         <w:pStyle w:val="ListBullet"/>
       </w:pPr>
       <w:r>
-        <w:t>AI Planner passou a substituir planA, planB ou planC por fallback seguro quando o texto menciona lures removidas por nao estarem em selectedLures.</w:t>
+        <w:t>Cada nova recomendacao marca versoes anteriores do mesmo tipo/contexto como latest=false e guarda supersededAt, mantendo historico consultavel.</w:t>
       </w:r>
     </w:p>
     <w:p>
@@ -10330,7 +10442,7 @@
         <w:pStyle w:val="ListBullet"/>
       </w:pPr>
       <w:r>
-        <w:t>Adicionados testes MockMvc standalone para validar query params dos endpoints principais e erros de validacao DTO em requests invalidos.</w:t>
+        <w:t>Foram adicionados endpoints latest para plano, ajustes de sessao e reviews: /api/recommendations/plans/{planId}/latest, /api/recommendations/sessions/{sessionId}/adjustments/latest e /api/recommendations/sessions/{sessionId}/reviews/latest.</w:t>
       </w:r>
     </w:p>
     <w:p>
@@ -10338,7 +10450,15 @@
         <w:pStyle w:val="ListBullet"/>
       </w:pPr>
       <w:r>
-        <w:t>Colecao Postman atualizada com requests Search para os principais recursos filtraveis.</w:t>
+        <w:t>Respostas normais incluem version, latest, confidence, confidenceScore e confidenceReason; contextJson/rawResponse continuam apenas no endpoint de debug.</w:t>
+      </w:r>
+    </w:p>
+    <w:p>
+      <w:pPr>
+        <w:pStyle w:val="ListBullet"/>
+      </w:pPr>
+      <w:r>
+        <w:t>Confidence System passou a ser calculado no backend com base em weather, lures selecionadas, match com especie/tipo de agua, historico recente, eventos, capturas, rating e dados em falta.</w:t>
       </w:r>
     </w:p>
     <w:p>
@@ -10346,7 +10466,7 @@
         <w:pStyle w:val="Heading2"/>
       </w:pPr>
       <w:r>
-        <w:t>23.14 Listagens paginadas e Lure Box pessoal</w:t>
+        <w:t>23.16 Projection queries, execution tracking e analytics basicos</w:t>
       </w:r>
     </w:p>
     <w:p>
@@ -10354,7 +10474,7 @@
         <w:pStyle w:val="ListBullet"/>
       </w:pPr>
       <w:r>
-        <w:t>Endpoints filtraveis passam a devolver PagedResponse com items, totalItems, page, size, totalPages, hasNext e hasPrevious.</w:t>
+        <w:t>Listagens principais passam a usar query projection para devolver DTOs de resumo diretamente, evitando carregar entidades completas em ecras de lista.</w:t>
       </w:r>
     </w:p>
     <w:p>
@@ -10362,7 +10482,7 @@
         <w:pStyle w:val="ListBullet"/>
       </w:pPr>
       <w:r>
-        <w:t>Listagens principais usam DTOs compactos pensados para React Native Web: summaries para spots, fish, lure-library, lure-box, plans e sessions.</w:t>
+        <w:t>Foram adicionados indices JPA nas colunas mais usadas em filtros, ordenacao, joins, historico AI, sessoes, capturas, weather e tracking.</w:t>
       </w:r>
     </w:p>
     <w:p>
@@ -10370,7 +10490,7 @@
         <w:pStyle w:val="ListBullet"/>
       </w:pPr>
       <w:r>
-        <w:t>Endpoints de detalhe por id continuam a devolver DTOs completos para ecras de detalhe.</w:t>
+        <w:t>Foi criada a entidade RecommendationExecution para registar se o utilizador seguiu PLAN_A, PLAN_B, PLAN_C ou um ajuste de sessao, incluindo resultado, sucesso, rating, janela temporal e notas.</w:t>
       </w:r>
     </w:p>
     <w:p>
@@ -10378,7 +10498,7 @@
         <w:pStyle w:val="ListBullet"/>
       </w:pPr>
       <w:r>
-        <w:t>Listagens aceitam page, size, sortBy e sortDirection; size e limitado no backend para evitar payloads demasiado grandes.</w:t>
+        <w:t>Endpoints de tracking implementados: POST/GET /api/recommendations/{recommendationId}/executions, GET /api/plans/{planId}/recommendation-executions e GET /api/sessions/{sessionId}/recommendation-executions.</w:t>
       </w:r>
     </w:p>
     <w:p>
@@ -10386,7 +10506,7 @@
         <w:pStyle w:val="ListBullet"/>
       </w:pPr>
       <w:r>
-        <w:t>Lure Box passa a representar inventario pessoal e fica tambem disponivel em /api/lure-box, mantendo /api/lures como alias compativel.</w:t>
+        <w:t>Foi adicionado GET /api/analytics/summary com contadores e metricas basicas: sucesso de sessoes, capturas, media de rating, performance por especie/spot, uso de lures e performance das recomendacoes executadas.</w:t>
       </w:r>
     </w:p>
     <w:p>
@@ -10394,7 +10514,243 @@
         <w:pStyle w:val="ListBullet"/>
       </w:pPr>
       <w:r>
-        <w:t>Lure Box inclui campos pessoais: active, quantity, condition, personalNotes, favoriteForSpecies e favoriteForSpot.</w:t>
+        <w:t>Postman foi atualizado com grupos Recommendation Execution Tracking e Analytics.</w:t>
+      </w:r>
+    </w:p>
+    <w:p>
+      <w:pPr>
+        <w:pStyle w:val="Heading2"/>
+      </w:pPr>
+      <w:r>
+        <w:t>23.17 Flyway migrations e confidence por execucao</w:t>
+      </w:r>
+    </w:p>
+    <w:p>
+      <w:r>
+        <w:t>Backend passou a usar Flyway para controlar a evolucao do schema da base de dados.</w:t>
+      </w:r>
+    </w:p>
+    <w:p>
+      <w:r>
+        <w:t>Foi adicionada a primeira migration em db/migration/V1__initial_schema.sql com tabelas, relacoes e indices principais do MVP atual.</w:t>
+      </w:r>
+    </w:p>
+    <w:p>
+      <w:r>
+        <w:t>A configuracao JPA mudou de ddl-auto update para validate, deixando de alterar a base automaticamente em runtime.</w:t>
+      </w:r>
+    </w:p>
+    <w:p>
+      <w:r>
+        <w:t>Flyway usa baseline-on-migrate para permitir continuar a trabalhar com bases locais que ja tinham sido criadas antes desta mudanca.</w:t>
+      </w:r>
+    </w:p>
+    <w:p>
+      <w:r>
+        <w:t>RecommendationExecution passou a alimentar o Confidence System: novas recomendacoes consideram execucoes anteriores do mesmo plano, spot/especie ou sessao quando calculam confidenceScore e confidenceReason.</w:t>
+      </w:r>
+    </w:p>
+    <w:p>
+      <w:r>
+        <w:t>As respostas de recomendacao tambem refletem feedback de execucao da propria recomendacao quando existem registos associados, permitindo perceber se o utilizador seguiu o plano e se resultou.</w:t>
+      </w:r>
+    </w:p>
+    <w:p>
+      <w:r>
+        <w:t>O objetivo e tornar a IA progressivamente mais util sem adicionar complexidade visual ao produto.</w:t>
+      </w:r>
+    </w:p>
+    <w:p>
+      <w:pPr>
+        <w:pStyle w:val="Heading2"/>
+      </w:pPr>
+      <w:r>
+        <w:t>23.18 Dashboard acionavel para primeira vista</w:t>
+      </w:r>
+    </w:p>
+    <w:p>
+      <w:r>
+        <w:t>GET /api/dashboard passa a devolver blocos mais prontos para o futuro frontend React Native Web.</w:t>
+      </w:r>
+    </w:p>
+    <w:p>
+      <w:r>
+        <w:t>O dashboard inclui proxima sessao planeada, sessoes ativas, ultimos resultados, melhor lure recente, taxa de sucesso, weather snapshot relevante e recomendacoes pendentes para avaliar.</w:t>
+      </w:r>
+    </w:p>
+    <w:p>
+      <w:r>
+        <w:t>nextPlannedSession escolhe a proxima FishingSession planned quando existir; caso contrario usa o proximo FishingPlan como fallback util.</w:t>
+      </w:r>
+    </w:p>
+    <w:p>
+      <w:r>
+        <w:t>bestRecentLure e calculada a partir de lures usadas recentemente em sessoes, priorizando sucesso e frequencia de uso.</w:t>
+      </w:r>
+    </w:p>
+    <w:p>
+      <w:r>
+        <w:t>relevantWeatherSnapshot tenta usar weather ligado a proxima sessao/plano e so depois cai no snapshot mais recente disponivel.</w:t>
+      </w:r>
+    </w:p>
+    <w:p>
+      <w:r>
+        <w:t>pendingRecommendations lista recomendacoes latest que ainda nao tem RecommendationExecution, para incentivar o utilizador a fechar o ciclo Planear -&gt; Pescar -&gt; Aprender.</w:t>
+      </w:r>
+    </w:p>
+    <w:p>
+      <w:r>
+        <w:t>Os campos antigos do dashboard foram mantidos para compatibilidade; os novos campos sao aditivos e pensados para uma UI simples.</w:t>
+      </w:r>
+    </w:p>
+    <w:p>
+      <w:pPr>
+        <w:pStyle w:val="Heading2"/>
+      </w:pPr>
+      <w:r>
+        <w:t>23.19 Insights praticos e analytics filtraveis</w:t>
+      </w:r>
+    </w:p>
+    <w:p>
+      <w:r>
+        <w:t>Foram adicionados endpoints simples em /api/insights para transformar o historico em decisoes praticas, sem criar dashboards grandes ou confusos.</w:t>
+      </w:r>
+    </w:p>
+    <w:p>
+      <w:r>
+        <w:t>Endpoints implementados: GET /api/insights/top-lures, GET /api/insights/best-spots, GET /api/insights/best-conditions e GET /api/insights/recommendation-performance.</w:t>
+      </w:r>
+    </w:p>
+    <w:p>
+      <w:r>
+        <w:t>Os filtros suportados sao dateFrom, dateTo, species, spotId, lureId e limit. Recommendation performance tambem aceita recommendationType.</w:t>
+      </w:r>
+    </w:p>
+    <w:p>
+      <w:r>
+        <w:t>Top lures prioriza lures usadas em sessoes com sucesso, total de capturas, frequencia e data mais recente.</w:t>
+      </w:r>
+    </w:p>
+    <w:p>
+      <w:r>
+        <w:t>Best spots e best conditions usam sessoes, capturas, sucesso, rating e weather snapshots ligados a sessoes para mostrar apenas padroes acionaveis.</w:t>
+      </w:r>
+    </w:p>
+    <w:p>
+      <w:r>
+        <w:t>Recommendation performance usa RecommendationExecution para perceber que tipos/passos de recomendacao foram seguidos e quais resultaram melhor.</w:t>
+      </w:r>
+    </w:p>
+    <w:p>
+      <w:r>
+        <w:t>Postman foi atualizado com grupo Insights para testar estes endpoints rapidamente.</w:t>
+      </w:r>
+    </w:p>
+    <w:p>
+      <w:pPr>
+        <w:pStyle w:val="Heading2"/>
+      </w:pPr>
+      <w:r>
+        <w:t>23.20 Frontend readiness: options e erros de API</w:t>
+      </w:r>
+    </w:p>
+    <w:p>
+      <w:r>
+        <w:t>Foi adicionada uma camada simples para preparar o backend para React Native Web, sem alterar os endpoints principais nem o health endpoint.</w:t>
+      </w:r>
+    </w:p>
+    <w:p>
+      <w:r>
+        <w:t>Novo grupo de endpoints: GET /api/options para devolver todas as opcoes de combobox/dropdown numa unica chamada.</w:t>
+      </w:r>
+    </w:p>
+    <w:p>
+      <w:r>
+        <w:t>Tambem existem endpoints individuais em /api/options/water-types, /water-clarities, /water-levels, /lure-types, /lure-difficulties, /lure-effectiveness-levels, /lure-conditions, /fish-strike-zones, /session-statuses, /session-event-types, /recommendation-types, /recommendation-steps, /recommendation-results e /sort-directions.</w:t>
+      </w:r>
+    </w:p>
+    <w:p>
+      <w:r>
+        <w:t>As opcoes devolvem objetos simples { value, label }, com value pensado para enviar de volta ao backend e label pensado para mostrar na UI.</w:t>
+      </w:r>
+    </w:p>
+    <w:p>
+      <w:r>
+        <w:t>Dashboard, Insights, Plans e Sessions continuam a devolver DTOs pensados para ecras mobile/web: summaries paginados nas listagens e detalhe apenas quando necessario.</w:t>
+      </w:r>
+    </w:p>
+    <w:p>
+      <w:r>
+        <w:t>O payload de erro passou a incluir code estavel alem de message, status, path e fieldErrors, para o frontend conseguir mostrar feedback claro e tratar casos como VALIDATION_FAILED, INVALID_QUERY_PARAMETER, NOT_FOUND e CONFLICT.</w:t>
+      </w:r>
+    </w:p>
+    <w:p>
+      <w:r>
+        <w:t>Postman foi atualizado com grupo Frontend Options.</w:t>
+      </w:r>
+    </w:p>
+    <w:p>
+      <w:pPr>
+        <w:pStyle w:val="Heading2"/>
+      </w:pPr>
+      <w:r>
+        <w:t>23.21 Documentacao de handoff para frontend</w:t>
+      </w:r>
+    </w:p>
+    <w:p>
+      <w:r>
+        <w:t>README.md foi atualizado para refletir o estado real do backend MVP, stack atual, comandos locais, arquitetura, principais grupos de endpoints, Postman, demo data e direcao de frontend React Native Web.</w:t>
+      </w:r>
+    </w:p>
+    <w:p>
+      <w:r>
+        <w:t>A colecao Postman continua atualizada com grupos para Health, Dashboard, Catch Gallery, Frontend Options, Spots, Fish Library, Lure Library, Lure Box, Plans, Sessions, AI Recommendations, Recommendation Execution Tracking, Analytics, Insights, Weather Snapshots e Weather Locations.</w:t>
+      </w:r>
+    </w:p>
+    <w:p>
+      <w:r>
+        <w:t>O backend esta documentado o suficiente para iniciar o frontend sem depender de conhecimento oral: o docx continua a ser a especificacao principal, o README serve como entrada tecnica rapida e o Postman serve para testar a API.</w:t>
+      </w:r>
+    </w:p>
+    <w:p>
+      <w:r>
+        <w:t>Contrato frontend: o menu principal deve ter um icon/entrada para Galeria; ao tocar numa foto/cartao, o frontend deve navegar para a sessao indicada por sessionId e destacar/abrir a captura indicada por catchId. A galeria tambem mostra a lure da biblioteca usada quando essa associacao existir.</w:t>
+      </w:r>
+    </w:p>
+    <w:p>
+      <w:r>
+        <w:t>Endpoint implementado: GET /api/gallery/catches devolve PagedResponse com itens compactos da galeria, incluindo catchId, sessionId, data da sessao, spot, especie, quantidade, medidas, released, foto, sucesso/rating da sessao e, opcionalmente, lureLibraryItemId, lureName e lureImageUrl.</w:t>
+      </w:r>
+    </w:p>
+    <w:p>
+      <w:r>
+        <w:t>Backend implementado: Catch aceita photoUrl, photoThumbnailUrl, photoCaption e uma associacao opcional a LureLibraryItem. CreateCatchRequest e CatchResponse usam DTOs e validam a existencia da lure selecionada.</w:t>
+      </w:r>
+    </w:p>
+    <w:p>
+      <w:pPr>
+        <w:pStyle w:val="Heading2"/>
+      </w:pPr>
+      <w:r>
+        <w:t>23.22 Catch Gallery e fotos de capturas</w:t>
+      </w:r>
+    </w:p>
+    <w:p>
+      <w:r>
+        <w:t>A galeria visual foi implementada no frontend React Native Web com grid de capturas, detalhe com imagem em destaque, tamanho, peso opcional, sessao e spot. A quantidade e outros campos internos nao aparecem no detalhe normal, e nao existe uma secao de videos.</w:t>
+      </w:r>
+    </w:p>
+    <w:p>
+      <w:r>
+        <w:t>O utilizador pode criar, editar e apagar capturas. Ao criar/editar, escolhe a especie da biblioteca de peixes, a lure da biblioteca de lures e a sessao associada em comboboxes; a lure selecionada aparece em miniatura na captura. A foto continua a ser tratada como URL/metadado ate existir upload binario gerido pelo backend.</w:t>
+      </w:r>
+    </w:p>
+    <w:p>
+      <w:pPr>
+        <w:pStyle w:val="Heading2"/>
+      </w:pPr>
+      <w:r>
+        <w:t>23.23 Frontend React Native Web shell inicial</w:t>
       </w:r>
     </w:p>
     <w:p>
@@ -10402,7 +10758,55 @@
         <w:pStyle w:val="ListBullet"/>
       </w:pPr>
       <w:r>
-        <w:t>Biblioteca geral de lures continua separada em /api/lure-library e descreve tipos/modelos de amostras, nao inventario pessoal.</w:t>
+        <w:t>Frontend inicial implementado em frontend/src/App.jsx usando primitivos React Native Web, mantendo Vite como host local e alias react-native -&gt; react-native-web.</w:t>
+      </w:r>
+    </w:p>
+    <w:p>
+      <w:pPr>
+        <w:pStyle w:val="ListBullet"/>
+      </w:pPr>
+      <w:r>
+        <w:t>Menu principal implementado com Dashboard, Galeria, Spots, Weather, Planos, Sessao, Lure Box, Biblioteca e Perfil.</w:t>
+      </w:r>
+    </w:p>
+    <w:p>
+      <w:pPr>
+        <w:pStyle w:val="ListBullet"/>
+      </w:pPr>
+      <w:r>
+        <w:t>Menu usa icons estaticos de frontend/assets/images/ui, incluindo dashboard-icon.png, gallery-icon.png, spots-icon.png, weather-icon.png, fishingplan-icon.png, session-icon.png, lurebox-icon.png, library-icon.png e profile-icon.png.</w:t>
+      </w:r>
+    </w:p>
+    <w:p>
+      <w:pPr>
+        <w:pStyle w:val="ListBullet"/>
+      </w:pPr>
+      <w:r>
+        <w:t>Topo da app usa o app icon como marca sem moldura branca extra; eventuais margens dos assets sao tratadas por crop/scale no estilo do componente, sem alterar os ficheiros originais.</w:t>
+      </w:r>
+    </w:p>
+    <w:p>
+      <w:pPr>
+        <w:pStyle w:val="ListBullet"/>
+      </w:pPr>
+      <w:r>
+        <w:t>Dashboard inicial consome GET /api/health e GET /api/dashboard; quando o backend nao esta disponivel, mostra uma vista de exemplo para permitir trabalhar o layout.</w:t>
+      </w:r>
+    </w:p>
+    <w:p>
+      <w:pPr>
+        <w:pStyle w:val="ListBullet"/>
+      </w:pPr>
+      <w:r>
+        <w:t>Foi adicionado switch PT/EN funcional no fundo da sidebar. Nesta fase, a traducao e local ao cliente e cobre os textos principais da shell inicial.</w:t>
+      </w:r>
+    </w:p>
+    <w:p>
+      <w:pPr>
+        <w:pStyle w:val="ListBullet"/>
+      </w:pPr>
+      <w:r>
+        <w:t>O frontend React Native Web ja possui fluxos visuais para Dashboard, Galeria, Spots, Weather, Planos, Sessao, Lure Box, Biblioteca e Perfil, consumindo os DTOs compactos e options endpoints. O proximo trabalho deve continuar a validar os fluxos completos e a refinar apenas as interacoes necessarias.</w:t>
       </w:r>
     </w:p>
     <w:p>
@@ -10410,7 +10814,51 @@
         <w:pStyle w:val="Heading2"/>
       </w:pPr>
       <w:r>
-        <w:t>23.15 Repository pagination, recommendation versioning e Confidence System</w:t>
+        <w:t>23.24 Biblioteca e Galeria visual no frontend</w:t>
+      </w:r>
+    </w:p>
+    <w:p>
+      <w:pPr/>
+      <w:r>
+        <w:t>A Biblioteca visual foi implementada em React Native Web com um seletor entre Biblioteca de peixes e Biblioteca de lures. Os registos aparecem numa grelha visual de tres colunas, com imagem, resumo e acesso a detalhe.</w:t>
+      </w:r>
+    </w:p>
+    <w:p>
+      <w:pPr/>
+      <w:r>
+        <w:t>Na Biblioteca de peixes, o utilizador pode criar, editar e apagar especies, escolher a imagem, classificar de forma evidente entre agua doce e agua salgada e preencher zonas de ataque, zonas comuns e lures favoritas a partir de opcoes existentes.</w:t>
+      </w:r>
+    </w:p>
+    <w:p>
+      <w:pPr/>
+      <w:r>
+        <w:t>Na Biblioteca de lures, o utilizador pode criar, editar e apagar entradas, escolher a imagem, selecionar dificuldade e eficacia por comboboxes com barras visuais e associar manualmente um unico icone de acao a uma imagem grande de referencia.</w:t>
+      </w:r>
+    </w:p>
+    <w:p>
+      <w:pPr/>
+      <w:r>
+        <w:t>A Galeria visual permite criar, editar e apagar capturas. O botao Nova captura fica centrado entre o cabecalho e os cards; ao abrir uma captura, a imagem ocupa o destaque principal e os dados ficam reduzidos a tamanho, peso opcional, sessao, spot e lure usada.</w:t>
+      </w:r>
+    </w:p>
+    <w:p>
+      <w:pPr/>
+      <w:r>
+        <w:t>A barra de pesquisa foi removida da Biblioteca e a apresentacao visual privilegia filtros de ambiente, troca entre catalogos, imagens e paginacao simples. O backend continua a suportar filtros e ordenacao para futuros ecras mais avancados.</w:t>
+      </w:r>
+    </w:p>
+    <w:p>
+      <w:pPr>
+        <w:pStyle w:val="Heading2"/>
+      </w:pPr>
+      <w:r>
+        <w:t>23.25 Plans e AI Planner no frontend</w:t>
+      </w:r>
+    </w:p>
+    <w:p>
+      <w:pPr/>
+      <w:r>
+        <w:t>A pagina de Planos foi implementada no frontend React Native Web como um ecrã operacional para criar, consultar e abrir planos de pesca.</w:t>
       </w:r>
     </w:p>
     <w:p>
@@ -10418,7 +10866,7 @@
         <w:pStyle w:val="ListBullet"/>
       </w:pPr>
       <w:r>
-        <w:t>Filtros, paginacao e ordenacao dos endpoints principais passaram para a base de dados usando JpaSpecificationExecutor, Specifications e Pageable.</w:t>
+        <w:t>A pesquisa textual foi removida da pagina de Planos para manter o foco no planeamento e reduzir ruido visual.</w:t>
       </w:r>
     </w:p>
     <w:p>
@@ -10426,7 +10874,7 @@
         <w:pStyle w:val="ListBullet"/>
       </w:pPr>
       <w:r>
-        <w:t>Services continuam a construir a logica de pesquisa; controllers mantem-se apenas como camada HTTP e repositories continuam isolados da API.</w:t>
+        <w:t>O header mostra o total de planos num contador quadrado consistente com os headers de Spots e Lure Box.</w:t>
       </w:r>
     </w:p>
     <w:p>
@@ -10434,7 +10882,7 @@
         <w:pStyle w:val="ListBullet"/>
       </w:pPr>
       <w:r>
-        <w:t>AI recommendations ficam versionadas por tipo: PLAN, SESSION_ADJUSTMENT e SESSION_REVIEW.</w:t>
+        <w:t>O header apresenta um destaque visual Powered by AI para comunicar que o planeamento A/B/C usa o AI Planner local.</w:t>
       </w:r>
     </w:p>
     <w:p>
@@ -10442,7 +10890,7 @@
         <w:pStyle w:val="ListBullet"/>
       </w:pPr>
       <w:r>
-        <w:t>Cada nova recomendacao marca versoes anteriores do mesmo tipo/contexto como latest=false e guarda supersededAt, mantendo historico consultavel.</w:t>
+        <w:t>O formulario permite escolher data e hora, uma ou varias especies da biblioteca, todas as especies, lures selecionadas ou a Lure Box completa.</w:t>
       </w:r>
     </w:p>
     <w:p>
@@ -10450,7 +10898,15 @@
         <w:pStyle w:val="ListBullet"/>
       </w:pPr>
       <w:r>
-        <w:t>Foram adicionados endpoints latest para plano, ajustes de sessao e reviews: /api/recommendations/plans/{planId}/latest, /api/recommendations/sessions/{sessionId}/adjustments/latest e /api/recommendations/sessions/{sessionId}/reviews/latest.</w:t>
+        <w:t>O detalhe do plano separa contexto da saida, leitura da IA, confidence, estrategia A/B/C, lures recomendadas e pontos de atencao; o utilizador pode guardar a recomendacao gerada.</w:t>
+      </w:r>
+    </w:p>
+    <w:p>
+      <w:pPr>
+        <w:pStyle w:val="Heading2"/>
+      </w:pPr>
+      <w:r>
+        <w:t>23.26 Open-Meteo e localidades por coordenadas</w:t>
       </w:r>
     </w:p>
     <w:p>
@@ -10458,7 +10914,7 @@
         <w:pStyle w:val="ListBullet"/>
       </w:pPr>
       <w:r>
-        <w:t>Respostas normais incluem version, latest, confidence, confidenceScore e confidenceReason; contextJson/rawResponse continuam apenas no endpoint de debug.</w:t>
+        <w:t>A integracao meteorologica atual usa Open-Meteo como fornecedor externo, substituindo a integracao anterior com IPMA.</w:t>
       </w:r>
     </w:p>
     <w:p>
@@ -10466,7 +10922,49 @@
         <w:pStyle w:val="ListBullet"/>
       </w:pPr>
       <w:r>
-        <w:t>Confidence System passou a ser calculado no backend com base em weather, lures selecionadas, match com especie/tipo de agua, historico recente, eventos, capturas, rating e dados em falta.</w:t>
+        <w:t>O endpoint GET /api/weather-locations/search pesquisa cidades, vilas e codigos postais, com countryCode=PT por defeito, e devolve nome, coordenadas, elevacao, timezone e contexto administrativo quando disponivel.</w:t>
+      </w:r>
+    </w:p>
+    <w:p>
+      <w:pPr>
+        <w:pStyle w:val="ListBullet"/>
+      </w:pPr>
+      <w:r>
+        <w:t>Os endpoints POST /api/weather-snapshots/coordinates e POST /api/weather-snapshots/location criam snapshots sem limitar o utilizador a distritos. Planos e sessoes continuam a criar snapshots automaticamente a partir das coordenadas do spot.</w:t>
+      </w:r>
+    </w:p>
+    <w:p>
+      <w:pPr>
+        <w:pStyle w:val="ListBullet"/>
+      </w:pPr>
+      <w:r>
+        <w:t>Cada snapshot guarda dados atuais, previsao diaria e previsao horaria, incluindo temperatura, temperatura aparente, humidade, precipitacao, probabilidade de chuva, pressao, cobertura de nuvens, vento, rajadas, nascer do sol e por-do-sol.</w:t>
+      </w:r>
+    </w:p>
+    <w:p>
+      <w:pPr>
+        <w:pStyle w:val="ListBullet"/>
+      </w:pPr>
+      <w:r>
+        <w:t>A previsao horaria do dia escolhido e devolvida ao frontend em hourlyForecast e tambem e guardada no snapshot para manter o contexto usado pelo AI Planner.</w:t>
+      </w:r>
+    </w:p>
+    <w:p>
+      <w:pPr>
+        <w:pStyle w:val="Heading1"/>
+      </w:pPr>
+      <w:r>
+        <w:t>24. Roadmap backend restante</w:t>
+      </w:r>
+    </w:p>
+    <w:p>
+      <w:r>
+        <w:t>24.1 Prioridade alta</w:t>
+      </w:r>
+    </w:p>
+    <w:p>
+      <w:r>
+        <w:t>Ligar os endpoints de insights ja implementados ao futuro frontend de forma seletiva, mantendo apenas metricas uteis para decisao rapida.</w:t>
       </w:r>
     </w:p>
     <w:p>
@@ -10474,55 +10972,42 @@
         <w:pStyle w:val="Heading2"/>
       </w:pPr>
       <w:r>
-        <w:t>23.16 Projection queries, execution tracking e analytics basicos</w:t>
-      </w:r>
-    </w:p>
-    <w:p>
-      <w:pPr>
-        <w:pStyle w:val="ListBullet"/>
-      </w:pPr>
-      <w:r>
-        <w:t>Listagens principais passam a usar query projection para devolver DTOs de resumo diretamente, evitando carregar entidades completas em ecras de lista.</w:t>
-      </w:r>
-    </w:p>
-    <w:p>
-      <w:pPr>
-        <w:pStyle w:val="ListBullet"/>
-      </w:pPr>
-      <w:r>
-        <w:t>Foram adicionados indices JPA nas colunas mais usadas em filtros, ordenacao, joins, historico AI, sessoes, capturas, weather e tracking.</w:t>
-      </w:r>
-    </w:p>
-    <w:p>
-      <w:pPr>
-        <w:pStyle w:val="ListBullet"/>
-      </w:pPr>
-      <w:r>
-        <w:t>Foi criada a entidade RecommendationExecution para registar se o utilizador seguiu PLAN_A, PLAN_B, PLAN_C ou um ajuste de sessao, incluindo resultado, sucesso, rating, janela temporal e notas.</w:t>
-      </w:r>
-    </w:p>
-    <w:p>
-      <w:pPr>
-        <w:pStyle w:val="ListBullet"/>
-      </w:pPr>
-      <w:r>
-        <w:t>Endpoints de tracking implementados: POST/GET /api/recommendations/{recommendationId}/executions, GET /api/plans/{planId}/recommendation-executions e GET /api/sessions/{sessionId}/recommendation-executions.</w:t>
-      </w:r>
-    </w:p>
-    <w:p>
-      <w:pPr>
-        <w:pStyle w:val="ListBullet"/>
-      </w:pPr>
-      <w:r>
-        <w:t>Foi adicionado GET /api/analytics/summary com contadores e metricas basicas: sucesso de sessoes, capturas, media de rating, performance por especie/spot, uso de lures e performance das recomendacoes executadas.</w:t>
-      </w:r>
-    </w:p>
-    <w:p>
-      <w:pPr>
-        <w:pStyle w:val="ListBullet"/>
-      </w:pPr>
-      <w:r>
-        <w:t>Postman foi atualizado com grupos Recommendation Execution Tracking e Analytics.</w:t>
+        <w:t>A galeria visual de capturas ja foi implementada no frontend. O trabalho restante nesta area e substituir data URLs/metadados por upload e storage de ficheiros geridos pelo backend quando a app passar a usar fotos reais em maior escala.</w:t>
+      </w:r>
+    </w:p>
+    <w:p>
+      <w:r>
+        <w:t>A galeria usa GET /api/gallery/catches, com filtros simples ja suportados no backend por texto, especie, spot, sessao, datas, released, sucesso da sessao e withPhotoOnly. Os itens incluem a lure da biblioteca quando registada.</w:t>
+      </w:r>
+    </w:p>
+    <w:p>
+      <w:r>
+        <w:t>Completar suporte real a uploads de fotos de capturas: o backend ja guarda photoUrl, photoThumbnailUrl e photoCaption em Catch, mas ainda falta implementar storage/upload de ficheiros quando o frontend existir.</w:t>
+      </w:r>
+    </w:p>
+    <w:p>
+      <w:r>
+        <w:t>Estrutura atual de imagens do frontend: frontend/assets/images/brand, fish/freshwater, fish/saltwater, lures, lure-actions, lure-action-icons, placeholders, spots, ui e weather.</w:t>
+      </w:r>
+    </w:p>
+    <w:p>
+      <w:r>
+        <w:t>Assets estaticos do frontend devem seguir nomes lowercase-kebab-case para facilitar imports em React Native Web, por exemplo black-bass.png, sea-bass.png, clear-sky.png e app-icon.png.</w:t>
+      </w:r>
+    </w:p>
+    <w:p>
+      <w:r>
+        <w:t>Separar imagens estaticas de catalogo e fotos do utilizador: imagens de lures/especies/spots podem ficar em frontend/assets; fotos de capturas reais nao devem ficar nos assets do frontend, devem ser geridas como uploads.</w:t>
+      </w:r>
+    </w:p>
+    <w:p>
+      <w:r>
+        <w:t>Continuar a calibrar o Confidence System com dados reais: sucesso por lure, especie, spot, weather, execucao seguida e resultado final da sessao.</w:t>
+      </w:r>
+    </w:p>
+    <w:p>
+      <w:r>
+        <w:t>Validar o fluxo completo Planear -&gt; Pescar -&gt; Aprender no frontend real e ajustar apenas payloads que causarem chamadas redundantes.</w:t>
       </w:r>
     </w:p>
     <w:p>
@@ -10530,42 +11015,22 @@
         <w:pStyle w:val="Heading2"/>
       </w:pPr>
       <w:r>
-        <w:t>23.17 Flyway migrations e confidence por execucao</w:t>
-      </w:r>
-    </w:p>
-    <w:p>
-      <w:r>
-        <w:t>Backend passou a usar Flyway para controlar a evolucao do schema da base de dados.</w:t>
-      </w:r>
-    </w:p>
-    <w:p>
-      <w:r>
-        <w:t>Foi adicionada a primeira migration em db/migration/V1__initial_schema.sql com tabelas, relacoes e indices principais do MVP atual.</w:t>
-      </w:r>
-    </w:p>
-    <w:p>
-      <w:r>
-        <w:t>A configuracao JPA mudou de ddl-auto update para validate, deixando de alterar a base automaticamente em runtime.</w:t>
-      </w:r>
-    </w:p>
-    <w:p>
-      <w:r>
-        <w:t>Flyway usa baseline-on-migrate para permitir continuar a trabalhar com bases locais que ja tinham sido criadas antes desta mudanca.</w:t>
-      </w:r>
-    </w:p>
-    <w:p>
-      <w:r>
-        <w:t>RecommendationExecution passou a alimentar o Confidence System: novas recomendacoes consideram execucoes anteriores do mesmo plano, spot/especie ou sessao quando calculam confidenceScore e confidenceReason.</w:t>
-      </w:r>
-    </w:p>
-    <w:p>
-      <w:r>
-        <w:t>As respostas de recomendacao tambem refletem feedback de execucao da propria recomendacao quando existem registos associados, permitindo perceber se o utilizador seguiu o plano e se resultou.</w:t>
-      </w:r>
-    </w:p>
-    <w:p>
-      <w:r>
-        <w:t>O objetivo e tornar a IA progressivamente mais util sem adicionar complexidade visual ao produto.</w:t>
+        <w:t>24.2 Prioridade media</w:t>
+      </w:r>
+    </w:p>
+    <w:p>
+      <w:r>
+        <w:t>Continuar o frontend em React Native Web usando os endpoints atuais: dashboard, spots, planos, sessoes, lure box, insights, options e AI Planner, mantendo Biblioteca e Galeria como fluxos visuais ja implementados. A nova tab Weather apresenta previsao detalhada por spot e data, incluindo dados horarios, condicoes atuais e sistema Solunar Forecast.</w:t>
+      </w:r>
+    </w:p>
+    <w:p>
+      <w:r>
+        <w:t>Desenhar o menu principal com poucas entradas e icones claros: Dashboard, Galeria, Spots, Weather, Planos, Sessao ativa, Lure Box, Biblioteca e Perfil.</w:t>
+      </w:r>
+    </w:p>
+    <w:p>
+      <w:r>
+        <w:t>Evoluir analytics apenas quando houver volume real de dados, mantendo filtros simples por data, especie, spot, lure e tipo de recomendacao.</w:t>
       </w:r>
     </w:p>
     <w:p>
@@ -10573,42 +11038,27 @@
         <w:pStyle w:val="Heading2"/>
       </w:pPr>
       <w:r>
-        <w:t>23.18 Dashboard acionavel para primeira vista</w:t>
-      </w:r>
-    </w:p>
-    <w:p>
-      <w:r>
-        <w:t>GET /api/dashboard passa a devolver blocos mais prontos para o futuro frontend React Native Web.</w:t>
-      </w:r>
-    </w:p>
-    <w:p>
-      <w:r>
-        <w:t>O dashboard inclui proxima sessao planeada, sessoes ativas, ultimos resultados, melhor lure recente, taxa de sucesso, weather snapshot relevante e recomendacoes pendentes para avaliar.</w:t>
-      </w:r>
-    </w:p>
-    <w:p>
-      <w:r>
-        <w:t>nextPlannedSession escolhe a proxima FishingSession planned quando existir; caso contrario usa o proximo FishingPlan como fallback util.</w:t>
-      </w:r>
-    </w:p>
-    <w:p>
-      <w:r>
-        <w:t>bestRecentLure e calculada a partir de lures usadas recentemente em sessoes, priorizando sucesso e frequencia de uso.</w:t>
-      </w:r>
-    </w:p>
-    <w:p>
-      <w:r>
-        <w:t>relevantWeatherSnapshot tenta usar weather ligado a proxima sessao/plano e so depois cai no snapshot mais recente disponivel.</w:t>
-      </w:r>
-    </w:p>
-    <w:p>
-      <w:r>
-        <w:t>pendingRecommendations lista recomendacoes latest que ainda nao tem RecommendationExecution, para incentivar o utilizador a fechar o ciclo Planear -&gt; Pescar -&gt; Aprender.</w:t>
-      </w:r>
-    </w:p>
-    <w:p>
-      <w:r>
-        <w:t>Os campos antigos do dashboard foram mantidos para compatibilidade; os novos campos sao aditivos e pensados para uma UI simples.</w:t>
+        <w:t>24.3 Mais tarde</w:t>
+      </w:r>
+    </w:p>
+    <w:p>
+      <w:r>
+        <w:t>Adicionar autenticacao e perfis quando o MVP local estiver estavel.</w:t>
+      </w:r>
+    </w:p>
+    <w:p>
+      <w:r>
+        <w:t>Adicionar export/import de dados para backup local.</w:t>
+      </w:r>
+    </w:p>
+    <w:p>
+      <w:r>
+        <w:t>Avaliar Python/ML apenas quando existir historico real suficiente para treinar ou inferir padroes uteis.</w:t>
+      </w:r>
+    </w:p>
+    <w:p>
+      <w:r>
+        <w:t>Avaliar RAG ou web-assisted planning depois de existirem regras de seguranca, cache e fontes controladas.</w:t>
       </w:r>
     </w:p>
     <w:p>
@@ -10616,438 +11066,28 @@
         <w:pStyle w:val="Heading2"/>
       </w:pPr>
       <w:r>
-        <w:t>23.19 Insights praticos e analytics filtraveis</w:t>
-      </w:r>
-    </w:p>
-    <w:p>
-      <w:r>
-        <w:t>Foram adicionados endpoints simples em /api/insights para transformar o historico em decisoes praticas, sem criar dashboards grandes ou confusos.</w:t>
-      </w:r>
-    </w:p>
-    <w:p>
-      <w:r>
-        <w:t>Endpoints implementados: GET /api/insights/top-lures, GET /api/insights/best-spots, GET /api/insights/best-conditions e GET /api/insights/recommendation-performance.</w:t>
-      </w:r>
-    </w:p>
-    <w:p>
-      <w:r>
-        <w:t>Os filtros suportados sao dateFrom, dateTo, species, spotId, lureId e limit. Recommendation performance tambem aceita recommendationType.</w:t>
-      </w:r>
-    </w:p>
-    <w:p>
-      <w:r>
-        <w:t>Top lures prioriza lures usadas em sessoes com sucesso, total de capturas, frequencia e data mais recente.</w:t>
-      </w:r>
-    </w:p>
-    <w:p>
-      <w:r>
-        <w:t>Best spots e best conditions usam sessoes, capturas, sucesso, rating e weather snapshots ligados a sessoes para mostrar apenas padroes acionaveis.</w:t>
-      </w:r>
-    </w:p>
-    <w:p>
-      <w:r>
-        <w:t>Recommendation performance usa RecommendationExecution para perceber que tipos/passos de recomendacao foram seguidos e quais resultaram melhor.</w:t>
-      </w:r>
-    </w:p>
-    <w:p>
-      <w:r>
-        <w:t>Postman foi atualizado com grupo Insights para testar estes endpoints rapidamente.</w:t>
-      </w:r>
-    </w:p>
-    <w:p>
-      <w:pPr>
-        <w:pStyle w:val="Heading2"/>
-      </w:pPr>
-      <w:r>
-        <w:t>23.20 Frontend readiness: options e erros de API</w:t>
-      </w:r>
-    </w:p>
-    <w:p>
-      <w:r>
-        <w:t>Foi adicionada uma camada simples para preparar o backend para React Native Web, sem alterar os endpoints principais nem o health endpoint.</w:t>
-      </w:r>
-    </w:p>
-    <w:p>
-      <w:r>
-        <w:t>Novo grupo de endpoints: GET /api/options para devolver todas as opcoes de combobox/dropdown numa unica chamada.</w:t>
-      </w:r>
-    </w:p>
-    <w:p>
-      <w:r>
-        <w:t>Tambem existem endpoints individuais em /api/options/water-types, /water-clarities, /water-levels, /lure-types, /lure-difficulties, /lure-effectiveness-levels, /lure-conditions, /fish-strike-zones, /session-statuses, /session-event-types, /recommendation-types, /recommendation-steps, /recommendation-results e /sort-directions.</w:t>
-      </w:r>
-    </w:p>
-    <w:p>
-      <w:r>
-        <w:t>As opcoes devolvem objetos simples { value, label }, com value pensado para enviar de volta ao backend e label pensado para mostrar na UI.</w:t>
-      </w:r>
-    </w:p>
-    <w:p>
-      <w:r>
-        <w:t>Dashboard, Insights, Plans e Sessions continuam a devolver DTOs pensados para ecras mobile/web: summaries paginados nas listagens e detalhe apenas quando necessario.</w:t>
-      </w:r>
-    </w:p>
-    <w:p>
-      <w:r>
-        <w:t>O payload de erro passou a incluir code estavel alem de message, status, path e fieldErrors, para o frontend conseguir mostrar feedback claro e tratar casos como VALIDATION_FAILED, INVALID_QUERY_PARAMETER, NOT_FOUND e CONFLICT.</w:t>
-      </w:r>
-    </w:p>
-    <w:p>
-      <w:r>
-        <w:t>Postman foi atualizado com grupo Frontend Options.</w:t>
-      </w:r>
-    </w:p>
-    <w:p>
-      <w:pPr>
-        <w:pStyle w:val="Heading2"/>
-      </w:pPr>
-      <w:r>
-        <w:t>23.21 Documentacao de handoff para frontend</w:t>
-      </w:r>
-    </w:p>
-    <w:p>
-      <w:r>
-        <w:t>README.md foi atualizado para refletir o estado real do backend MVP, stack atual, comandos locais, arquitetura, principais grupos de endpoints, Postman, demo data e direcao de frontend React Native Web.</w:t>
-      </w:r>
-    </w:p>
-    <w:p>
-      <w:r>
-        <w:t>A colecao Postman continua atualizada com grupos para Health, Dashboard, Catch Gallery, Frontend Options, Spots, Fish Library, Lure Library, Lure Box, Plans, Sessions, AI Recommendations, Recommendation Execution Tracking, Analytics, Insights, Weather Snapshots e Weather Locations.</w:t>
-      </w:r>
-    </w:p>
-    <w:p>
-      <w:r>
-        <w:t>O backend esta documentado o suficiente para iniciar o frontend sem depender de conhecimento oral: o docx continua a ser a especificacao principal, o README serve como entrada tecnica rapida e o Postman serve para testar a API.</w:t>
-      </w:r>
-    </w:p>
-    <w:p>
-      <w:r>
-        <w:t>Contrato frontend: o menu principal deve ter um icon/entrada para Galeria; ao tocar numa foto/cartao, o frontend deve navegar para a sessao indicada por sessionId e destacar/abrir a captura indicada por catchId. A galeria tambem mostra a lure da biblioteca usada quando essa associacao existir.</w:t>
-      </w:r>
-    </w:p>
-    <w:p>
-      <w:r>
-        <w:t>Endpoint implementado: GET /api/gallery/catches devolve PagedResponse com itens compactos da galeria, incluindo catchId, sessionId, data da sessao, spot, especie, quantidade, medidas, released, foto, sucesso/rating da sessao e, opcionalmente, lureLibraryItemId, lureName e lureImageUrl.</w:t>
-      </w:r>
-    </w:p>
-    <w:p>
-      <w:r>
-        <w:t>Backend implementado: Catch aceita photoUrl, photoThumbnailUrl, photoCaption e uma associacao opcional a LureLibraryItem. CreateCatchRequest e CatchResponse usam DTOs e validam a existencia da lure selecionada.</w:t>
-      </w:r>
-    </w:p>
-    <w:p>
-      <w:pPr>
-        <w:pStyle w:val="Heading2"/>
-      </w:pPr>
-      <w:r>
-        <w:t>23.22 Catch Gallery e fotos de capturas</w:t>
-      </w:r>
-    </w:p>
-    <w:p>
-      <w:r>
-        <w:t>A galeria visual foi implementada no frontend React Native Web com grid de capturas, detalhe com imagem em destaque, tamanho, peso opcional, sessao e spot. A quantidade e outros campos internos nao aparecem no detalhe normal, e nao existe uma secao de videos.</w:t>
-      </w:r>
-    </w:p>
-    <w:p>
-      <w:r>
-        <w:t>O utilizador pode criar, editar e apagar capturas. Ao criar/editar, escolhe a especie da biblioteca de peixes, a lure da biblioteca de lures e a sessao associada em comboboxes; a lure selecionada aparece em miniatura na captura. A foto continua a ser tratada como URL/metadado ate existir upload binario gerido pelo backend.</w:t>
-      </w:r>
-    </w:p>
-    <w:p>
-      <w:pPr>
-        <w:pStyle w:val="Heading2"/>
-      </w:pPr>
-      <w:r>
-        <w:t>23.23 Frontend React Native Web shell inicial</w:t>
-      </w:r>
-    </w:p>
-    <w:p>
-      <w:pPr>
-        <w:pStyle w:val="ListBullet"/>
-      </w:pPr>
-      <w:r>
-        <w:t>Frontend inicial implementado em frontend/src/App.jsx usando primitivos React Native Web, mantendo Vite como host local e alias react-native -&gt; react-native-web.</w:t>
-      </w:r>
-    </w:p>
-    <w:p>
-      <w:pPr>
-        <w:pStyle w:val="ListBullet"/>
-      </w:pPr>
-      <w:r>
-        <w:t>Menu principal implementado com Dashboard, Galeria, Spots, Planos, Sessao, Lure Box, Biblioteca e Perfil.</w:t>
-      </w:r>
-    </w:p>
-    <w:p>
-      <w:pPr>
-        <w:pStyle w:val="ListBullet"/>
-      </w:pPr>
-      <w:r>
-        <w:t>Menu usa icons estaticos de frontend/assets/images/ui, incluindo dashboard-icon.png, gallery-icon.png, spots-icon.png, fishingplan-icon.png, session-icon.png, lurebox-icon.png, library-icon.png e profile-icon.png.</w:t>
-      </w:r>
-    </w:p>
-    <w:p>
-      <w:pPr>
-        <w:pStyle w:val="ListBullet"/>
-      </w:pPr>
-      <w:r>
-        <w:t>Topo da app usa o app icon como marca sem moldura branca extra; eventuais margens dos assets sao tratadas por crop/scale no estilo do componente, sem alterar os ficheiros originais.</w:t>
-      </w:r>
-    </w:p>
-    <w:p>
-      <w:pPr>
-        <w:pStyle w:val="ListBullet"/>
-      </w:pPr>
-      <w:r>
-        <w:t>Dashboard inicial consome GET /api/health e GET /api/dashboard; quando o backend nao esta disponivel, mostra uma vista de exemplo para permitir trabalhar o layout.</w:t>
-      </w:r>
-    </w:p>
-    <w:p>
-      <w:pPr>
-        <w:pStyle w:val="ListBullet"/>
-      </w:pPr>
-      <w:r>
-        <w:t>Foi adicionado switch PT/EN funcional no fundo da sidebar. Nesta fase, a traducao e local ao cliente e cobre os textos principais da shell inicial.</w:t>
-      </w:r>
-    </w:p>
-    <w:p>
-      <w:pPr>
-        <w:pStyle w:val="ListBullet"/>
-      </w:pPr>
-      <w:r>
-        <w:t>Proximo passo frontend: transformar Dashboard, Spots, Planos, Sessao, Lure Box e Insights em ecras reais, reaproveitando os DTOs compactos e options endpoints. Biblioteca e Galeria ja possuem fluxos visuais iniciais implementados.</w:t>
-      </w:r>
-    </w:p>
-    <w:p>
-      <w:pPr>
-        <w:pStyle w:val="Heading2"/>
-      </w:pPr>
-      <w:r>
-        <w:t>23.24 Biblioteca e Galeria visual no frontend</w:t>
+        <w:t>24.4 Spots visuais, mapa e meteorologia Open-Meteo</w:t>
+      </w:r>
+    </w:p>
+    <w:p>
+      <w:r>
+        <w:t>A primeira iteracao real do frontend React Native Web para Spots usa um mapa OpenStreetMap com zoom, arrasto e selecao por clique. Um gesto de arrasto move o mapa sem alterar as coordenadas; um clique simples escolhe o ponto. A selecao no mapa preenche latitude e longitude automaticamente, mantendo os campos editaveis. O controlo de zoom permite aproximar de Z4 ate Z18.</w:t>
+      </w:r>
+    </w:p>
+    <w:p>
+      <w:r>
+        <w:t>O formulario de novo spot exige tipo de agua Freshwater ou Saltwater, apresenta seis tipos de local com imagens (albufeira/barragem, rio/ribeira, lago/lagoa, foz/estuario, costa/mar aberto e porto/marina) e permite escolher uma ou mais especies a partir da biblioteca de peixes. O frontend envia esta selecao de forma compativel no campo favoriteSpecies e apresenta cada especie como um chip individual com imagem. O tipo visual do local passa a ser persistido no campo spotType com os valores RESERVOIR, RIVER, LAKE, ESTUARY, COAST e HARBOR.</w:t>
+      </w:r>
+    </w:p>
+    <w:p>
+      <w:r>
+        <w:t>A tab Spots permanece focada na descoberta e nos detalhes dos locais, sem o cartao de meteorologia. A tab Weather apresenta os dados Open-Meteo atuais, diarios e horarios, escolhe os assets meteorologicos locais e acrescenta o Solunar Forecast por coordenadas e data.</w:t>
       </w:r>
     </w:p>
     <w:p>
       <w:pPr/>
       <w:r>
-        <w:t>A Biblioteca visual foi implementada em React Native Web com um seletor entre Biblioteca de peixes e Biblioteca de lures. Os registos aparecem numa grelha visual de tres colunas, com imagem, resumo e acesso a detalhe.</w:t>
-      </w:r>
-    </w:p>
-    <w:p>
-      <w:pPr/>
-      <w:r>
-        <w:t>Na Biblioteca de peixes, o utilizador pode criar, editar e apagar especies, escolher a imagem, classificar de forma evidente entre agua doce e agua salgada e preencher zonas de ataque, zonas comuns e lures favoritas a partir de opcoes existentes.</w:t>
-      </w:r>
-    </w:p>
-    <w:p>
-      <w:pPr/>
-      <w:r>
-        <w:t>Na Biblioteca de lures, o utilizador pode criar, editar e apagar entradas, escolher a imagem, selecionar dificuldade e eficacia por comboboxes com barras visuais e associar manualmente um unico icone de acao a uma imagem grande de referencia.</w:t>
-      </w:r>
-    </w:p>
-    <w:p>
-      <w:pPr/>
-      <w:r>
-        <w:t>A Galeria visual permite criar, editar e apagar capturas. O botao Nova captura fica centrado entre o cabecalho e os cards; ao abrir uma captura, a imagem ocupa o destaque principal e os dados ficam reduzidos a tamanho, peso opcional, sessao, spot e lure usada.</w:t>
-      </w:r>
-    </w:p>
-    <w:p>
-      <w:pPr/>
-      <w:r>
-        <w:t>A barra de pesquisa foi removida da Biblioteca e a apresentacao visual privilegia filtros de ambiente, troca entre catalogos, imagens e paginacao simples. O backend continua a suportar filtros e ordenacao para futuros ecras mais avancados.</w:t>
-      </w:r>
-    </w:p>
-    <w:p>
-      <w:pPr>
-        <w:pStyle w:val="Heading2"/>
-      </w:pPr>
-      <w:r>
-        <w:t>23.25 Plans e AI Planner no frontend</w:t>
-      </w:r>
-    </w:p>
-    <w:p>
-      <w:pPr/>
-      <w:r>
-        <w:t>A pagina de Planos foi implementada no frontend React Native Web como um ecrã operacional para criar, consultar e abrir planos de pesca.</w:t>
-      </w:r>
-    </w:p>
-    <w:p>
-      <w:pPr>
-        <w:pStyle w:val="ListBullet"/>
-      </w:pPr>
-      <w:r>
-        <w:t>A pesquisa textual foi removida da pagina de Planos para manter o foco no planeamento e reduzir ruido visual.</w:t>
-      </w:r>
-    </w:p>
-    <w:p>
-      <w:pPr>
-        <w:pStyle w:val="ListBullet"/>
-      </w:pPr>
-      <w:r>
-        <w:t>O header mostra o total de planos num contador quadrado consistente com os headers de Spots e Lure Box.</w:t>
-      </w:r>
-    </w:p>
-    <w:p>
-      <w:pPr>
-        <w:pStyle w:val="ListBullet"/>
-      </w:pPr>
-      <w:r>
-        <w:t>O header apresenta um destaque visual Powered by AI para comunicar que o planeamento A/B/C usa o AI Planner local.</w:t>
-      </w:r>
-    </w:p>
-    <w:p>
-      <w:pPr>
-        <w:pStyle w:val="ListBullet"/>
-      </w:pPr>
-      <w:r>
-        <w:t>O formulario permite escolher data e hora, uma ou varias especies da biblioteca, todas as especies, lures selecionadas ou a Lure Box completa.</w:t>
-      </w:r>
-    </w:p>
-    <w:p>
-      <w:pPr>
-        <w:pStyle w:val="ListBullet"/>
-      </w:pPr>
-      <w:r>
-        <w:t>O detalhe do plano mostra a recomendacao validada, confidence e o estado de guardado; o utilizador pode guardar a recomendacao gerada.</w:t>
-      </w:r>
-    </w:p>
-    <w:p>
-      <w:pPr>
-        <w:pStyle w:val="Heading1"/>
-      </w:pPr>
-      <w:r>
-        <w:t>24. Roadmap backend restante</w:t>
-      </w:r>
-    </w:p>
-    <w:p>
-      <w:r>
-        <w:t>24.1 Prioridade alta</w:t>
-      </w:r>
-    </w:p>
-    <w:p>
-      <w:r>
-        <w:t>Ligar os endpoints de insights ja implementados ao futuro frontend de forma seletiva, mantendo apenas metricas uteis para decisao rapida.</w:t>
-      </w:r>
-    </w:p>
-    <w:p>
-      <w:pPr>
-        <w:pStyle w:val="Heading2"/>
-      </w:pPr>
-      <w:r>
-        <w:t>A galeria visual de capturas ja foi implementada no frontend. O trabalho restante nesta area e substituir data URLs/metadados por upload e storage de ficheiros geridos pelo backend quando a app passar a usar fotos reais em maior escala.</w:t>
-      </w:r>
-    </w:p>
-    <w:p>
-      <w:r>
-        <w:t>A galeria usa GET /api/gallery/catches, com filtros simples ja suportados no backend por texto, especie, spot, sessao, datas, released, sucesso da sessao e withPhotoOnly. Os itens incluem a lure da biblioteca quando registada.</w:t>
-      </w:r>
-    </w:p>
-    <w:p>
-      <w:r>
-        <w:t>Completar suporte real a uploads de fotos de capturas: o backend ja guarda photoUrl, photoThumbnailUrl e photoCaption em Catch, mas ainda falta implementar storage/upload de ficheiros quando o frontend existir.</w:t>
-      </w:r>
-    </w:p>
-    <w:p>
-      <w:r>
-        <w:t>Estrutura atual de imagens do frontend: frontend/assets/images/brand, fish/freshwater, fish/saltwater, lures, lure-actions, lure-action-icons, placeholders, spots, ui e weather.</w:t>
-      </w:r>
-    </w:p>
-    <w:p>
-      <w:r>
-        <w:t>Assets estaticos do frontend devem seguir nomes lowercase-kebab-case para facilitar imports em React Native Web, por exemplo black-bass.png, sea-bass.png, clear-sky.png e app-icon.png.</w:t>
-      </w:r>
-    </w:p>
-    <w:p>
-      <w:r>
-        <w:t>Separar imagens estaticas de catalogo e fotos do utilizador: imagens de lures/especies/spots podem ficar em frontend/assets; fotos de capturas reais nao devem ficar nos assets do frontend, devem ser geridas como uploads.</w:t>
-      </w:r>
-    </w:p>
-    <w:p>
-      <w:r>
-        <w:t>Continuar a calibrar o Confidence System com dados reais: sucesso por lure, especie, spot, weather, execucao seguida e resultado final da sessao.</w:t>
-      </w:r>
-    </w:p>
-    <w:p>
-      <w:r>
-        <w:t>Validar o fluxo completo Planear -&gt; Pescar -&gt; Aprender no frontend real e ajustar apenas payloads que causarem chamadas redundantes.</w:t>
-      </w:r>
-    </w:p>
-    <w:p>
-      <w:pPr>
-        <w:pStyle w:val="Heading2"/>
-      </w:pPr>
-      <w:r>
-        <w:t>24.2 Prioridade media</w:t>
-      </w:r>
-    </w:p>
-    <w:p>
-      <w:r>
-        <w:t>Continuar o frontend em React Native Web usando os endpoints atuais: dashboard, spots, planos, sessoes, lure box, insights, options e AI Planner, mantendo Biblioteca e Galeria como fluxos visuais ja implementados.</w:t>
-      </w:r>
-    </w:p>
-    <w:p>
-      <w:r>
-        <w:t>Desenhar o menu principal com poucas entradas e icones claros: Dashboard, Galeria, Spots, Planos, Sessao ativa, Lure Box, Biblioteca e Perfil.</w:t>
-      </w:r>
-    </w:p>
-    <w:p>
-      <w:r>
-        <w:t>Evoluir analytics apenas quando houver volume real de dados, mantendo filtros simples por data, especie, spot, lure e tipo de recomendacao.</w:t>
-      </w:r>
-    </w:p>
-    <w:p>
-      <w:pPr>
-        <w:pStyle w:val="Heading2"/>
-      </w:pPr>
-      <w:r>
-        <w:t>24.3 Mais tarde</w:t>
-      </w:r>
-    </w:p>
-    <w:p>
-      <w:r>
-        <w:t>Adicionar autenticacao e perfis quando o MVP local estiver estavel.</w:t>
-      </w:r>
-    </w:p>
-    <w:p>
-      <w:r>
-        <w:t>Adicionar export/import de dados para backup local.</w:t>
-      </w:r>
-    </w:p>
-    <w:p>
-      <w:r>
-        <w:t>Avaliar Python/ML apenas quando existir historico real suficiente para treinar ou inferir padroes uteis.</w:t>
-      </w:r>
-    </w:p>
-    <w:p>
-      <w:r>
-        <w:t>Avaliar RAG ou web-assisted planning depois de existirem regras de seguranca, cache e fontes controladas.</w:t>
-      </w:r>
-    </w:p>
-    <w:p>
-      <w:pPr>
-        <w:pStyle w:val="Heading2"/>
-      </w:pPr>
-      <w:r>
-        <w:t>24.4 Spots visuais, mapa e meteorologia IPMA</w:t>
-      </w:r>
-    </w:p>
-    <w:p>
-      <w:r>
-        <w:t>A primeira iteracao real do frontend React Native Web para Spots usa um mapa OpenStreetMap com zoom, arrasto e selecao por clique. Um gesto de arrasto move o mapa sem alterar as coordenadas; um clique simples escolhe o ponto. A selecao no mapa preenche latitude e longitude automaticamente, mantendo os campos editaveis. O controlo de zoom permite aproximar de Z4 ate Z18.</w:t>
-      </w:r>
-    </w:p>
-    <w:p>
-      <w:r>
-        <w:t>O formulario de novo spot exige tipo de agua Freshwater ou Saltwater, apresenta seis tipos de local com imagens (albufeira/barragem, rio/ribeira, lago/lagoa, foz/estuario, costa/mar aberto e porto/marina) e permite escolher uma ou mais especies a partir da biblioteca de peixes. O frontend envia esta selecao de forma compativel no campo favoriteSpecies e apresenta cada especie como um chip individual com imagem. O tipo visual do local passa a ser persistido no campo spotType com os valores RESERVOIR, RIVER, LAKE, ESTUARY, COAST e HARBOR.</w:t>
-      </w:r>
-    </w:p>
-    <w:p>
-      <w:r>
-        <w:t>A tab Spots mostra um cartao de meteorologia IPMA para o spot selecionado. O frontend usa POST /api/weather-snapshots/ipma/coordinates com as coordenadas do spot ao abrir a tab, ao selecionar outro spot e quando o utilizador pede uma atualizacao manual. O cartao identifica a localidade de previsao IPMA selecionada e mostra temperatura minima e maxima diaria, probabilidade de chuva, direcao e classe do vento, data da previsao, atualizacao IPMA, momento da consulta e coordenadas. A condicao meteorologica nao e usada como dado visual; o icone usa chuva quando a precipitacao ultrapassa 20% e ceu limpo nos restantes casos.</w:t>
-      </w:r>
-    </w:p>
-    <w:p>
-      <w:pPr/>
-      <w:r>
-        <w:t>No Dashboard, o bloco Weather relevante permite escolher qualquer localidade devolvida por GET /api/weather-locations/ipma. Ao mudar de localidade IPMA, o frontend chama POST /api/weather-snapshots/ipma/location e atualiza o cartao com o snapshot desse local.</w:t>
+        <w:t>No Dashboard, o bloco Weather relevante apresenta uma unica combobox de distrito dentro do cartao. Ao escolher um distrito, o frontend pesquisa localizacoes de previsao portuguesas por GET /api/weather-locations/search e usa a primeira correspondencia para chamar POST /api/weather-snapshots/location e atualizar o cartao. O menu fica sobre o conteudo da pagina para manter a escolha visivel.</w:t>
       </w:r>
     </w:p>
     <w:p>
@@ -11072,7 +11112,17 @@
     </w:p>
     <w:p>
       <w:r>
-        <w:t>As coordenadas do mapa continuam a ser convertidas pelo IPMA para a localidade de previsao suportada mais proxima. Esta localidade nao deve ser apresentada como distrito administrativo exato; uma futura melhoria de reverse geocoding e limites administrativos fica fora desta iteracao.</w:t>
+        <w:t>As coordenadas do mapa sao usadas diretamente pelo Open-Meteo, sem conversao para um distrito ou localidade meteorologica fixa. A pesquisa de localidades serve apenas para tornar a escolha mais simples no frontend.</w:t>
+      </w:r>
+    </w:p>
+    <w:p>
+      <w:r>
+        <w:t>O endpoint GET /api/solunar/spots/{spotId}?date=YYYY-MM-DD calcula fase lunar, percentagem de iluminacao, nascer e por da Lua, horarios solares e periodos major/minor. O calculo usa as coordenadas do spot e apresenta-se como apoio tradicional a decisao, nao como garantia de captura.</w:t>
+      </w:r>
+    </w:p>
+    <w:p>
+      <w:r>
+        <w:t>O Planner Context Builder inclui WeatherSnapshot e Solunar Forecast quando o plano esta ligado a um spot com coordenadas. O prompt do AI Planner recebe estes dados para adaptar a estrategia A/B/C, e o Confidence System penaliza a ausencia de um ou de ambos.</w:t>
       </w:r>
     </w:p>
     <w:sectPr>

</xml_diff>

<commit_message>
Improve latest catch image display and update project documentation + sessions + dashboard
</commit_message>
<xml_diff>
--- a/docs/FishLog_AI_Project_Specification.docx
+++ b/docs/FishLog_AI_Project_Specification.docx
@@ -10964,7 +10964,7 @@
     </w:p>
     <w:p>
       <w:r>
-        <w:t>Ligar os endpoints de insights ja implementados ao futuro frontend de forma seletiva, mantendo apenas metricas uteis para decisao rapida.</w:t>
+        <w:t>Os endpoints de insights ja implementados foram ligados ao Dashboard de forma seletiva, mostrando apenas top lures, melhores spots, melhores condicoes e performance das recomendacoes, com estados vazios quando ainda nao existe historico suficiente.</w:t>
       </w:r>
     </w:p>
     <w:p>
@@ -10982,7 +10982,7 @@
     </w:p>
     <w:p>
       <w:r>
-        <w:t>Completar suporte real a uploads de fotos de capturas: o backend ja guarda photoUrl, photoThumbnailUrl e photoCaption em Catch, mas ainda falta implementar storage/upload de ficheiros quando o frontend existir.</w:t>
+        <w:t>Suporte real a uploads de fotos de capturas implementado: POST /api/uploads/images aceita imagens multipart ate 10 MB, guarda ficheiros numa pasta local configuravel e devolve um URL relativo em /uploads/. Catch continua a guardar photoUrl, photoThumbnailUrl e photoCaption sem guardar base64 na base de dados.</w:t>
       </w:r>
     </w:p>
     <w:p>
@@ -11087,7 +11087,7 @@
     <w:p>
       <w:pPr/>
       <w:r>
-        <w:t>No Dashboard, o bloco Weather relevante apresenta uma unica combobox de distrito dentro do cartao. Ao escolher um distrito, o frontend pesquisa localizacoes de previsao portuguesas por GET /api/weather-locations/search e usa a primeira correspondencia para chamar POST /api/weather-snapshots/location e atualizar o cartao. O menu fica sobre o conteudo da pagina para manter a escolha visivel.</w:t>
+        <w:t>No Dashboard, o bloco Weather relevante apresenta uma unica combobox de distrito dentro do cartao. Ao escolher um distrito, o frontend pesquisa localizacoes de previsao portuguesas por GET /api/weather-locations/search, usa a mesma localizacao e coordenadas para atualizar o Weather e o Solunar e mantém o menu sobre o conteudo da pagina. O bloco Ultima captura da mesma vista da prioridade visual a fotografia e mostra a imagem completa numa area mais larga, sem corte.</w:t>
       </w:r>
     </w:p>
     <w:p>
@@ -11117,12 +11117,50 @@
     </w:p>
     <w:p>
       <w:r>
-        <w:t>O endpoint GET /api/solunar/spots/{spotId}?date=YYYY-MM-DD calcula fase lunar, percentagem de iluminacao, nascer e por da Lua, horarios solares e periodos major/minor. O calculo usa as coordenadas do spot e apresenta-se como apoio tradicional a decisao, nao como garantia de captura.</w:t>
+        <w:t>Os endpoints GET /api/solunar/spots/{spotId}?date=YYYY-MM-DD e GET /api/solunar/coordinates?latitude=...&amp;longitude=...&amp;locationName=...&amp;date=YYYY-MM-DD calculam fase lunar, percentagem de iluminacao, nascer e por da Lua, horarios solares e periodos major/minor. O segundo permite ao Dashboard acompanhar diretamente a localizacao escolhida no Weather. O calculo apresenta-se como apoio tradicional a decisao, nao como garantia de captura.</w:t>
       </w:r>
     </w:p>
     <w:p>
       <w:r>
         <w:t>O Planner Context Builder inclui WeatherSnapshot e Solunar Forecast quando o plano esta ligado a um spot com coordenadas. O prompt do AI Planner recebe estes dados para adaptar a estrategia A/B/C, e o Confidence System penaliza a ausencia de um ou de ambos.</w:t>
+      </w:r>
+    </w:p>
+    <w:p>
+      <w:pPr>
+        <w:pStyle w:val="Heading2"/>
+      </w:pPr>
+      <w:r>
+        <w:t>24.6 Sessoes, capturas e upload de fotografias</w:t>
+      </w:r>
+    </w:p>
+    <w:p>
+      <w:r>
+        <w:t>O frontend React Native Web tem agora um fluxo dedicado de sessoes: criar e editar sessoes, escolher spot, plano opcional, data, hora, especie alvo, claridade, nivel da agua e notas.</w:t>
+      </w:r>
+    </w:p>
+    <w:p>
+      <w:r>
+        <w:t>Cada sessao pode passar por planned, active e finished. O detalhe permite iniciar e terminar a sessao, guardar sucesso, resumo do resultado, notas finais, duracao calculada e avaliacao de 1 a 5.</w:t>
+      </w:r>
+    </w:p>
+    <w:p>
+      <w:r>
+        <w:t>O detalhe da sessao apresenta as capturas associadas e permite criar, editar e apagar capturas sem sair da sessao. A captura liga-se a uma especie da biblioteca, a uma lure da biblioteca, tamanho em cm, peso opcional em kg e fotografia.</w:t>
+      </w:r>
+    </w:p>
+    <w:p>
+      <w:r>
+        <w:t>As imagens selecionadas no browser mostram pre-visualizacao imediata. No momento de guardar, o frontend envia o ficheiro para POST /api/uploads/images e envia o URL devolvido para POST/PUT /api/sessions/{sessionId}/catches.</w:t>
+      </w:r>
+    </w:p>
+    <w:p>
+      <w:r>
+        <w:t>O storage local usa a propriedade LUREPILOT_UPLOADS_DIRECTORY, com valor por defeito uploads. O backend serve os ficheiros em GET /uploads/{fileName}; este mecanismo e adequado ao MVP local e deve ser substituido por storage persistente quando houver deploy real.</w:t>
+      </w:r>
+    </w:p>
+    <w:p>
+      <w:r>
+        <w:t>A prioridade atual e completar o ciclo Planear -&gt; Pescar -&gt; Registar -&gt; Aprender com o AI Planner local e analytics praticas. Machine learning nao e requisito do roadmap imediato; fica apenas como possibilidade futura se existir historico real suficiente e uma necessidade clara.</w:t>
       </w:r>
     </w:p>
     <w:sectPr>

</xml_diff>

<commit_message>
Refine React Native Web workflows, persist catch photos, and validate LM Studio AI flow Refined the main frontend workflows, removed the unused Profile area, improved AI recommendation handling, added validated persistent image uploads, expanded tests, and updated README, DOCX specification and Postman documentation.
</commit_message>
<xml_diff>
--- a/docs/FishLog_AI_Project_Specification.docx
+++ b/docs/FishLog_AI_Project_Specification.docx
@@ -543,6 +543,22 @@
       </w:pPr>
       <w:r>
         <w:t>22. Backlog de features futuras</w:t>
+      </w:r>
+    </w:p>
+    <w:p>
+      <w:pPr>
+        <w:pStyle w:val="ListBullet"/>
+      </w:pPr>
+      <w:r>
+        <w:t>23. Estado atual do backend implementado</w:t>
+      </w:r>
+    </w:p>
+    <w:p>
+      <w:pPr>
+        <w:pStyle w:val="ListBullet"/>
+      </w:pPr>
+      <w:r>
+        <w:t>24. Roadmap backend restante</w:t>
       </w:r>
     </w:p>
     <w:p>
@@ -10766,7 +10782,7 @@
         <w:pStyle w:val="ListBullet"/>
       </w:pPr>
       <w:r>
-        <w:t>Menu principal implementado com Dashboard, Galeria, Spots, Weather, Planos, Sessao, Lure Box, Biblioteca e Perfil.</w:t>
+        <w:t>Menu principal implementado com Dashboard, Galeria, Spots, Weather, Planos, Sessao, Lure Box e Biblioteca. Como a app e single-user nesta fase, nao existe area de Perfil nem autenticacao.</w:t>
       </w:r>
     </w:p>
     <w:p>
@@ -10774,7 +10790,7 @@
         <w:pStyle w:val="ListBullet"/>
       </w:pPr>
       <w:r>
-        <w:t>Menu usa icons estaticos de frontend/assets/images/ui, incluindo dashboard-icon.png, gallery-icon.png, spots-icon.png, weather-icon.png, fishingplan-icon.png, session-icon.png, lurebox-icon.png, library-icon.png e profile-icon.png.</w:t>
+        <w:t>Menu usa icons estaticos de frontend/assets/images/ui, incluindo dashboard-icon.png, gallery-icon.png, spots-icon.png, weather-icon.png, fishingplan-icon.png, session-icon.png, lurebox-icon.png e library-icon.png.</w:t>
       </w:r>
     </w:p>
     <w:p>
@@ -10806,7 +10822,7 @@
         <w:pStyle w:val="ListBullet"/>
       </w:pPr>
       <w:r>
-        <w:t>O frontend React Native Web ja possui fluxos visuais para Dashboard, Galeria, Spots, Weather, Planos, Sessao, Lure Box, Biblioteca e Perfil, consumindo os DTOs compactos e options endpoints. O proximo trabalho deve continuar a validar os fluxos completos e a refinar apenas as interacoes necessarias.</w:t>
+        <w:t>O frontend React Native Web ja possui fluxos visuais para Dashboard, Galeria, Spots, Weather, Planos, Sessao, Lure Box e Biblioteca, consumindo os DTOs compactos e options endpoints. O proximo trabalho deve continuar a validar os fluxos completos e a refinar apenas as interacoes necessarias.</w:t>
       </w:r>
     </w:p>
     <w:p>
@@ -10972,7 +10988,7 @@
         <w:pStyle w:val="Heading2"/>
       </w:pPr>
       <w:r>
-        <w:t>A galeria visual de capturas ja foi implementada no frontend. O trabalho restante nesta area e substituir data URLs/metadados por upload e storage de ficheiros geridos pelo backend quando a app passar a usar fotos reais em maior escala.</w:t>
+        <w:t>A galeria visual de capturas ja foi implementada no frontend. As fotos reais passam pelo upload gerido pelo backend e ficam preparadas para storage persistente quando a app for publicada.</w:t>
       </w:r>
     </w:p>
     <w:p>
@@ -10982,7 +10998,7 @@
     </w:p>
     <w:p>
       <w:r>
-        <w:t>Suporte real a uploads de fotos de capturas implementado: POST /api/uploads/images aceita imagens multipart ate 10 MB, guarda ficheiros numa pasta local configuravel e devolve um URL relativo em /uploads/. Catch continua a guardar photoUrl, photoThumbnailUrl e photoCaption sem guardar base64 na base de dados.</w:t>
+        <w:t>Suporte real a uploads de fotos de capturas implementado: POST /api/uploads/images aceita imagens multipart ate 10 MB, valida JPEG/PNG/WEBP/GIF, escreve com nome seguro numa pasta configuravel e devolve um URL publico configuravel em /uploads/. Catch continua a guardar photoUrl, photoThumbnailUrl e photoCaption sem guardar base64 na base de dados.</w:t>
       </w:r>
     </w:p>
     <w:p>
@@ -11007,7 +11023,7 @@
     </w:p>
     <w:p>
       <w:r>
-        <w:t>Validar o fluxo completo Planear -&gt; Pescar -&gt; Aprender no frontend real e ajustar apenas payloads que causarem chamadas redundantes.</w:t>
+        <w:t>Validar e manter o fluxo completo Planear -&gt; Pescar -&gt; Registar captura -&gt; Aprender no frontend real, cobrindo recomendacao, ajuste durante a sessao, review final e avaliacao da execucao.</w:t>
       </w:r>
     </w:p>
     <w:p>
@@ -11025,7 +11041,7 @@
     </w:p>
     <w:p>
       <w:r>
-        <w:t>Desenhar o menu principal com poucas entradas e icones claros: Dashboard, Galeria, Spots, Weather, Planos, Sessao ativa, Lure Box, Biblioteca e Perfil.</w:t>
+        <w:t>Manter o menu principal com poucas entradas e icones claros: Dashboard, Galeria, Spots, Weather, Planos, Sessao, Lure Box e Biblioteca.</w:t>
       </w:r>
     </w:p>
     <w:p>
@@ -11135,17 +11151,17 @@
     </w:p>
     <w:p>
       <w:r>
-        <w:t>O frontend React Native Web tem agora um fluxo dedicado de sessoes: criar e editar sessoes, escolher spot, plano opcional, data, hora, especie alvo, claridade, nivel da agua e notas.</w:t>
-      </w:r>
-    </w:p>
-    <w:p>
-      <w:r>
-        <w:t>Cada sessao pode passar por planned, active e finished. O detalhe permite iniciar e terminar a sessao, guardar sucesso, resumo do resultado, notas finais, duracao calculada e avaliacao de 1 a 5.</w:t>
-      </w:r>
-    </w:p>
-    <w:p>
-      <w:r>
-        <w:t>O detalhe da sessao apresenta as capturas associadas e permite criar, editar e apagar capturas sem sair da sessao. A captura liga-se a uma especie da biblioteca, a uma lure da biblioteca, tamanho em cm, peso opcional em kg e fotografia.</w:t>
+        <w:t>O frontend React Native Web tem agora um fluxo dedicado de sessoes: criar e editar sessoes, escolher spot, plano opcional, data, hora, especie alvo, claridade e nivel da agua. O fluxo normal nao pede notas na criacao; quando existe um plano associado, os dados sao herdados e apresentados num unico bloco de contexto. A partir do detalhe do plano, o utilizador pode criar diretamente uma sessao com o plano preselecionado; o detalhe da sessao inclui tambem uma ligacao direta de volta ao plano associado.</w:t>
+      </w:r>
+    </w:p>
+    <w:p>
+      <w:r>
+        <w:t>Cada sessao pode passar por planned, active e finished. O detalhe permite iniciar e terminar a sessao, guardar sucesso, resumo do resultado, duracao calculada e avaliacao de 1 a 5. A interface nao pede notas na criacao nem no encerramento.</w:t>
+      </w:r>
+    </w:p>
+    <w:p>
+      <w:r>
+        <w:t>O detalhe da sessao apresenta as capturas associadas e permite criar, editar e apagar capturas sem sair da sessao. A captura liga-se a uma especie da biblioteca, a uma lure da biblioteca, tamanho em cm, peso opcional em kg e fotografia. O detalhe da sessao separa o contexto herdado do plano da execucao, resultado e capturas, evitando repetir spot, horario e condicoes na mesma vista.</w:t>
       </w:r>
     </w:p>
     <w:p>
@@ -11155,12 +11171,52 @@
     </w:p>
     <w:p>
       <w:r>
-        <w:t>O storage local usa a propriedade LUREPILOT_UPLOADS_DIRECTORY, com valor por defeito uploads. O backend serve os ficheiros em GET /uploads/{fileName}; este mecanismo e adequado ao MVP local e deve ser substituido por storage persistente quando houver deploy real.</w:t>
-      </w:r>
-    </w:p>
-    <w:p>
-      <w:r>
-        <w:t>A prioridade atual e completar o ciclo Planear -&gt; Pescar -&gt; Registar -&gt; Aprender com o AI Planner local e analytics praticas. Machine learning nao e requisito do roadmap imediato; fica apenas como possibilidade futura se existir historico real suficiente e uma necessidade clara.</w:t>
+        <w:t>O storage usa LUREPILOT_UPLOADS_DIRECTORY, com valor por defeito uploads, e LUREPILOT_UPLOADS_PUBLIC_BASE_URL para reverse proxy ou CDN. Em deploy real, o diretorio configurado deve ser montado como volume persistente; o backend serve os ficheiros em GET /uploads/{fileName}.</w:t>
+      </w:r>
+    </w:p>
+    <w:p>
+      <w:r>
+        <w:t>O frontend expoe agora o ciclo Planear -&gt; Pescar -&gt; Registar -&gt; Aprender: gerar e guardar recomendacoes, pedir ajustes durante a sessao, gerar review no fim e avaliar o passo seguido com resultado e rating. Machine learning nao e requisito do roadmap imediato; fica apenas como possibilidade futura se existir historico real suficiente e uma necessidade clara.</w:t>
+      </w:r>
+    </w:p>
+    <w:p>
+      <w:pPr>
+        <w:pStyle w:val="Heading2"/>
+      </w:pPr>
+      <w:r>
+        <w:t>24.7 Validacao local e estado atual</w:t>
+      </w:r>
+    </w:p>
+    <w:p>
+      <w:pPr>
+        <w:pStyle w:val="ListBullet"/>
+      </w:pPr>
+      <w:r>
+        <w:t>O fluxo completo Planear -&gt; Pescar -&gt; Registar captura -&gt; Aprender foi validado localmente com o LM Studio e o modelo qwen2.5-7b-instruct: geracao e persistencia de recomendacao, ajuste durante a sessao, review final, avaliacao de execucao e leitura do historico.</w:t>
+      </w:r>
+    </w:p>
+    <w:p>
+      <w:pPr>
+        <w:pStyle w:val="ListBullet"/>
+      </w:pPr>
+      <w:r>
+        <w:t>A verificacao frontend passou npm run lint e npm run build. A suite backend passou com Maven, incluindo os testes de controllers MockMvc, validacao de DTOs e armazenamento de imagens.</w:t>
+      </w:r>
+    </w:p>
+    <w:p>
+      <w:pPr>
+        <w:pStyle w:val="ListBullet"/>
+      </w:pPr>
+      <w:r>
+        <w:t>O armazenamento de fotos aceita uploads geridos pelo backend com tipos e tamanho validados, e pode usar um volume persistente atraves de LUREPILOT_UPLOADS_DIRECTORY e um URL publico configuravel por LUREPILOT_UPLOADS_PUBLIC_BASE_URL.</w:t>
+      </w:r>
+    </w:p>
+    <w:p>
+      <w:pPr>
+        <w:pStyle w:val="ListBullet"/>
+      </w:pPr>
+      <w:r>
+        <w:t>Machine learning nao e requisito imediato: o produto continua focado no AI Planner local, historico estruturado, Confidence System e analytics praticos. ML fica como possibilidade futura caso os dados reais justifiquem.</w:t>
       </w:r>
     </w:p>
     <w:sectPr>

</xml_diff>

<commit_message>
Improve local operation, VPN access, and project documentation
Added one-click local startup, Docker/backend/frontend orchestration,
desktop shortcut support, Tailscale iPhone access, firewall guidance,
local backups, HTTPS/camera notes, transparent app icon handling,
and updated README and project specification documentation.
</commit_message>
<xml_diff>
--- a/docs/FishLog_AI_Project_Specification.docx
+++ b/docs/FishLog_AI_Project_Specification.docx
@@ -20,12 +20,7 @@
         <w:jc w:val="center"/>
       </w:pPr>
       <w:r>
-        <w:rPr>
-          <w:b/>
-          <w:color w:val="595959"/>
-          <w:sz w:val="32"/>
-        </w:rPr>
-        <w:t>Documento de Projeto - Versao 3</w:t>
+        <w:t>Documento de Projeto - Versao 3.1</w:t>
       </w:r>
     </w:p>
     <w:p>
@@ -9081,12 +9076,7 @@
         <w:jc w:val="center"/>
       </w:pPr>
       <w:r>
-        <w:rPr>
-          <w:i/>
-          <w:color w:val="595959"/>
-          <w:sz w:val="18"/>
-        </w:rPr>
-        <w:t>Versao 3.0 - 29/05/2026 - Documento vivo para planeamento e desenvolvimento</w:t>
+        <w:t>Versao 3.1 - 10/08/2026 - Documento vivo para planeamento, desenvolvimento e operacao local</w:t>
       </w:r>
     </w:p>
     <w:p>
@@ -10806,7 +10796,7 @@
         <w:pStyle w:val="ListBullet"/>
       </w:pPr>
       <w:r>
-        <w:t>Dashboard inicial consome GET /api/health e GET /api/dashboard; quando o backend nao esta disponivel, mostra uma vista de exemplo para permitir trabalhar o layout.</w:t>
+        <w:t>Dashboard inicial consome GET /api/dashboard; quando o backend nao esta disponivel, mostra uma vista de exemplo para permitir trabalhar o layout.</w:t>
       </w:r>
     </w:p>
     <w:p>
@@ -11217,6 +11207,199 @@
       </w:pPr>
       <w:r>
         <w:t>Machine learning nao e requisito imediato: o produto continua focado no AI Planner local, historico estruturado, Confidence System e analytics praticos. ML fica como possibilidade futura caso os dados reais justifiquem.</w:t>
+      </w:r>
+    </w:p>
+    <w:p>
+      <w:pPr>
+        <w:pStyle w:val="Heading2"/>
+      </w:pPr>
+      <w:r>
+        <w:t>24.8 Operacao local por VPN, fiabilidade e backups</w:t>
+      </w:r>
+    </w:p>
+    <w:p>
+      <w:pPr/>
+      <w:r>
+        <w:t>A estrategia imediata de utilizacao e local: o computador continua a alojar Vite, Spring Boot, PostgreSQL e LM Studio, enquanto o iPhone acede ao frontend atraves do IP VPN do computador. O backend nao precisa de ser exposto diretamente ao iPhone porque o Vite encaminha /api e /uploads para o backend local.</w:t>
+      </w:r>
+    </w:p>
+    <w:p>
+      <w:pPr/>
+      <w:r>
+        <w:t>Foi criada a operacao scripts/start-local.ps1. O script inicia PostgreSQL com Docker Compose, backend e frontend quando as portas estao livres, espera pelo health endpoint, verifica se o LM Studio responde e grava logs persistentes na pasta logs. scripts/stop-local.ps1 termina os processos iniciados pelo helper.</w:t>
+      </w:r>
+    </w:p>
+    <w:p>
+      <w:pPr/>
+      <w:r>
+        <w:t>A configuracao local usa variaveis de ambiente para portas, URL do backend, URL e modelo do LM Studio, diretorio de uploads, nivel de logs e HTTPS opcional. Os exemplos estao no .env.example raiz, backend/.env.example e frontend/.env.example. scripts/allow-firewall.ps1 prepara uma regra TCP para a porta do frontend no perfil Private e pode ser limitada ao subnet/IP da VPN.</w:t>
+      </w:r>
+    </w:p>
+    <w:p>
+      <w:pPr/>
+      <w:r>
+        <w:t>A importacao de fotografias e o seletor de camera do browser usam input de ficheiro com image/* e capture=environment, permitindo testar no Safari. Se no futuro for necessario getUserMedia ou instalar a app como PWA, scripts/create-local-cert.ps1 prepara um certificado mkcert e o frontend Vite pode arrancar com HTTPS; o certificado local tem de ser confiado no iPhone.</w:t>
+      </w:r>
+    </w:p>
+    <w:p>
+      <w:pPr/>
+      <w:r>
+        <w:t>scripts/backup-local.ps1 cria um dump PostgreSQL e um arquivo das fotografias em backend/uploads, guardando os dois na mesma pasta temporal e mantendo os sete backups mais recentes por defeito. Os dados e fotografias nao devem ser considerados persistentes fora deste backup enquanto a app continuar local.</w:t>
+      </w:r>
+    </w:p>
+    <w:p>
+      <w:pPr/>
+      <w:r>
+        <w:t>Checklist de validacao real:</w:t>
+      </w:r>
+    </w:p>
+    <w:p>
+      <w:pPr>
+        <w:pStyle w:val="ListBullet"/>
+      </w:pPr>
+      <w:r>
+        <w:t>Planear -&gt; consultar Weather/Solunar -&gt; iniciar sessao.</w:t>
+      </w:r>
+    </w:p>
+    <w:p>
+      <w:pPr>
+        <w:pStyle w:val="ListBullet"/>
+      </w:pPr>
+      <w:r>
+        <w:t>Gerar e adaptar recomendacao AI com o LM Studio local.</w:t>
+      </w:r>
+    </w:p>
+    <w:p>
+      <w:pPr>
+        <w:pStyle w:val="ListBullet"/>
+      </w:pPr>
+      <w:r>
+        <w:t>Registar captura com importacao ou camera, terminar sessao e rever Galeria/Analytics.</w:t>
+      </w:r>
+    </w:p>
+    <w:p>
+      <w:pPr>
+        <w:pStyle w:val="ListBullet"/>
+      </w:pPr>
+      <w:r>
+        <w:t>Repetir com LM Studio desligado e com internet indisponivel, confirmando estados de erro e retry sem perda de dados.</w:t>
+      </w:r>
+    </w:p>
+    <w:p>
+      <w:pPr>
+        <w:pStyle w:val="ListBullet"/>
+      </w:pPr>
+      <w:r>
+        <w:t>Executar backup, reiniciar a stack e confirmar que PostgreSQL e fotografias continuam disponiveis.</w:t>
+      </w:r>
+    </w:p>
+    <w:p>
+      <w:pPr>
+        <w:pStyle w:val="ListBullet"/>
+      </w:pPr>
+      <w:r>
+        <w:t>Abrir a app no Safari do iPhone ligado a VPN e validar layout, importacao de foto e fluxo completo.</w:t>
+      </w:r>
+    </w:p>
+    <w:p>
+      <w:r>
+        <w:t>Para manter o LLM local estavel, o contexto do AI Planner preserva weather, Solunar, especies, lures e historico, mas envia apenas as seis previsoes horarias mais relevantes para a hora planeada. Isto reduz payload sem remover os sinais necessarios para a recomendacao.</w:t>
+      </w:r>
+    </w:p>
+    <w:p>
+      <w:r>
+        <w:t>A validacao local confirmou o fluxo Planear -&gt; Weather/Solunar -&gt; Pescar -&gt; recomendacao e ajuste AI -&gt; captura -&gt; terminar sessao -&gt; review/avaliacao -&gt; Galeria/Analytics. A chamada real usa LM Studio com qwen2.5-7b-instruct.</w:t>
+      </w:r>
+    </w:p>
+    <w:p>
+      <w:r>
+        <w:t>Para simplificar a utilizacao diaria no Windows, scripts/install-desktop-shortcut.ps1 cria um atalho LurePilot AI no Desktop com o logo da aplicacao. O duplo clique executa scripts/open-local-app.ps1, inicia a stack local, espera pelo health check e abre o frontend no browser.</w:t>
+      </w:r>
+    </w:p>
+    <w:p>
+      <w:pPr>
+        <w:pStyle w:val="Heading2"/>
+      </w:pPr>
+      <w:r>
+        <w:t>24.9 Acesso por VPN com Tailscale</w:t>
+      </w:r>
+    </w:p>
+    <w:p>
+      <w:r>
+        <w:t>Para a utilizacao pessoal fora da rede local, a VPN recomendada e o Tailscale. O Tailscale deve ser instalado no computador Windows e no iPhone, com a mesma conta, mantendo os dois dispositivos ligados a mesma rede privada. O computador recebe um IP Tailscale normalmente no intervalo 100.x.x.x, que e o endereco usado pelo Safari.</w:t>
+      </w:r>
+    </w:p>
+    <w:p>
+      <w:r>
+        <w:t>Apenas a porta 5173 do frontend precisa de ser acessivel pelo iPhone. O Vite encaminha os pedidos /api e /uploads para o backend local; PostgreSQL, Spring Boot e LM Studio nao precisam de ser expostos diretamente. As portas 8080, 1234 e 5432 nao devem ser abertas para a internet publica.</w:t>
+      </w:r>
+    </w:p>
+    <w:p>
+      <w:r>
+        <w:t>A regra de firewall pode ser criada numa PowerShell executada como Administrador, limitando o acesso ao IP Tailscale do iPhone:</w:t>
+      </w:r>
+    </w:p>
+    <w:p>
+      <w:pPr>
+        <w:pStyle w:val="NoSpacing"/>
+      </w:pPr>
+      <w:r>
+        <w:t>.\scripts\allow-firewall.ps1 -RemoteAddress &lt;IPHONE-TAILSCALE-IP&gt;</w:t>
+      </w:r>
+    </w:p>
+    <w:p>
+      <w:r>
+        <w:t>Rotina diaria recomendada:</w:t>
+      </w:r>
+    </w:p>
+    <w:p>
+      <w:pPr>
+        <w:pStyle w:val="ListNumber"/>
+      </w:pPr>
+      <w:r>
+        <w:t>Abrir o LM Studio, carregar qwen2.5-7b-instruct e iniciar o servidor local.</w:t>
+      </w:r>
+    </w:p>
+    <w:p>
+      <w:pPr>
+        <w:pStyle w:val="ListNumber"/>
+      </w:pPr>
+      <w:r>
+        <w:t>Confirmar que o Tailscale esta ligado no computador e no iPhone.</w:t>
+      </w:r>
+    </w:p>
+    <w:p>
+      <w:pPr>
+        <w:pStyle w:val="ListNumber"/>
+      </w:pPr>
+      <w:r>
+        <w:t>Clicar no atalho LurePilot AI no Desktop. O helper inicia Docker/PostgreSQL, backend e frontend, espera pelo health check e abre o frontend no browser.</w:t>
+      </w:r>
+    </w:p>
+    <w:p>
+      <w:pPr>
+        <w:pStyle w:val="ListNumber"/>
+      </w:pPr>
+      <w:r>
+        <w:t>No Safari do iPhone, abrir http://&lt;COMPUTER-TAILSCALE-IP&gt;:5173, por exemplo http://100.124.231.72:5173.</w:t>
+      </w:r>
+    </w:p>
+    <w:p>
+      <w:pPr>
+        <w:pStyle w:val="ListNumber"/>
+      </w:pPr>
+      <w:r>
+        <w:t>Manter o computador ligado, com internet, Tailscale e LM Studio ativos enquanto a app estiver a ser usada no iPhone.</w:t>
+      </w:r>
+    </w:p>
+    <w:p>
+      <w:r>
+        <w:t>O atalho e o helper nao carregam automaticamente o modelo do LM Studio. Quando o atalho funciona, nao e necessario executar start-local.ps1 manualmente; scripts/stop-local.ps1 continua disponivel para terminar os processos iniciados pelo helper.</w:t>
+      </w:r>
+    </w:p>
+    <w:p>
+      <w:r>
+        <w:t>O acesso HTTP permite validar a navegacao e a importacao de fotografias. Se o Safari exigir um contexto seguro para APIs de camera ou instalacao PWA, deve ser configurado HTTPS com mkcert, incluindo o IP Tailscale do computador, e o certificado local deve ser confiado no iPhone.</w:t>
       </w:r>
     </w:p>
     <w:sectPr>

</xml_diff>